<commit_message>
docs: fix review findings in llm-d XPU whitepaper
- Fix status-marker inconsistency: Chapter 1 cases (01-06) were
  marked verified (checkmark) in index.md/chapter titles but marked
  not-yet-hands-on-validated in tracking.md; downgraded to the
  consistent 'documented, not yet run hands-on' marker everywhere
- Fix Chapter 1 header wording to match the corrected marker meaning
- Fix DRA verification command in Chapter 0: 'kubectl get
  resourceclasses' is not a real object; the repo consistently uses
  'kubectl get deviceclass'
- Clarify guides/rl tracking entry: remove the contradictory
  'Resolved' label next to a still-open 'confirm scope with
  stakeholders' next step
- Regenerate PDF/docx deliverables with all fixes

Found via an independent sub-agent review against the original task
scope and the actual repo contents.

Co-authored-by: Copilot <223556219+Copilot@users.noreply.github.com>
</commit_message>
<xml_diff>
--- a/whitepaper/llm-d-whitepaper.docx
+++ b/whitepaper/llm-d-whitepaper.docx
@@ -624,7 +624,7 @@
         <w:t xml:space="preserve"> </w:t>
       </w:r>
       <w:r>
-        <w:t xml:space="preserve">(deployment configs verified to exist in-repo)</w:t>
+        <w:t xml:space="preserve">(real Intel XPU overlay confirmed in-repo; deployment steps documented but not yet hands-on validated on a live cluster)</w:t>
       </w:r>
     </w:p>
     <w:p>
@@ -647,7 +647,7 @@
         <w:t xml:space="preserve"> </w:t>
       </w:r>
       <w:r>
-        <w:t xml:space="preserve">— 1.1 Optimized Baseline ✅</w:t>
+        <w:t xml:space="preserve">— 1.1 Optimized Baseline 🚧</w:t>
       </w:r>
     </w:p>
     <w:p>
@@ -670,7 +670,7 @@
         <w:t xml:space="preserve"> </w:t>
       </w:r>
       <w:r>
-        <w:t xml:space="preserve">— 1.2 P/D Disaggregation ✅</w:t>
+        <w:t xml:space="preserve">— 1.2 P/D Disaggregation 🚧</w:t>
       </w:r>
     </w:p>
     <w:p>
@@ -693,7 +693,7 @@
         <w:t xml:space="preserve"> </w:t>
       </w:r>
       <w:r>
-        <w:t xml:space="preserve">— 1.3 Precise Prefix Cache Routing ✅</w:t>
+        <w:t xml:space="preserve">— 1.3 Precise Prefix Cache Routing 🚧</w:t>
       </w:r>
     </w:p>
     <w:p>
@@ -716,7 +716,7 @@
         <w:t xml:space="preserve"> </w:t>
       </w:r>
       <w:r>
-        <w:t xml:space="preserve">— 1.4 Tiered Prefix Cache ✅</w:t>
+        <w:t xml:space="preserve">— 1.4 Tiered Prefix Cache 🚧</w:t>
       </w:r>
     </w:p>
     <w:p>
@@ -739,7 +739,7 @@
         <w:t xml:space="preserve"> </w:t>
       </w:r>
       <w:r>
-        <w:t xml:space="preserve">— 1.5 Wide Expert Parallelism ✅</w:t>
+        <w:t xml:space="preserve">— 1.5 Wide Expert Parallelism 🚧</w:t>
       </w:r>
     </w:p>
     <w:p>
@@ -762,7 +762,7 @@
         <w:t xml:space="preserve"> </w:t>
       </w:r>
       <w:r>
-        <w:t xml:space="preserve">— 1.6 Multimodal Serving (Aggregated) ✅</w:t>
+        <w:t xml:space="preserve">— 1.6 Multimodal Serving (Aggregated) 🚧</w:t>
       </w:r>
     </w:p>
     <w:p>
@@ -1727,7 +1727,7 @@
         <w:rPr>
           <w:rStyle w:val="VerbatimChar"/>
         </w:rPr>
-        <w:t xml:space="preserve">kubectl get resourceclasses</w:t>
+        <w:t xml:space="preserve">kubectl get deviceclass</w:t>
       </w:r>
       <w:r>
         <w:t xml:space="preserve"> </w:t>
@@ -2713,7 +2713,7 @@
         <w:pStyle w:val="Heading1"/>
       </w:pPr>
       <w:r>
-        <w:t xml:space="preserve">1.1 Optimized Baseline ✅</w:t>
+        <w:t xml:space="preserve">1.1 Optimized Baseline 🚧</w:t>
       </w:r>
     </w:p>
     <w:bookmarkStart w:id="51" w:name="overview"/>
@@ -5021,7 +5021,7 @@
         <w:pStyle w:val="Heading1"/>
       </w:pPr>
       <w:r>
-        <w:t xml:space="preserve">1.2 P/D Disaggregation ✅</w:t>
+        <w:t xml:space="preserve">1.2 P/D Disaggregation 🚧</w:t>
       </w:r>
     </w:p>
     <w:bookmarkStart w:id="60" w:name="overview-1"/>
@@ -7563,7 +7563,7 @@
         <w:pStyle w:val="Heading1"/>
       </w:pPr>
       <w:r>
-        <w:t xml:space="preserve">1.3 Precise Prefix Cache Routing ✅</w:t>
+        <w:t xml:space="preserve">1.3 Precise Prefix Cache Routing 🚧</w:t>
       </w:r>
     </w:p>
     <w:bookmarkStart w:id="70" w:name="overview-2"/>
@@ -9671,7 +9671,7 @@
         <w:pStyle w:val="Heading1"/>
       </w:pPr>
       <w:r>
-        <w:t xml:space="preserve">1.4 Tiered Prefix Cache ✅</w:t>
+        <w:t xml:space="preserve">1.4 Tiered Prefix Cache 🚧</w:t>
       </w:r>
     </w:p>
     <w:bookmarkStart w:id="79" w:name="overview-3"/>
@@ -11363,7 +11363,7 @@
         <w:pStyle w:val="Heading1"/>
       </w:pPr>
       <w:r>
-        <w:t xml:space="preserve">1.5 Wide Expert Parallelism ✅</w:t>
+        <w:t xml:space="preserve">1.5 Wide Expert Parallelism 🚧</w:t>
       </w:r>
     </w:p>
     <w:bookmarkStart w:id="88" w:name="overview-4"/>
@@ -13445,7 +13445,7 @@
         <w:pStyle w:val="Heading1"/>
       </w:pPr>
       <w:r>
-        <w:t xml:space="preserve">1.6 Multimodal Serving (Aggregated) ✅</w:t>
+        <w:t xml:space="preserve">1.6 Multimodal Serving (Aggregated) 🚧</w:t>
       </w:r>
     </w:p>
     <w:bookmarkStart w:id="98" w:name="overview-5"/>
@@ -37011,2003 +37011,6 @@
       </w:r>
     </w:p>
     <w:bookmarkEnd w:id="204"/>
-    <w:bookmarkStart w:id="208" w:name="X51b233df273d9358a807fde31db2ad6c9a908c0"/>
-    <w:p>
-      <w:pPr>
-        <w:pStyle w:val="Heading1"/>
-      </w:pPr>
-      <w:r>
-        <w:t xml:space="preserve">llm-d Whitepaper — Case Verification Status Tracker</w:t>
-      </w:r>
-    </w:p>
-    <w:p>
-      <w:pPr>
-        <w:pStyle w:val="FirstParagraph"/>
-      </w:pPr>
-      <w:r>
-        <w:t xml:space="preserve">Status legend: ✅ verified working / 🚧 documented from official sources, not yet run hands-on /</w:t>
-      </w:r>
-      <w:r>
-        <w:t xml:space="preserve"> </w:t>
-      </w:r>
-      <w:r>
-        <w:t xml:space="preserve">📝 outline only / ⛔ blocked / ➖ not applicable (no dedicated Intel XPU path exists)</w:t>
-      </w:r>
-    </w:p>
-    <w:bookmarkStart w:id="205" w:name="X321957547fa81b7359b053838dedddee7118ec3"/>
-    <w:p>
-      <w:pPr>
-        <w:pStyle w:val="Heading2"/>
-      </w:pPr>
-      <w:r>
-        <w:t xml:space="preserve">Chapter 1 — Guides with a real Intel XPU Kustomize overlay in-repo</w:t>
-      </w:r>
-    </w:p>
-    <w:tbl>
-      <w:tblPr>
-        <w:tblStyle w:val="Table"/>
-        <w:tblW w:type="pct" w:w="5000"/>
-        <w:tblLook w:firstRow="1" w:lastRow="0" w:firstColumn="0" w:lastColumn="0" w:noHBand="0" w:noVBand="0" w:val="0020"/>
-        <w:jc w:val="start"/>
-        <w:tblLayout w:type="fixed"/>
-      </w:tblPr>
-      <w:tblGrid>
-        <w:gridCol w:w="1320"/>
-        <w:gridCol w:w="1320"/>
-        <w:gridCol w:w="1320"/>
-        <w:gridCol w:w="1320"/>
-        <w:gridCol w:w="1320"/>
-        <w:gridCol w:w="1320"/>
-      </w:tblGrid>
-      <w:tr>
-        <w:trPr>
-          <w:tblHeader w:val="true"/>
-        </w:trPr>
-        <w:tc>
-          <w:tcPr/>
-          <w:p>
-            <w:pPr>
-              <w:pStyle w:val="Compact"/>
-              <w:jc w:val="left"/>
-            </w:pPr>
-            <w:r>
-              <w:t xml:space="preserve">#</w:t>
-            </w:r>
-          </w:p>
-        </w:tc>
-        <w:tc>
-          <w:tcPr/>
-          <w:p>
-            <w:pPr>
-              <w:pStyle w:val="Compact"/>
-              <w:jc w:val="left"/>
-            </w:pPr>
-            <w:r>
-              <w:t xml:space="preserve">Case</w:t>
-            </w:r>
-          </w:p>
-        </w:tc>
-        <w:tc>
-          <w:tcPr/>
-          <w:p>
-            <w:pPr>
-              <w:pStyle w:val="Compact"/>
-              <w:jc w:val="left"/>
-            </w:pPr>
-            <w:r>
-              <w:t xml:space="preserve">Path</w:t>
-            </w:r>
-          </w:p>
-        </w:tc>
-        <w:tc>
-          <w:tcPr/>
-          <w:p>
-            <w:pPr>
-              <w:pStyle w:val="Compact"/>
-              <w:jc w:val="left"/>
-            </w:pPr>
-            <w:r>
-              <w:t xml:space="preserve">Status</w:t>
-            </w:r>
-          </w:p>
-        </w:tc>
-        <w:tc>
-          <w:tcPr/>
-          <w:p>
-            <w:pPr>
-              <w:pStyle w:val="Compact"/>
-              <w:jc w:val="left"/>
-            </w:pPr>
-            <w:r>
-              <w:t xml:space="preserve">Owner</w:t>
-            </w:r>
-          </w:p>
-        </w:tc>
-        <w:tc>
-          <w:tcPr/>
-          <w:p>
-            <w:pPr>
-              <w:pStyle w:val="Compact"/>
-              <w:jc w:val="left"/>
-            </w:pPr>
-            <w:r>
-              <w:t xml:space="preserve">Notes</w:t>
-            </w:r>
-          </w:p>
-        </w:tc>
-      </w:tr>
-      <w:tr>
-        <w:tc>
-          <w:tcPr/>
-          <w:p>
-            <w:pPr>
-              <w:pStyle w:val="Compact"/>
-              <w:jc w:val="left"/>
-            </w:pPr>
-            <w:r>
-              <w:t xml:space="preserve">0</w:t>
-            </w:r>
-          </w:p>
-        </w:tc>
-        <w:tc>
-          <w:tcPr/>
-          <w:p>
-            <w:pPr>
-              <w:pStyle w:val="Compact"/>
-              <w:jc w:val="left"/>
-            </w:pPr>
-            <w:r>
-              <w:t xml:space="preserve">Common installation (k8s + GAIE CRD + Router)</w:t>
-            </w:r>
-          </w:p>
-        </w:tc>
-        <w:tc>
-          <w:tcPr/>
-          <w:p>
-            <w:pPr>
-              <w:pStyle w:val="Compact"/>
-              <w:jc w:val="left"/>
-            </w:pPr>
-            <w:r>
-              <w:rPr>
-                <w:rStyle w:val="VerbatimChar"/>
-              </w:rPr>
-              <w:t xml:space="preserve">guides/env.sh</w:t>
-            </w:r>
-            <w:r>
-              <w:t xml:space="preserve">,</w:t>
-            </w:r>
-            <w:r>
-              <w:t xml:space="preserve"> </w:t>
-            </w:r>
-            <w:r>
-              <w:rPr>
-                <w:rStyle w:val="VerbatimChar"/>
-              </w:rPr>
-              <w:t xml:space="preserve">docs/infrastructure/gateway/</w:t>
-            </w:r>
-          </w:p>
-        </w:tc>
-        <w:tc>
-          <w:tcPr/>
-          <w:p>
-            <w:pPr>
-              <w:pStyle w:val="Compact"/>
-              <w:jc w:val="left"/>
-            </w:pPr>
-            <w:r>
-              <w:t xml:space="preserve">🚧</w:t>
-            </w:r>
-          </w:p>
-        </w:tc>
-        <w:tc>
-          <w:tcPr/>
-          <w:p>
-            <w:pPr>
-              <w:pStyle w:val="Compact"/>
-            </w:pPr>
-          </w:p>
-        </w:tc>
-        <w:tc>
-          <w:tcPr/>
-          <w:p>
-            <w:pPr>
-              <w:pStyle w:val="Compact"/>
-              <w:jc w:val="left"/>
-            </w:pPr>
-            <w:r>
-              <w:t xml:space="preserve">Rewritten against current docs; pending hands-on validation on a real Intel XPU cluster</w:t>
-            </w:r>
-          </w:p>
-        </w:tc>
-      </w:tr>
-      <w:tr>
-        <w:tc>
-          <w:tcPr/>
-          <w:p>
-            <w:pPr>
-              <w:pStyle w:val="Compact"/>
-              <w:jc w:val="left"/>
-            </w:pPr>
-            <w:r>
-              <w:t xml:space="preserve">1</w:t>
-            </w:r>
-          </w:p>
-        </w:tc>
-        <w:tc>
-          <w:tcPr/>
-          <w:p>
-            <w:pPr>
-              <w:pStyle w:val="Compact"/>
-              <w:jc w:val="left"/>
-            </w:pPr>
-            <w:r>
-              <w:t xml:space="preserve">Optimized Baseline</w:t>
-            </w:r>
-          </w:p>
-        </w:tc>
-        <w:tc>
-          <w:tcPr/>
-          <w:p>
-            <w:pPr>
-              <w:pStyle w:val="Compact"/>
-              <w:jc w:val="left"/>
-            </w:pPr>
-            <w:r>
-              <w:rPr>
-                <w:rStyle w:val="VerbatimChar"/>
-              </w:rPr>
-              <w:t xml:space="preserve">guides/optimized-baseline</w:t>
-            </w:r>
-            <w:r>
-              <w:t xml:space="preserve"> </w:t>
-            </w:r>
-            <w:r>
-              <w:t xml:space="preserve">(xpu:</w:t>
-            </w:r>
-            <w:r>
-              <w:t xml:space="preserve"> </w:t>
-            </w:r>
-            <w:r>
-              <w:rPr>
-                <w:rStyle w:val="VerbatimChar"/>
-              </w:rPr>
-              <w:t xml:space="preserve">modelserver/xpu/vllm</w:t>
-            </w:r>
-            <w:r>
-              <w:t xml:space="preserve">)</w:t>
-            </w:r>
-          </w:p>
-        </w:tc>
-        <w:tc>
-          <w:tcPr/>
-          <w:p>
-            <w:pPr>
-              <w:pStyle w:val="Compact"/>
-              <w:jc w:val="left"/>
-            </w:pPr>
-            <w:r>
-              <w:t xml:space="preserve">🚧</w:t>
-            </w:r>
-          </w:p>
-        </w:tc>
-        <w:tc>
-          <w:tcPr/>
-          <w:p>
-            <w:pPr>
-              <w:pStyle w:val="Compact"/>
-            </w:pPr>
-          </w:p>
-        </w:tc>
-        <w:tc>
-          <w:tcPr/>
-          <w:p>
-            <w:pPr>
-              <w:pStyle w:val="Compact"/>
-              <w:jc w:val="left"/>
-            </w:pPr>
-            <w:r>
-              <w:t xml:space="preserve">Has a dedicated Intel XPU E2E CI workflow upstream — highest-confidence case to validate first</w:t>
-            </w:r>
-          </w:p>
-        </w:tc>
-      </w:tr>
-      <w:tr>
-        <w:tc>
-          <w:tcPr/>
-          <w:p>
-            <w:pPr>
-              <w:pStyle w:val="Compact"/>
-              <w:jc w:val="left"/>
-            </w:pPr>
-            <w:r>
-              <w:t xml:space="preserve">2</w:t>
-            </w:r>
-          </w:p>
-        </w:tc>
-        <w:tc>
-          <w:tcPr/>
-          <w:p>
-            <w:pPr>
-              <w:pStyle w:val="Compact"/>
-              <w:jc w:val="left"/>
-            </w:pPr>
-            <w:r>
-              <w:t xml:space="preserve">P/D Disaggregation</w:t>
-            </w:r>
-          </w:p>
-        </w:tc>
-        <w:tc>
-          <w:tcPr/>
-          <w:p>
-            <w:pPr>
-              <w:pStyle w:val="Compact"/>
-              <w:jc w:val="left"/>
-            </w:pPr>
-            <w:r>
-              <w:rPr>
-                <w:rStyle w:val="VerbatimChar"/>
-              </w:rPr>
-              <w:t xml:space="preserve">guides/pd-disaggregation</w:t>
-            </w:r>
-            <w:r>
-              <w:t xml:space="preserve"> </w:t>
-            </w:r>
-            <w:r>
-              <w:t xml:space="preserve">(xpu:</w:t>
-            </w:r>
-            <w:r>
-              <w:t xml:space="preserve"> </w:t>
-            </w:r>
-            <w:r>
-              <w:rPr>
-                <w:rStyle w:val="VerbatimChar"/>
-              </w:rPr>
-              <w:t xml:space="preserve">modelserver/xpu/vllm</w:t>
-            </w:r>
-            <w:r>
-              <w:t xml:space="preserve">)</w:t>
-            </w:r>
-          </w:p>
-        </w:tc>
-        <w:tc>
-          <w:tcPr/>
-          <w:p>
-            <w:pPr>
-              <w:pStyle w:val="Compact"/>
-              <w:jc w:val="left"/>
-            </w:pPr>
-            <w:r>
-              <w:t xml:space="preserve">🚧</w:t>
-            </w:r>
-          </w:p>
-        </w:tc>
-        <w:tc>
-          <w:tcPr/>
-          <w:p>
-            <w:pPr>
-              <w:pStyle w:val="Compact"/>
-            </w:pPr>
-          </w:p>
-        </w:tc>
-        <w:tc>
-          <w:tcPr/>
-          <w:p>
-            <w:pPr>
-              <w:pStyle w:val="Compact"/>
-              <w:jc w:val="left"/>
-            </w:pPr>
-            <w:r>
-              <w:t xml:space="preserve">First deep-dive case, rewritten from current repo, pending hands-on validation</w:t>
-            </w:r>
-          </w:p>
-        </w:tc>
-      </w:tr>
-      <w:tr>
-        <w:tc>
-          <w:tcPr/>
-          <w:p>
-            <w:pPr>
-              <w:pStyle w:val="Compact"/>
-              <w:jc w:val="left"/>
-            </w:pPr>
-            <w:r>
-              <w:t xml:space="preserve">3</w:t>
-            </w:r>
-          </w:p>
-        </w:tc>
-        <w:tc>
-          <w:tcPr/>
-          <w:p>
-            <w:pPr>
-              <w:pStyle w:val="Compact"/>
-              <w:jc w:val="left"/>
-            </w:pPr>
-            <w:r>
-              <w:t xml:space="preserve">Precise Prefix Cache Routing</w:t>
-            </w:r>
-          </w:p>
-        </w:tc>
-        <w:tc>
-          <w:tcPr/>
-          <w:p>
-            <w:pPr>
-              <w:pStyle w:val="Compact"/>
-              <w:jc w:val="left"/>
-            </w:pPr>
-            <w:r>
-              <w:rPr>
-                <w:rStyle w:val="VerbatimChar"/>
-              </w:rPr>
-              <w:t xml:space="preserve">guides/precise-prefix-cache-routing</w:t>
-            </w:r>
-            <w:r>
-              <w:t xml:space="preserve"> </w:t>
-            </w:r>
-            <w:r>
-              <w:t xml:space="preserve">(xpu:</w:t>
-            </w:r>
-            <w:r>
-              <w:t xml:space="preserve"> </w:t>
-            </w:r>
-            <w:r>
-              <w:rPr>
-                <w:rStyle w:val="VerbatimChar"/>
-              </w:rPr>
-              <w:t xml:space="preserve">modelserver/xpu/vllm</w:t>
-            </w:r>
-            <w:r>
-              <w:t xml:space="preserve">)</w:t>
-            </w:r>
-          </w:p>
-        </w:tc>
-        <w:tc>
-          <w:tcPr/>
-          <w:p>
-            <w:pPr>
-              <w:pStyle w:val="Compact"/>
-              <w:jc w:val="left"/>
-            </w:pPr>
-            <w:r>
-              <w:t xml:space="preserve">🚧</w:t>
-            </w:r>
-          </w:p>
-        </w:tc>
-        <w:tc>
-          <w:tcPr/>
-          <w:p>
-            <w:pPr>
-              <w:pStyle w:val="Compact"/>
-            </w:pPr>
-          </w:p>
-        </w:tc>
-        <w:tc>
-          <w:tcPr/>
-          <w:p>
-            <w:pPr>
-              <w:pStyle w:val="Compact"/>
-              <w:jc w:val="left"/>
-            </w:pPr>
-            <w:r>
-              <w:t xml:space="preserve">Rewritten from current repo</w:t>
-            </w:r>
-          </w:p>
-        </w:tc>
-      </w:tr>
-      <w:tr>
-        <w:tc>
-          <w:tcPr/>
-          <w:p>
-            <w:pPr>
-              <w:pStyle w:val="Compact"/>
-              <w:jc w:val="left"/>
-            </w:pPr>
-            <w:r>
-              <w:t xml:space="preserve">4</w:t>
-            </w:r>
-          </w:p>
-        </w:tc>
-        <w:tc>
-          <w:tcPr/>
-          <w:p>
-            <w:pPr>
-              <w:pStyle w:val="Compact"/>
-              <w:jc w:val="left"/>
-            </w:pPr>
-            <w:r>
-              <w:t xml:space="preserve">Tiered Prefix Cache</w:t>
-            </w:r>
-          </w:p>
-        </w:tc>
-        <w:tc>
-          <w:tcPr/>
-          <w:p>
-            <w:pPr>
-              <w:pStyle w:val="Compact"/>
-              <w:jc w:val="left"/>
-            </w:pPr>
-            <w:r>
-              <w:rPr>
-                <w:rStyle w:val="VerbatimChar"/>
-              </w:rPr>
-              <w:t xml:space="preserve">guides/tiered-prefix-cache</w:t>
-            </w:r>
-            <w:r>
-              <w:t xml:space="preserve"> </w:t>
-            </w:r>
-            <w:r>
-              <w:t xml:space="preserve">(xpu:</w:t>
-            </w:r>
-            <w:r>
-              <w:t xml:space="preserve"> </w:t>
-            </w:r>
-            <w:r>
-              <w:rPr>
-                <w:rStyle w:val="VerbatimChar"/>
-              </w:rPr>
-              <w:t xml:space="preserve">modelserver/xpu/vllm/base</w:t>
-            </w:r>
-            <w:r>
-              <w:t xml:space="preserve">,</w:t>
-            </w:r>
-            <w:r>
-              <w:t xml:space="preserve"> </w:t>
-            </w:r>
-            <w:r>
-              <w:rPr>
-                <w:rStyle w:val="VerbatimChar"/>
-              </w:rPr>
-              <w:t xml:space="preserve">.../lmcache-connector/cpu/base</w:t>
-            </w:r>
-            <w:r>
-              <w:t xml:space="preserve">)</w:t>
-            </w:r>
-          </w:p>
-        </w:tc>
-        <w:tc>
-          <w:tcPr/>
-          <w:p>
-            <w:pPr>
-              <w:pStyle w:val="Compact"/>
-              <w:jc w:val="left"/>
-            </w:pPr>
-            <w:r>
-              <w:t xml:space="preserve">🚧</w:t>
-            </w:r>
-          </w:p>
-        </w:tc>
-        <w:tc>
-          <w:tcPr/>
-          <w:p>
-            <w:pPr>
-              <w:pStyle w:val="Compact"/>
-            </w:pPr>
-          </w:p>
-        </w:tc>
-        <w:tc>
-          <w:tcPr/>
-          <w:p>
-            <w:pPr>
-              <w:pStyle w:val="Compact"/>
-              <w:jc w:val="left"/>
-            </w:pPr>
-            <w:r>
-              <w:t xml:space="preserve">Requires</w:t>
-            </w:r>
-            <w:r>
-              <w:t xml:space="preserve"> </w:t>
-            </w:r>
-            <w:r>
-              <w:rPr>
-                <w:rStyle w:val="VerbatimChar"/>
-              </w:rPr>
-              <w:t xml:space="preserve">privileged: true</w:t>
-            </w:r>
-            <w:r>
-              <w:t xml:space="preserve"> </w:t>
-            </w:r>
-            <w:r>
-              <w:t xml:space="preserve">— check cluster PSA policy before validating</w:t>
-            </w:r>
-          </w:p>
-        </w:tc>
-      </w:tr>
-      <w:tr>
-        <w:tc>
-          <w:tcPr/>
-          <w:p>
-            <w:pPr>
-              <w:pStyle w:val="Compact"/>
-              <w:jc w:val="left"/>
-            </w:pPr>
-            <w:r>
-              <w:t xml:space="preserve">5</w:t>
-            </w:r>
-          </w:p>
-        </w:tc>
-        <w:tc>
-          <w:tcPr/>
-          <w:p>
-            <w:pPr>
-              <w:pStyle w:val="Compact"/>
-              <w:jc w:val="left"/>
-            </w:pPr>
-            <w:r>
-              <w:t xml:space="preserve">Wide Expert Parallelism</w:t>
-            </w:r>
-          </w:p>
-        </w:tc>
-        <w:tc>
-          <w:tcPr/>
-          <w:p>
-            <w:pPr>
-              <w:pStyle w:val="Compact"/>
-              <w:jc w:val="left"/>
-            </w:pPr>
-            <w:r>
-              <w:rPr>
-                <w:rStyle w:val="VerbatimChar"/>
-              </w:rPr>
-              <w:t xml:space="preserve">guides/wide-ep-lws</w:t>
-            </w:r>
-            <w:r>
-              <w:t xml:space="preserve"> </w:t>
-            </w:r>
-            <w:r>
-              <w:t xml:space="preserve">(xpu:</w:t>
-            </w:r>
-            <w:r>
-              <w:t xml:space="preserve"> </w:t>
-            </w:r>
-            <w:r>
-              <w:rPr>
-                <w:rStyle w:val="VerbatimChar"/>
-              </w:rPr>
-              <w:t xml:space="preserve">modelserver/xpu/vllm</w:t>
-            </w:r>
-            <w:r>
-              <w:t xml:space="preserve">)</w:t>
-            </w:r>
-          </w:p>
-        </w:tc>
-        <w:tc>
-          <w:tcPr/>
-          <w:p>
-            <w:pPr>
-              <w:pStyle w:val="Compact"/>
-              <w:jc w:val="left"/>
-            </w:pPr>
-            <w:r>
-              <w:t xml:space="preserve">🚧</w:t>
-            </w:r>
-          </w:p>
-        </w:tc>
-        <w:tc>
-          <w:tcPr/>
-          <w:p>
-            <w:pPr>
-              <w:pStyle w:val="Compact"/>
-            </w:pPr>
-          </w:p>
-        </w:tc>
-        <w:tc>
-          <w:tcPr/>
-          <w:p>
-            <w:pPr>
-              <w:pStyle w:val="Compact"/>
-              <w:jc w:val="left"/>
-            </w:pPr>
-            <w:r>
-              <w:t xml:space="preserve">Validated Intel XPU shape documented upstream (DeepSeek-V2-Lite-Chat, 4 XPUs)</w:t>
-            </w:r>
-          </w:p>
-        </w:tc>
-      </w:tr>
-      <w:tr>
-        <w:tc>
-          <w:tcPr/>
-          <w:p>
-            <w:pPr>
-              <w:pStyle w:val="Compact"/>
-              <w:jc w:val="left"/>
-            </w:pPr>
-            <w:r>
-              <w:t xml:space="preserve">6</w:t>
-            </w:r>
-          </w:p>
-        </w:tc>
-        <w:tc>
-          <w:tcPr/>
-          <w:p>
-            <w:pPr>
-              <w:pStyle w:val="Compact"/>
-              <w:jc w:val="left"/>
-            </w:pPr>
-            <w:r>
-              <w:t xml:space="preserve">Multimodal Serving (Aggregated)</w:t>
-            </w:r>
-          </w:p>
-        </w:tc>
-        <w:tc>
-          <w:tcPr/>
-          <w:p>
-            <w:pPr>
-              <w:pStyle w:val="Compact"/>
-              <w:jc w:val="left"/>
-            </w:pPr>
-            <w:r>
-              <w:rPr>
-                <w:rStyle w:val="VerbatimChar"/>
-              </w:rPr>
-              <w:t xml:space="preserve">guides/multimodal-serving/aggregation</w:t>
-            </w:r>
-            <w:r>
-              <w:t xml:space="preserve"> </w:t>
-            </w:r>
-            <w:r>
-              <w:t xml:space="preserve">(xpu:</w:t>
-            </w:r>
-            <w:r>
-              <w:t xml:space="preserve"> </w:t>
-            </w:r>
-            <w:r>
-              <w:rPr>
-                <w:rStyle w:val="VerbatimChar"/>
-              </w:rPr>
-              <w:t xml:space="preserve">modelserver/xpu/vllm</w:t>
-            </w:r>
-            <w:r>
-              <w:t xml:space="preserve">)</w:t>
-            </w:r>
-          </w:p>
-        </w:tc>
-        <w:tc>
-          <w:tcPr/>
-          <w:p>
-            <w:pPr>
-              <w:pStyle w:val="Compact"/>
-              <w:jc w:val="left"/>
-            </w:pPr>
-            <w:r>
-              <w:t xml:space="preserve">🚧</w:t>
-            </w:r>
-          </w:p>
-        </w:tc>
-        <w:tc>
-          <w:tcPr/>
-          <w:p>
-            <w:pPr>
-              <w:pStyle w:val="Compact"/>
-            </w:pPr>
-          </w:p>
-        </w:tc>
-        <w:tc>
-          <w:tcPr/>
-          <w:p>
-            <w:pPr>
-              <w:pStyle w:val="Compact"/>
-              <w:jc w:val="left"/>
-            </w:pPr>
-            <w:r>
-              <w:t xml:space="preserve">Targets Intel Arc Pro B60</w:t>
-            </w:r>
-          </w:p>
-        </w:tc>
-      </w:tr>
-    </w:tbl>
-    <w:bookmarkEnd w:id="205"/>
-    <w:bookmarkStart w:id="206" w:name="X7f1a6d3c20f31d4afd0970f1b498fc593a79b9f"/>
-    <w:p>
-      <w:pPr>
-        <w:pStyle w:val="Heading2"/>
-      </w:pPr>
-      <w:r>
-        <w:t xml:space="preserve">Chapter 2-5 — Router-layer / composite features (accelerator-agnostic, no dedicated XPU overlay)</w:t>
-      </w:r>
-    </w:p>
-    <w:tbl>
-      <w:tblPr>
-        <w:tblStyle w:val="Table"/>
-        <w:tblW w:type="pct" w:w="5000"/>
-        <w:tblLook w:firstRow="1" w:lastRow="0" w:firstColumn="0" w:lastColumn="0" w:noHBand="0" w:noVBand="0" w:val="0020"/>
-        <w:jc w:val="start"/>
-        <w:tblLayout w:type="fixed"/>
-      </w:tblPr>
-      <w:tblGrid>
-        <w:gridCol w:w="1320"/>
-        <w:gridCol w:w="1320"/>
-        <w:gridCol w:w="1320"/>
-        <w:gridCol w:w="1320"/>
-        <w:gridCol w:w="1320"/>
-        <w:gridCol w:w="1320"/>
-      </w:tblGrid>
-      <w:tr>
-        <w:trPr>
-          <w:tblHeader w:val="true"/>
-        </w:trPr>
-        <w:tc>
-          <w:tcPr/>
-          <w:p>
-            <w:pPr>
-              <w:pStyle w:val="Compact"/>
-              <w:jc w:val="left"/>
-            </w:pPr>
-            <w:r>
-              <w:t xml:space="preserve">#</w:t>
-            </w:r>
-          </w:p>
-        </w:tc>
-        <w:tc>
-          <w:tcPr/>
-          <w:p>
-            <w:pPr>
-              <w:pStyle w:val="Compact"/>
-              <w:jc w:val="left"/>
-            </w:pPr>
-            <w:r>
-              <w:t xml:space="preserve">Case</w:t>
-            </w:r>
-          </w:p>
-        </w:tc>
-        <w:tc>
-          <w:tcPr/>
-          <w:p>
-            <w:pPr>
-              <w:pStyle w:val="Compact"/>
-              <w:jc w:val="left"/>
-            </w:pPr>
-            <w:r>
-              <w:t xml:space="preserve">Path</w:t>
-            </w:r>
-          </w:p>
-        </w:tc>
-        <w:tc>
-          <w:tcPr/>
-          <w:p>
-            <w:pPr>
-              <w:pStyle w:val="Compact"/>
-              <w:jc w:val="left"/>
-            </w:pPr>
-            <w:r>
-              <w:t xml:space="preserve">Status</w:t>
-            </w:r>
-          </w:p>
-        </w:tc>
-        <w:tc>
-          <w:tcPr/>
-          <w:p>
-            <w:pPr>
-              <w:pStyle w:val="Compact"/>
-              <w:jc w:val="left"/>
-            </w:pPr>
-            <w:r>
-              <w:t xml:space="preserve">Owner</w:t>
-            </w:r>
-          </w:p>
-        </w:tc>
-        <w:tc>
-          <w:tcPr/>
-          <w:p>
-            <w:pPr>
-              <w:pStyle w:val="Compact"/>
-              <w:jc w:val="left"/>
-            </w:pPr>
-            <w:r>
-              <w:t xml:space="preserve">Notes</w:t>
-            </w:r>
-          </w:p>
-        </w:tc>
-      </w:tr>
-      <w:tr>
-        <w:tc>
-          <w:tcPr/>
-          <w:p>
-            <w:pPr>
-              <w:pStyle w:val="Compact"/>
-              <w:jc w:val="left"/>
-            </w:pPr>
-            <w:r>
-              <w:t xml:space="preserve">7</w:t>
-            </w:r>
-          </w:p>
-        </w:tc>
-        <w:tc>
-          <w:tcPr/>
-          <w:p>
-            <w:pPr>
-              <w:pStyle w:val="Compact"/>
-              <w:jc w:val="left"/>
-            </w:pPr>
-            <w:r>
-              <w:t xml:space="preserve">Flow Control</w:t>
-            </w:r>
-          </w:p>
-        </w:tc>
-        <w:tc>
-          <w:tcPr/>
-          <w:p>
-            <w:pPr>
-              <w:pStyle w:val="Compact"/>
-              <w:jc w:val="left"/>
-            </w:pPr>
-            <w:r>
-              <w:rPr>
-                <w:rStyle w:val="VerbatimChar"/>
-              </w:rPr>
-              <w:t xml:space="preserve">guides/flow-control</w:t>
-            </w:r>
-          </w:p>
-        </w:tc>
-        <w:tc>
-          <w:tcPr/>
-          <w:p>
-            <w:pPr>
-              <w:pStyle w:val="Compact"/>
-              <w:jc w:val="left"/>
-            </w:pPr>
-            <w:r>
-              <w:t xml:space="preserve">🚧</w:t>
-            </w:r>
-          </w:p>
-        </w:tc>
-        <w:tc>
-          <w:tcPr/>
-          <w:p>
-            <w:pPr>
-              <w:pStyle w:val="Compact"/>
-            </w:pPr>
-          </w:p>
-        </w:tc>
-        <w:tc>
-          <w:tcPr/>
-          <w:p>
-            <w:pPr>
-              <w:pStyle w:val="Compact"/>
-              <w:jc w:val="left"/>
-            </w:pPr>
-            <w:r>
-              <w:t xml:space="preserve">Fully written; reuses Optimized Baseline Intel XPU overlay via</w:t>
-            </w:r>
-            <w:r>
-              <w:t xml:space="preserve"> </w:t>
-            </w:r>
-            <w:r>
-              <w:rPr>
-                <w:rStyle w:val="VerbatimChar"/>
-              </w:rPr>
-              <w:t xml:space="preserve">sed</w:t>
-            </w:r>
-            <w:r>
-              <w:t xml:space="preserve"> </w:t>
-            </w:r>
-            <w:r>
-              <w:t xml:space="preserve">relabeling</w:t>
-            </w:r>
-          </w:p>
-        </w:tc>
-      </w:tr>
-      <w:tr>
-        <w:tc>
-          <w:tcPr/>
-          <w:p>
-            <w:pPr>
-              <w:pStyle w:val="Compact"/>
-              <w:jc w:val="left"/>
-            </w:pPr>
-            <w:r>
-              <w:t xml:space="preserve">8</w:t>
-            </w:r>
-          </w:p>
-        </w:tc>
-        <w:tc>
-          <w:tcPr/>
-          <w:p>
-            <w:pPr>
-              <w:pStyle w:val="Compact"/>
-              <w:jc w:val="left"/>
-            </w:pPr>
-            <w:r>
-              <w:t xml:space="preserve">Predicted Latency-Based Routing</w:t>
-            </w:r>
-          </w:p>
-        </w:tc>
-        <w:tc>
-          <w:tcPr/>
-          <w:p>
-            <w:pPr>
-              <w:pStyle w:val="Compact"/>
-              <w:jc w:val="left"/>
-            </w:pPr>
-            <w:r>
-              <w:rPr>
-                <w:rStyle w:val="VerbatimChar"/>
-              </w:rPr>
-              <w:t xml:space="preserve">guides/predicted-latency-routing</w:t>
-            </w:r>
-          </w:p>
-        </w:tc>
-        <w:tc>
-          <w:tcPr/>
-          <w:p>
-            <w:pPr>
-              <w:pStyle w:val="Compact"/>
-              <w:jc w:val="left"/>
-            </w:pPr>
-            <w:r>
-              <w:t xml:space="preserve">🚧</w:t>
-            </w:r>
-          </w:p>
-        </w:tc>
-        <w:tc>
-          <w:tcPr/>
-          <w:p>
-            <w:pPr>
-              <w:pStyle w:val="Compact"/>
-            </w:pPr>
-          </w:p>
-        </w:tc>
-        <w:tc>
-          <w:tcPr/>
-          <w:p>
-            <w:pPr>
-              <w:pStyle w:val="Compact"/>
-              <w:jc w:val="left"/>
-            </w:pPr>
-            <w:r>
-              <w:t xml:space="preserve">Fully written; reuses Optimized Baseline overlay directly, no relabeling needed</w:t>
-            </w:r>
-          </w:p>
-        </w:tc>
-      </w:tr>
-      <w:tr>
-        <w:tc>
-          <w:tcPr/>
-          <w:p>
-            <w:pPr>
-              <w:pStyle w:val="Compact"/>
-              <w:jc w:val="left"/>
-            </w:pPr>
-            <w:r>
-              <w:t xml:space="preserve">9</w:t>
-            </w:r>
-          </w:p>
-        </w:tc>
-        <w:tc>
-          <w:tcPr/>
-          <w:p>
-            <w:pPr>
-              <w:pStyle w:val="Compact"/>
-              <w:jc w:val="left"/>
-            </w:pPr>
-            <w:r>
-              <w:t xml:space="preserve">Workload Autoscaling (4 sub-modes)</w:t>
-            </w:r>
-          </w:p>
-        </w:tc>
-        <w:tc>
-          <w:tcPr/>
-          <w:p>
-            <w:pPr>
-              <w:pStyle w:val="Compact"/>
-              <w:jc w:val="left"/>
-            </w:pPr>
-            <w:r>
-              <w:rPr>
-                <w:rStyle w:val="VerbatimChar"/>
-              </w:rPr>
-              <w:t xml:space="preserve">guides/workload-autoscaling</w:t>
-            </w:r>
-          </w:p>
-        </w:tc>
-        <w:tc>
-          <w:tcPr/>
-          <w:p>
-            <w:pPr>
-              <w:pStyle w:val="Compact"/>
-              <w:jc w:val="left"/>
-            </w:pPr>
-            <w:r>
-              <w:t xml:space="preserve">🚧</w:t>
-            </w:r>
-          </w:p>
-        </w:tc>
-        <w:tc>
-          <w:tcPr/>
-          <w:p>
-            <w:pPr>
-              <w:pStyle w:val="Compact"/>
-            </w:pPr>
-          </w:p>
-        </w:tc>
-        <w:tc>
-          <w:tcPr/>
-          <w:p>
-            <w:pPr>
-              <w:pStyle w:val="Compact"/>
-              <w:jc w:val="left"/>
-            </w:pPr>
-            <w:r>
-              <w:t xml:space="preserve">Fully written;</w:t>
-            </w:r>
-            <w:r>
-              <w:t xml:space="preserve"> </w:t>
-            </w:r>
-            <w:r>
-              <w:rPr>
-                <w:rStyle w:val="VerbatimChar"/>
-              </w:rPr>
-              <w:t xml:space="preserve">README.md</w:t>
-            </w:r>
-            <w:r>
-              <w:t xml:space="preserve"> </w:t>
-            </w:r>
-            <w:r>
-              <w:t xml:space="preserve">/</w:t>
-            </w:r>
-            <w:r>
-              <w:t xml:space="preserve"> </w:t>
-            </w:r>
-            <w:r>
-              <w:rPr>
-                <w:rStyle w:val="VerbatimChar"/>
-              </w:rPr>
-              <w:t xml:space="preserve">README.hpa-epp.md</w:t>
-            </w:r>
-            <w:r>
-              <w:t xml:space="preserve"> </w:t>
-            </w:r>
-            <w:r>
-              <w:t xml:space="preserve">KEDA+EPP path detailed with real commands, WVA path referenced</w:t>
-            </w:r>
-          </w:p>
-        </w:tc>
-      </w:tr>
-      <w:tr>
-        <w:tc>
-          <w:tcPr/>
-          <w:p>
-            <w:pPr>
-              <w:pStyle w:val="Compact"/>
-              <w:jc w:val="left"/>
-            </w:pPr>
-            <w:r>
-              <w:t xml:space="preserve">10</w:t>
-            </w:r>
-          </w:p>
-        </w:tc>
-        <w:tc>
-          <w:tcPr/>
-          <w:p>
-            <w:pPr>
-              <w:pStyle w:val="Compact"/>
-              <w:jc w:val="left"/>
-            </w:pPr>
-            <w:r>
-              <w:t xml:space="preserve">Rollouts</w:t>
-            </w:r>
-          </w:p>
-        </w:tc>
-        <w:tc>
-          <w:tcPr/>
-          <w:p>
-            <w:pPr>
-              <w:pStyle w:val="Compact"/>
-              <w:jc w:val="left"/>
-            </w:pPr>
-            <w:r>
-              <w:rPr>
-                <w:rStyle w:val="VerbatimChar"/>
-              </w:rPr>
-              <w:t xml:space="preserve">docs/operations/rollouts</w:t>
-            </w:r>
-            <w:r>
-              <w:t xml:space="preserve"> </w:t>
-            </w:r>
-            <w:r>
-              <w:t xml:space="preserve">(moved from</w:t>
-            </w:r>
-            <w:r>
-              <w:t xml:space="preserve"> </w:t>
-            </w:r>
-            <w:r>
-              <w:rPr>
-                <w:rStyle w:val="VerbatimChar"/>
-              </w:rPr>
-              <w:t xml:space="preserve">guides/rollouts</w:t>
-            </w:r>
-            <w:r>
-              <w:t xml:space="preserve">)</w:t>
-            </w:r>
-          </w:p>
-        </w:tc>
-        <w:tc>
-          <w:tcPr/>
-          <w:p>
-            <w:pPr>
-              <w:pStyle w:val="Compact"/>
-              <w:jc w:val="left"/>
-            </w:pPr>
-            <w:r>
-              <w:t xml:space="preserve">🚧</w:t>
-            </w:r>
-          </w:p>
-        </w:tc>
-        <w:tc>
-          <w:tcPr/>
-          <w:p>
-            <w:pPr>
-              <w:pStyle w:val="Compact"/>
-            </w:pPr>
-          </w:p>
-        </w:tc>
-        <w:tc>
-          <w:tcPr/>
-          <w:p>
-            <w:pPr>
-              <w:pStyle w:val="Compact"/>
-              <w:jc w:val="left"/>
-            </w:pPr>
-            <w:r>
-              <w:t xml:space="preserve">Fully written; includes Blue-Green Update example reframed as Intel XPU node/accelerator migration; flags the stale-path repo reorg as a real-world example of the BKM-drift problem</w:t>
-            </w:r>
-          </w:p>
-        </w:tc>
-      </w:tr>
-      <w:tr>
-        <w:tc>
-          <w:tcPr/>
-          <w:p>
-            <w:pPr>
-              <w:pStyle w:val="Compact"/>
-              <w:jc w:val="left"/>
-            </w:pPr>
-            <w:r>
-              <w:t xml:space="preserve">11</w:t>
-            </w:r>
-          </w:p>
-        </w:tc>
-        <w:tc>
-          <w:tcPr/>
-          <w:p>
-            <w:pPr>
-              <w:pStyle w:val="Compact"/>
-              <w:jc w:val="left"/>
-            </w:pPr>
-            <w:r>
-              <w:t xml:space="preserve">Agentic Serving</w:t>
-            </w:r>
-          </w:p>
-        </w:tc>
-        <w:tc>
-          <w:tcPr/>
-          <w:p>
-            <w:pPr>
-              <w:pStyle w:val="Compact"/>
-              <w:jc w:val="left"/>
-            </w:pPr>
-            <w:r>
-              <w:rPr>
-                <w:rStyle w:val="VerbatimChar"/>
-              </w:rPr>
-              <w:t xml:space="preserve">guides/agentic-serving</w:t>
-            </w:r>
-          </w:p>
-        </w:tc>
-        <w:tc>
-          <w:tcPr/>
-          <w:p>
-            <w:pPr>
-              <w:pStyle w:val="Compact"/>
-              <w:jc w:val="left"/>
-            </w:pPr>
-            <w:r>
-              <w:t xml:space="preserve">🚧</w:t>
-            </w:r>
-          </w:p>
-        </w:tc>
-        <w:tc>
-          <w:tcPr/>
-          <w:p>
-            <w:pPr>
-              <w:pStyle w:val="Compact"/>
-            </w:pPr>
-          </w:p>
-        </w:tc>
-        <w:tc>
-          <w:tcPr/>
-          <w:p>
-            <w:pPr>
-              <w:pStyle w:val="Compact"/>
-              <w:jc w:val="left"/>
-            </w:pPr>
-            <w:r>
-              <w:t xml:space="preserve">Fully written; no ready-made upstream Intel XPU deployment (H200/TPU only) — chapter shows manual composition of Chapter 1 building blocks, explicitly caveated as not CI-validated as a combined stack</w:t>
-            </w:r>
-          </w:p>
-        </w:tc>
-      </w:tr>
-      <w:tr>
-        <w:tc>
-          <w:tcPr/>
-          <w:p>
-            <w:pPr>
-              <w:pStyle w:val="Compact"/>
-              <w:jc w:val="left"/>
-            </w:pPr>
-            <w:r>
-              <w:t xml:space="preserve">12</w:t>
-            </w:r>
-          </w:p>
-        </w:tc>
-        <w:tc>
-          <w:tcPr/>
-          <w:p>
-            <w:pPr>
-              <w:pStyle w:val="Compact"/>
-              <w:jc w:val="left"/>
-            </w:pPr>
-            <w:r>
-              <w:t xml:space="preserve">Multi-Model Routing</w:t>
-            </w:r>
-          </w:p>
-        </w:tc>
-        <w:tc>
-          <w:tcPr/>
-          <w:p>
-            <w:pPr>
-              <w:pStyle w:val="Compact"/>
-              <w:jc w:val="left"/>
-            </w:pPr>
-            <w:r>
-              <w:rPr>
-                <w:rStyle w:val="VerbatimChar"/>
-              </w:rPr>
-              <w:t xml:space="preserve">guides/multi-model-routing</w:t>
-            </w:r>
-          </w:p>
-        </w:tc>
-        <w:tc>
-          <w:tcPr/>
-          <w:p>
-            <w:pPr>
-              <w:pStyle w:val="Compact"/>
-              <w:jc w:val="left"/>
-            </w:pPr>
-            <w:r>
-              <w:t xml:space="preserve">🚧</w:t>
-            </w:r>
-          </w:p>
-        </w:tc>
-        <w:tc>
-          <w:tcPr/>
-          <w:p>
-            <w:pPr>
-              <w:pStyle w:val="Compact"/>
-            </w:pPr>
-          </w:p>
-        </w:tc>
-        <w:tc>
-          <w:tcPr/>
-          <w:p>
-            <w:pPr>
-              <w:pStyle w:val="Compact"/>
-              <w:jc w:val="left"/>
-            </w:pPr>
-            <w:r>
-              <w:t xml:space="preserve">Fully written; IPP + HTTPRoute header-based routing, includes LoRA adapter routing</w:t>
-            </w:r>
-          </w:p>
-        </w:tc>
-      </w:tr>
-      <w:tr>
-        <w:tc>
-          <w:tcPr/>
-          <w:p>
-            <w:pPr>
-              <w:pStyle w:val="Compact"/>
-              <w:jc w:val="left"/>
-            </w:pPr>
-            <w:r>
-              <w:t xml:space="preserve">13</w:t>
-            </w:r>
-          </w:p>
-        </w:tc>
-        <w:tc>
-          <w:tcPr/>
-          <w:p>
-            <w:pPr>
-              <w:pStyle w:val="Compact"/>
-              <w:jc w:val="left"/>
-            </w:pPr>
-            <w:r>
-              <w:t xml:space="preserve">Asynchronous Processing</w:t>
-            </w:r>
-          </w:p>
-        </w:tc>
-        <w:tc>
-          <w:tcPr/>
-          <w:p>
-            <w:pPr>
-              <w:pStyle w:val="Compact"/>
-              <w:jc w:val="left"/>
-            </w:pPr>
-            <w:r>
-              <w:rPr>
-                <w:rStyle w:val="VerbatimChar"/>
-              </w:rPr>
-              <w:t xml:space="preserve">guides/asynchronous-processing</w:t>
-            </w:r>
-          </w:p>
-        </w:tc>
-        <w:tc>
-          <w:tcPr/>
-          <w:p>
-            <w:pPr>
-              <w:pStyle w:val="Compact"/>
-              <w:jc w:val="left"/>
-            </w:pPr>
-            <w:r>
-              <w:t xml:space="preserve">🚧</w:t>
-            </w:r>
-          </w:p>
-        </w:tc>
-        <w:tc>
-          <w:tcPr/>
-          <w:p>
-            <w:pPr>
-              <w:pStyle w:val="Compact"/>
-            </w:pPr>
-          </w:p>
-        </w:tc>
-        <w:tc>
-          <w:tcPr/>
-          <w:p>
-            <w:pPr>
-              <w:pStyle w:val="Compact"/>
-              <w:jc w:val="left"/>
-            </w:pPr>
-            <w:r>
-              <w:t xml:space="preserve">Fully written; Async Processor via GCP Pub/Sub or Redis, dispatches to any Optimized Baseline endpoint</w:t>
-            </w:r>
-          </w:p>
-        </w:tc>
-      </w:tr>
-      <w:tr>
-        <w:tc>
-          <w:tcPr/>
-          <w:p>
-            <w:pPr>
-              <w:pStyle w:val="Compact"/>
-              <w:jc w:val="left"/>
-            </w:pPr>
-            <w:r>
-              <w:t xml:space="preserve">14</w:t>
-            </w:r>
-          </w:p>
-        </w:tc>
-        <w:tc>
-          <w:tcPr/>
-          <w:p>
-            <w:pPr>
-              <w:pStyle w:val="Compact"/>
-              <w:jc w:val="left"/>
-            </w:pPr>
-            <w:r>
-              <w:t xml:space="preserve">Batch Gateway</w:t>
-            </w:r>
-          </w:p>
-        </w:tc>
-        <w:tc>
-          <w:tcPr/>
-          <w:p>
-            <w:pPr>
-              <w:pStyle w:val="Compact"/>
-              <w:jc w:val="left"/>
-            </w:pPr>
-            <w:r>
-              <w:rPr>
-                <w:rStyle w:val="VerbatimChar"/>
-              </w:rPr>
-              <w:t xml:space="preserve">guides/batch-gateway</w:t>
-            </w:r>
-          </w:p>
-        </w:tc>
-        <w:tc>
-          <w:tcPr/>
-          <w:p>
-            <w:pPr>
-              <w:pStyle w:val="Compact"/>
-              <w:jc w:val="left"/>
-            </w:pPr>
-            <w:r>
-              <w:t xml:space="preserve">🚧</w:t>
-            </w:r>
-          </w:p>
-        </w:tc>
-        <w:tc>
-          <w:tcPr/>
-          <w:p>
-            <w:pPr>
-              <w:pStyle w:val="Compact"/>
-            </w:pPr>
-          </w:p>
-        </w:tc>
-        <w:tc>
-          <w:tcPr/>
-          <w:p>
-            <w:pPr>
-              <w:pStyle w:val="Compact"/>
-              <w:jc w:val="left"/>
-            </w:pPr>
-            <w:r>
-              <w:t xml:space="preserve">Fully written; OpenAI-compatible Batch API, full JSONL upload/submit/monitor/download example</w:t>
-            </w:r>
-          </w:p>
-        </w:tc>
-      </w:tr>
-      <w:tr>
-        <w:tc>
-          <w:tcPr/>
-          <w:p>
-            <w:pPr>
-              <w:pStyle w:val="Compact"/>
-              <w:jc w:val="left"/>
-            </w:pPr>
-            <w:r>
-              <w:t xml:space="preserve">15</w:t>
-            </w:r>
-          </w:p>
-        </w:tc>
-        <w:tc>
-          <w:tcPr/>
-          <w:p>
-            <w:pPr>
-              <w:pStyle w:val="Compact"/>
-              <w:jc w:val="left"/>
-            </w:pPr>
-            <w:r>
-              <w:t xml:space="preserve">No-Kubernetes Deployment</w:t>
-            </w:r>
-          </w:p>
-        </w:tc>
-        <w:tc>
-          <w:tcPr/>
-          <w:p>
-            <w:pPr>
-              <w:pStyle w:val="Compact"/>
-              <w:jc w:val="left"/>
-            </w:pPr>
-            <w:r>
-              <w:rPr>
-                <w:rStyle w:val="VerbatimChar"/>
-              </w:rPr>
-              <w:t xml:space="preserve">guides/no-kubernetes-deployment</w:t>
-            </w:r>
-          </w:p>
-        </w:tc>
-        <w:tc>
-          <w:tcPr/>
-          <w:p>
-            <w:pPr>
-              <w:pStyle w:val="Compact"/>
-              <w:jc w:val="left"/>
-            </w:pPr>
-            <w:r>
-              <w:t xml:space="preserve">🚧</w:t>
-            </w:r>
-          </w:p>
-        </w:tc>
-        <w:tc>
-          <w:tcPr/>
-          <w:p>
-            <w:pPr>
-              <w:pStyle w:val="Compact"/>
-            </w:pPr>
-          </w:p>
-        </w:tc>
-        <w:tc>
-          <w:tcPr/>
-          <w:p>
-            <w:pPr>
-              <w:pStyle w:val="Compact"/>
-              <w:jc w:val="left"/>
-            </w:pPr>
-            <w:r>
-              <w:t xml:space="preserve">Fully written; explicitly NVIDIA + vLLM specific upstream, chapter documents the exact Intel XPU substitution (image,</w:t>
-            </w:r>
-            <w:r>
-              <w:t xml:space="preserve"> </w:t>
-            </w:r>
-            <w:r>
-              <w:rPr>
-                <w:rStyle w:val="VerbatimChar"/>
-              </w:rPr>
-              <w:t xml:space="preserve">--device=/dev/dri</w:t>
-            </w:r>
-            <w:r>
-              <w:t xml:space="preserve">, XCCL) rather than presenting it as a maintained path</w:t>
-            </w:r>
-          </w:p>
-        </w:tc>
-      </w:tr>
-      <w:tr>
-        <w:tc>
-          <w:tcPr/>
-          <w:p>
-            <w:pPr>
-              <w:pStyle w:val="Compact"/>
-              <w:jc w:val="left"/>
-            </w:pPr>
-            <w:r>
-              <w:t xml:space="preserve">16</w:t>
-            </w:r>
-          </w:p>
-        </w:tc>
-        <w:tc>
-          <w:tcPr/>
-          <w:p>
-            <w:pPr>
-              <w:pStyle w:val="Compact"/>
-              <w:jc w:val="left"/>
-            </w:pPr>
-            <w:r>
-              <w:t xml:space="preserve">Encode Disaggregation (Multimodal)</w:t>
-            </w:r>
-          </w:p>
-        </w:tc>
-        <w:tc>
-          <w:tcPr/>
-          <w:p>
-            <w:pPr>
-              <w:pStyle w:val="Compact"/>
-              <w:jc w:val="left"/>
-            </w:pPr>
-            <w:r>
-              <w:rPr>
-                <w:rStyle w:val="VerbatimChar"/>
-              </w:rPr>
-              <w:t xml:space="preserve">guides/multimodal-serving/e-disaggregation</w:t>
-            </w:r>
-          </w:p>
-        </w:tc>
-        <w:tc>
-          <w:tcPr/>
-          <w:p>
-            <w:pPr>
-              <w:pStyle w:val="Compact"/>
-              <w:jc w:val="left"/>
-            </w:pPr>
-            <w:r>
-              <w:t xml:space="preserve">➖</w:t>
-            </w:r>
-          </w:p>
-        </w:tc>
-        <w:tc>
-          <w:tcPr/>
-          <w:p>
-            <w:pPr>
-              <w:pStyle w:val="Compact"/>
-            </w:pPr>
-          </w:p>
-        </w:tc>
-        <w:tc>
-          <w:tcPr/>
-          <w:p>
-            <w:pPr>
-              <w:pStyle w:val="Compact"/>
-              <w:jc w:val="left"/>
-            </w:pPr>
-            <w:r>
-              <w:t xml:space="preserve">Newly discovered guide;</w:t>
-            </w:r>
-            <w:r>
-              <w:t xml:space="preserve"> </w:t>
-            </w:r>
-            <w:r>
-              <w:t xml:space="preserve">“</w:t>
-            </w:r>
-            <w:r>
-              <w:t xml:space="preserve">Supported Hardware Backends</w:t>
-            </w:r>
-            <w:r>
-              <w:t xml:space="preserve">”</w:t>
-            </w:r>
-            <w:r>
-              <w:t xml:space="preserve"> </w:t>
-            </w:r>
-            <w:r>
-              <w:t xml:space="preserve">table lists NVIDIA GPU (vLLM) only, no Intel XPU entry — documented as not applicable</w:t>
-            </w:r>
-          </w:p>
-        </w:tc>
-      </w:tr>
-      <w:tr>
-        <w:tc>
-          <w:tcPr/>
-          <w:p>
-            <w:pPr>
-              <w:pStyle w:val="Compact"/>
-              <w:jc w:val="left"/>
-            </w:pPr>
-            <w:r>
-              <w:t xml:space="preserve">17</w:t>
-            </w:r>
-          </w:p>
-        </w:tc>
-        <w:tc>
-          <w:tcPr/>
-          <w:p>
-            <w:pPr>
-              <w:pStyle w:val="Compact"/>
-              <w:jc w:val="left"/>
-            </w:pPr>
-            <w:r>
-              <w:t xml:space="preserve">RL (verl integration)</w:t>
-            </w:r>
-          </w:p>
-        </w:tc>
-        <w:tc>
-          <w:tcPr/>
-          <w:p>
-            <w:pPr>
-              <w:pStyle w:val="Compact"/>
-              <w:jc w:val="left"/>
-            </w:pPr>
-            <w:r>
-              <w:rPr>
-                <w:rStyle w:val="VerbatimChar"/>
-              </w:rPr>
-              <w:t xml:space="preserve">guides/rl</w:t>
-            </w:r>
-          </w:p>
-        </w:tc>
-        <w:tc>
-          <w:tcPr/>
-          <w:p>
-            <w:pPr>
-              <w:pStyle w:val="Compact"/>
-              <w:jc w:val="left"/>
-            </w:pPr>
-            <w:r>
-              <w:t xml:space="preserve">⚠️</w:t>
-            </w:r>
-          </w:p>
-        </w:tc>
-        <w:tc>
-          <w:tcPr/>
-          <w:p>
-            <w:pPr>
-              <w:pStyle w:val="Compact"/>
-            </w:pPr>
-          </w:p>
-        </w:tc>
-        <w:tc>
-          <w:tcPr/>
-          <w:p>
-            <w:pPr>
-              <w:pStyle w:val="Compact"/>
-              <w:jc w:val="left"/>
-            </w:pPr>
-            <w:r>
-              <w:rPr>
-                <w:bCs/>
-                <w:b/>
-              </w:rPr>
-              <w:t xml:space="preserve">Resolved</w:t>
-            </w:r>
-            <w:r>
-              <w:t xml:space="preserve">:</w:t>
-            </w:r>
-            <w:r>
-              <w:t xml:space="preserve"> </w:t>
-            </w:r>
-            <w:r>
-              <w:rPr>
-                <w:rStyle w:val="VerbatimChar"/>
-              </w:rPr>
-              <w:t xml:space="preserve">verl-integration.md</w:t>
-            </w:r>
-            <w:r>
-              <w:t xml:space="preserve"> </w:t>
-            </w:r>
-            <w:r>
-              <w:t xml:space="preserve">has zero hardware-specific references (no CUDA/NVIDIA/XPU mentions); overrides verl’s routing via the llm-d scheduler over</w:t>
-            </w:r>
-            <w:r>
-              <w:t xml:space="preserve"> </w:t>
-            </w:r>
-            <w:r>
-              <w:t xml:space="preserve">“</w:t>
-            </w:r>
-            <w:r>
-              <w:t xml:space="preserve">vLLM/SGLang actors on Ray</w:t>
-            </w:r>
-            <w:r>
-              <w:t xml:space="preserve">”</w:t>
-            </w:r>
-            <w:r>
-              <w:t xml:space="preserve"> </w:t>
-            </w:r>
-            <w:r>
-              <w:t xml:space="preserve">— same pattern as Flow Control / Multi-Model Routing, both confirmed hardware-agnostic. Feasible-but-untemplated for Intel XPU, not yet written as a full chapter</w:t>
-            </w:r>
-          </w:p>
-        </w:tc>
-      </w:tr>
-    </w:tbl>
-    <w:bookmarkEnd w:id="206"/>
-    <w:bookmarkStart w:id="207" w:name="recommended-next-steps"/>
-    <w:p>
-      <w:pPr>
-        <w:pStyle w:val="Heading2"/>
-      </w:pPr>
-      <w:r>
-        <w:t xml:space="preserve">Recommended next steps</w:t>
-      </w:r>
-    </w:p>
-    <w:p>
-      <w:pPr>
-        <w:numPr>
-          <w:ilvl w:val="0"/>
-          <w:numId w:val="1036"/>
-        </w:numPr>
-        <w:pStyle w:val="Compact"/>
-      </w:pPr>
-      <w:r>
-        <w:t xml:space="preserve">Validate Chapter 1 cases on a real Intel XPU cluster, starting with</w:t>
-      </w:r>
-      <w:r>
-        <w:t xml:space="preserve"> </w:t>
-      </w:r>
-      <w:r>
-        <w:rPr>
-          <w:bCs/>
-          <w:b/>
-        </w:rPr>
-        <w:t xml:space="preserve">Optimized Baseline</w:t>
-      </w:r>
-      <w:r>
-        <w:t xml:space="preserve"> </w:t>
-      </w:r>
-      <w:r>
-        <w:t xml:space="preserve">(has upstream CI coverage) and</w:t>
-      </w:r>
-      <w:r>
-        <w:t xml:space="preserve"> </w:t>
-      </w:r>
-      <w:r>
-        <w:rPr>
-          <w:bCs/>
-          <w:b/>
-        </w:rPr>
-        <w:t xml:space="preserve">P/D Disaggregation</w:t>
-      </w:r>
-      <w:r>
-        <w:t xml:space="preserve"> </w:t>
-      </w:r>
-      <w:r>
-        <w:t xml:space="preserve">(already deep-dived).</w:t>
-      </w:r>
-    </w:p>
-    <w:p>
-      <w:pPr>
-        <w:numPr>
-          <w:ilvl w:val="0"/>
-          <w:numId w:val="1036"/>
-        </w:numPr>
-        <w:pStyle w:val="Compact"/>
-      </w:pPr>
-      <w:r>
-        <w:t xml:space="preserve">Hands-on validate the now-fully-written Chapter 2–5 cases on a real Intel XPU cluster,</w:t>
-      </w:r>
-      <w:r>
-        <w:t xml:space="preserve"> </w:t>
-      </w:r>
-      <w:r>
-        <w:t xml:space="preserve">confirming the</w:t>
-      </w:r>
-      <w:r>
-        <w:t xml:space="preserve"> </w:t>
-      </w:r>
-      <w:r>
-        <w:t xml:space="preserve">“</w:t>
-      </w:r>
-      <w:r>
-        <w:t xml:space="preserve">compose on top of Optimized Baseline</w:t>
-      </w:r>
-      <w:r>
-        <w:t xml:space="preserve">”</w:t>
-      </w:r>
-      <w:r>
-        <w:t xml:space="preserve"> </w:t>
-      </w:r>
-      <w:r>
-        <w:t xml:space="preserve">pattern actually works end-to-end for</w:t>
-      </w:r>
-      <w:r>
-        <w:t xml:space="preserve"> </w:t>
-      </w:r>
-      <w:r>
-        <w:t xml:space="preserve">each (Flow Control, Predicted Latency Routing, Workload Autoscaling, Rollouts, Agentic Serving,</w:t>
-      </w:r>
-      <w:r>
-        <w:t xml:space="preserve"> </w:t>
-      </w:r>
-      <w:r>
-        <w:t xml:space="preserve">Multi-Model Routing, Asynchronous Processing, Batch Gateway, No-Kubernetes Deployment).</w:t>
-      </w:r>
-    </w:p>
-    <w:p>
-      <w:pPr>
-        <w:numPr>
-          <w:ilvl w:val="0"/>
-          <w:numId w:val="1036"/>
-        </w:numPr>
-        <w:pStyle w:val="Compact"/>
-      </w:pPr>
-      <w:r>
-        <w:t xml:space="preserve">Confirm scope for</w:t>
-      </w:r>
-      <w:r>
-        <w:t xml:space="preserve"> </w:t>
-      </w:r>
-      <w:r>
-        <w:rPr>
-          <w:rStyle w:val="VerbatimChar"/>
-        </w:rPr>
-        <w:t xml:space="preserve">guides/rl</w:t>
-      </w:r>
-      <w:r>
-        <w:t xml:space="preserve"> </w:t>
-      </w:r>
-      <w:r>
-        <w:t xml:space="preserve">with stakeholders before investing further writing time.</w:t>
-      </w:r>
-    </w:p>
-    <w:p>
-      <w:pPr>
-        <w:numPr>
-          <w:ilvl w:val="0"/>
-          <w:numId w:val="1036"/>
-        </w:numPr>
-        <w:pStyle w:val="Compact"/>
-      </w:pPr>
-      <w:r>
-        <w:t xml:space="preserve">Re-check</w:t>
-      </w:r>
-      <w:r>
-        <w:t xml:space="preserve"> </w:t>
-      </w:r>
-      <w:r>
-        <w:rPr>
-          <w:rStyle w:val="VerbatimChar"/>
-        </w:rPr>
-        <w:t xml:space="preserve">guides/multimodal-serving/e-disaggregation/</w:t>
-      </w:r>
-      <w:r>
-        <w:t xml:space="preserve"> </w:t>
-      </w:r>
-      <w:r>
-        <w:t xml:space="preserve">periodically for an added Intel XPU</w:t>
-      </w:r>
-      <w:r>
-        <w:t xml:space="preserve"> </w:t>
-      </w:r>
-      <w:r>
-        <w:rPr>
-          <w:rStyle w:val="VerbatimChar"/>
-        </w:rPr>
-        <w:t xml:space="preserve">modelserver/xpu/</w:t>
-      </w:r>
-      <w:r>
-        <w:t xml:space="preserve"> </w:t>
-      </w:r>
-      <w:r>
-        <w:t xml:space="preserve">overlay; upgrade Case 16 from ➖ to 🚧/✅ if one appears.</w:t>
-      </w:r>
-    </w:p>
-    <w:bookmarkEnd w:id="207"/>
-    <w:bookmarkEnd w:id="208"/>
     <w:sectPr/>
   </w:body>
 </w:document>
@@ -39184,91 +37187,6 @@
     <w:lvl w:ilvl="8">
       <w:numFmt w:val="bullet"/>
       <w:lvlText w:val="•"/>
-      <w:lvlJc w:val="left"/>
-      <w:pPr>
-        <w:ind w:left="6480" w:hanging="480"/>
-      </w:pPr>
-    </w:lvl>
-  </w:abstractNum>
-  <w:abstractNum w:abstractNumId="99411">
-    <w:nsid w:val="A99411"/>
-    <w:multiLevelType w:val="multilevel"/>
-    <w:lvl w:ilvl="0">
-      <w:start w:val="1"/>
-      <w:numFmt w:val="decimal"/>
-      <w:lvlText w:val="%1."/>
-      <w:lvlJc w:val="left"/>
-      <w:pPr>
-        <w:ind w:left="720" w:hanging="480"/>
-      </w:pPr>
-    </w:lvl>
-    <w:lvl w:ilvl="1">
-      <w:start w:val="1"/>
-      <w:numFmt w:val="decimal"/>
-      <w:lvlText w:val="%2."/>
-      <w:lvlJc w:val="left"/>
-      <w:pPr>
-        <w:ind w:left="1440" w:hanging="480"/>
-      </w:pPr>
-    </w:lvl>
-    <w:lvl w:ilvl="2">
-      <w:start w:val="1"/>
-      <w:numFmt w:val="decimal"/>
-      <w:lvlText w:val="%3."/>
-      <w:lvlJc w:val="left"/>
-      <w:pPr>
-        <w:ind w:left="2160" w:hanging="480"/>
-      </w:pPr>
-    </w:lvl>
-    <w:lvl w:ilvl="3">
-      <w:start w:val="1"/>
-      <w:numFmt w:val="decimal"/>
-      <w:lvlText w:val="%4."/>
-      <w:lvlJc w:val="left"/>
-      <w:pPr>
-        <w:ind w:left="2880" w:hanging="480"/>
-      </w:pPr>
-    </w:lvl>
-    <w:lvl w:ilvl="4">
-      <w:start w:val="1"/>
-      <w:numFmt w:val="decimal"/>
-      <w:lvlText w:val="%5."/>
-      <w:lvlJc w:val="left"/>
-      <w:pPr>
-        <w:ind w:left="3600" w:hanging="480"/>
-      </w:pPr>
-    </w:lvl>
-    <w:lvl w:ilvl="5">
-      <w:start w:val="1"/>
-      <w:numFmt w:val="decimal"/>
-      <w:lvlText w:val="%6."/>
-      <w:lvlJc w:val="left"/>
-      <w:pPr>
-        <w:ind w:left="4320" w:hanging="480"/>
-      </w:pPr>
-    </w:lvl>
-    <w:lvl w:ilvl="6">
-      <w:start w:val="1"/>
-      <w:numFmt w:val="decimal"/>
-      <w:lvlText w:val="%7."/>
-      <w:lvlJc w:val="left"/>
-      <w:pPr>
-        <w:ind w:left="5040" w:hanging="480"/>
-      </w:pPr>
-    </w:lvl>
-    <w:lvl w:ilvl="7">
-      <w:start w:val="1"/>
-      <w:numFmt w:val="decimal"/>
-      <w:lvlText w:val="%8."/>
-      <w:lvlJc w:val="left"/>
-      <w:pPr>
-        <w:ind w:left="5760" w:hanging="480"/>
-      </w:pPr>
-    </w:lvl>
-    <w:lvl w:ilvl="8">
-      <w:start w:val="1"/>
-      <w:numFmt w:val="decimal"/>
-      <w:lvlText w:val="%9."/>
       <w:lvlJc w:val="left"/>
       <w:pPr>
         <w:ind w:left="6480" w:hanging="480"/>
@@ -39382,36 +37300,6 @@
   </w:num>
   <w:num w:numId="1035">
     <w:abstractNumId w:val="991"/>
-  </w:num>
-  <w:num w:numId="1036">
-    <w:abstractNumId w:val="99411"/>
-    <w:lvlOverride w:ilvl="0">
-      <w:startOverride w:val="1"/>
-    </w:lvlOverride>
-    <w:lvlOverride w:ilvl="1">
-      <w:startOverride w:val="1"/>
-    </w:lvlOverride>
-    <w:lvlOverride w:ilvl="2">
-      <w:startOverride w:val="1"/>
-    </w:lvlOverride>
-    <w:lvlOverride w:ilvl="3">
-      <w:startOverride w:val="1"/>
-    </w:lvlOverride>
-    <w:lvlOverride w:ilvl="4">
-      <w:startOverride w:val="1"/>
-    </w:lvlOverride>
-    <w:lvlOverride w:ilvl="5">
-      <w:startOverride w:val="1"/>
-    </w:lvlOverride>
-    <w:lvlOverride w:ilvl="6">
-      <w:startOverride w:val="1"/>
-    </w:lvlOverride>
-    <w:lvlOverride w:ilvl="7">
-      <w:startOverride w:val="1"/>
-    </w:lvlOverride>
-    <w:lvlOverride w:ilvl="8">
-      <w:startOverride w:val="1"/>
-    </w:lvlOverride>
   </w:num>
 </w:numbering>
 </file>

</xml_diff>

<commit_message>
docs: further cleanup of process/meta language in llm-d whitepaper
Reworded a couple of remaining internal-process phrases found during
a full re-check (tracking.md's 'BKM-drift problem' self-reference,
index.md's 'discovered via this search'). Regenerated PDF/docx.

Co-authored-by: Copilot <223556219+Copilot@users.noreply.github.com>
</commit_message>
<xml_diff>
--- a/whitepaper/llm-d-whitepaper.docx
+++ b/whitepaper/llm-d-whitepaper.docx
@@ -1068,13 +1068,7 @@
         <w:t xml:space="preserve"> </w:t>
       </w:r>
       <w:r>
-        <w:t xml:space="preserve">(also discovered via this</w:t>
-      </w:r>
-      <w:r>
-        <w:t xml:space="preserve"> </w:t>
-      </w:r>
-      <w:r>
-        <w:t xml:space="preserve">search, under</w:t>
+        <w:t xml:space="preserve">(under</w:t>
       </w:r>
       <w:r>
         <w:t xml:space="preserve"> </w:t>

</xml_diff>

<commit_message>
docs: replace emoji status markers with plain text tags in PDF content
The default font used by the PDF renderer (weasyprint, since no
LaTeX engine is available in this environment) does not have glyphs
for the emoji used as status markers (checkmark, construction, memo,
heavy-minus-sign, etc). They rendered as tiny broken/invisible tofu
glyphs that ate line width unpredictably, causing odd short-line
wraps and stray whitespace gaps throughout the PDF -- this is what
was reported as pages 'looking wrong'.

Replaced all status emoji in every chapter file and index.md (the
files that feed the combined PDF) with plain bracketed text tags:
(Verified), (In Progress), (Outline), (N/A). tracking.md is left
untouched since it isn't part of the generated PDF and renders fine
as plain Markdown/emoji on GitHub. Regenerated PDF/docx and visually
confirmed via pdftoppm that the layout glitches are gone.

Co-authored-by: Copilot <223556219+Copilot@users.noreply.github.com>
</commit_message>
<xml_diff>
--- a/whitepaper/llm-d-whitepaper.docx
+++ b/whitepaper/llm-d-whitepaper.docx
@@ -74,13 +74,77 @@
         <w:pStyle w:val="BlockText"/>
       </w:pPr>
       <w:r>
-        <w:t xml:space="preserve">Status icons: ✅ verified working / 🚧 documented from official sources but not yet run hands-on /</w:t>
-      </w:r>
-      <w:r>
-        <w:t xml:space="preserve"> </w:t>
-      </w:r>
-      <w:r>
-        <w:t xml:space="preserve">📝 outline only, full deployment steps not yet written / ➖ not applicable (no Intel XPU backend exists upstream)</w:t>
+        <w:t xml:space="preserve">Status labels used below:</w:t>
+      </w:r>
+      <w:r>
+        <w:t xml:space="preserve"> </w:t>
+      </w:r>
+      <w:r>
+        <w:rPr>
+          <w:bCs/>
+          <w:b/>
+        </w:rPr>
+        <w:t xml:space="preserve">Verified</w:t>
+      </w:r>
+      <w:r>
+        <w:t xml:space="preserve"> </w:t>
+      </w:r>
+      <w:r>
+        <w:t xml:space="preserve">(ran hands-on and confirmed working) /</w:t>
+      </w:r>
+      <w:r>
+        <w:t xml:space="preserve"> </w:t>
+      </w:r>
+      <w:r>
+        <w:rPr>
+          <w:bCs/>
+          <w:b/>
+        </w:rPr>
+        <w:t xml:space="preserve">In Progress</w:t>
+      </w:r>
+      <w:r>
+        <w:t xml:space="preserve"> </w:t>
+      </w:r>
+      <w:r>
+        <w:t xml:space="preserve">(documented from official sources, not yet run hands-on) /</w:t>
+      </w:r>
+      <w:r>
+        <w:t xml:space="preserve"> </w:t>
+      </w:r>
+      <w:r>
+        <w:rPr>
+          <w:bCs/>
+          <w:b/>
+        </w:rPr>
+        <w:t xml:space="preserve">Outline</w:t>
+      </w:r>
+      <w:r>
+        <w:t xml:space="preserve"> </w:t>
+      </w:r>
+      <w:r>
+        <w:t xml:space="preserve">(outline only, full</w:t>
+      </w:r>
+      <w:r>
+        <w:t xml:space="preserve"> </w:t>
+      </w:r>
+      <w:r>
+        <w:t xml:space="preserve">deployment steps not yet written) /</w:t>
+      </w:r>
+      <w:r>
+        <w:t xml:space="preserve"> </w:t>
+      </w:r>
+      <w:r>
+        <w:rPr>
+          <w:bCs/>
+          <w:b/>
+        </w:rPr>
+        <w:t xml:space="preserve">N/A</w:t>
+      </w:r>
+      <w:r>
+        <w:t xml:space="preserve"> </w:t>
+      </w:r>
+      <w:r>
+        <w:t xml:space="preserve">(not applicable — no Intel XPU backend exists upstream)</w:t>
       </w:r>
     </w:p>
     <w:p>
@@ -148,7 +212,7 @@
         <w:t xml:space="preserve"> </w:t>
       </w:r>
       <w:r>
-        <w:t xml:space="preserve">— 1.1 Optimized Baseline 🚧</w:t>
+        <w:t xml:space="preserve">— 1.1 Optimized Baseline (In Progress)</w:t>
       </w:r>
     </w:p>
     <w:p>
@@ -171,7 +235,7 @@
         <w:t xml:space="preserve"> </w:t>
       </w:r>
       <w:r>
-        <w:t xml:space="preserve">— 1.2 P/D Disaggregation 🚧</w:t>
+        <w:t xml:space="preserve">— 1.2 P/D Disaggregation (In Progress)</w:t>
       </w:r>
     </w:p>
     <w:p>
@@ -194,7 +258,7 @@
         <w:t xml:space="preserve"> </w:t>
       </w:r>
       <w:r>
-        <w:t xml:space="preserve">— 1.3 Precise Prefix Cache Routing 🚧</w:t>
+        <w:t xml:space="preserve">— 1.3 Precise Prefix Cache Routing (In Progress)</w:t>
       </w:r>
     </w:p>
     <w:p>
@@ -217,7 +281,7 @@
         <w:t xml:space="preserve"> </w:t>
       </w:r>
       <w:r>
-        <w:t xml:space="preserve">— 1.4 Tiered Prefix Cache 🚧</w:t>
+        <w:t xml:space="preserve">— 1.4 Tiered Prefix Cache (In Progress)</w:t>
       </w:r>
     </w:p>
     <w:p>
@@ -240,7 +304,7 @@
         <w:t xml:space="preserve"> </w:t>
       </w:r>
       <w:r>
-        <w:t xml:space="preserve">— 1.5 Wide Expert Parallelism 🚧</w:t>
+        <w:t xml:space="preserve">— 1.5 Wide Expert Parallelism (In Progress)</w:t>
       </w:r>
     </w:p>
     <w:p>
@@ -263,7 +327,7 @@
         <w:t xml:space="preserve"> </w:t>
       </w:r>
       <w:r>
-        <w:t xml:space="preserve">— 1.6 Multimodal Serving (Aggregated) 🚧</w:t>
+        <w:t xml:space="preserve">— 1.6 Multimodal Serving (Aggregated) (In Progress)</w:t>
       </w:r>
     </w:p>
     <w:p>
@@ -285,7 +349,7 @@
         <w:t xml:space="preserve"> </w:t>
       </w:r>
       <w:r>
-        <w:t xml:space="preserve">(hardware-agnostic, compose on top of Chapter 1) — 🚧 fully written</w:t>
+        <w:t xml:space="preserve">(hardware-agnostic, compose on top of Chapter 1) — In Progress, fully written</w:t>
       </w:r>
     </w:p>
     <w:p>
@@ -426,7 +490,7 @@
         <w:t xml:space="preserve"> </w:t>
       </w:r>
       <w:r>
-        <w:t xml:space="preserve">— 🚧 fully written</w:t>
+        <w:t xml:space="preserve">— In Progress, fully written</w:t>
       </w:r>
     </w:p>
     <w:p>
@@ -494,7 +558,7 @@
         <w:t xml:space="preserve"> </w:t>
       </w:r>
       <w:r>
-        <w:t xml:space="preserve">— 🚧 fully written</w:t>
+        <w:t xml:space="preserve">— In Progress, fully written</w:t>
       </w:r>
     </w:p>
     <w:p>
@@ -579,7 +643,7 @@
         <w:t xml:space="preserve"> </w:t>
       </w:r>
       <w:r>
-        <w:t xml:space="preserve">— 5.1 No-Kubernetes Deployment 🚧 (NVIDIA-only upstream; this chapter documents the exact Intel XPU substitution)</w:t>
+        <w:t xml:space="preserve">— 5.1 No-Kubernetes Deployment (In Progress; NVIDIA-only upstream — this chapter documents the exact Intel XPU substitution)</w:t>
       </w:r>
     </w:p>
     <w:p>
@@ -602,7 +666,7 @@
         <w:t xml:space="preserve"> </w:t>
       </w:r>
       <w:r>
-        <w:t xml:space="preserve">— 5.2 Encode Disaggregation (Multimodal) ➖ (confirmed no Intel XPU backend exists)</w:t>
+        <w:t xml:space="preserve">— 5.2 Encode Disaggregation (Multimodal) (N/A — confirmed no Intel XPU backend exists)</w:t>
       </w:r>
     </w:p>
     <w:p>
@@ -1026,7 +1090,7 @@
         <w:t xml:space="preserve"> </w:t>
       </w:r>
       <w:r>
-        <w:t xml:space="preserve">their own. All nine now have fully-written deployment chapters (Chapters 2–5, 🚧).</w:t>
+        <w:t xml:space="preserve">their own. All nine now have fully-written deployment chapters (Chapters 2–5, In Progress).</w:t>
       </w:r>
       <w:r>
         <w:t xml:space="preserve"> </w:t>
@@ -1114,7 +1178,7 @@
         <w:t xml:space="preserve"> </w:t>
       </w:r>
       <w:r>
-        <w:t xml:space="preserve">table lists NVIDIA GPU only — so it is documented as ➖ not applicable</w:t>
+        <w:t xml:space="preserve">table lists NVIDIA GPU only — so it is documented as N/A</w:t>
       </w:r>
       <w:r>
         <w:t xml:space="preserve"> </w:t>
@@ -2202,13 +2266,13 @@
     </w:p>
     <w:bookmarkEnd w:id="48"/>
     <w:bookmarkEnd w:id="49"/>
-    <w:bookmarkStart w:id="58" w:name="optimized-baseline"/>
+    <w:bookmarkStart w:id="58" w:name="optimized-baseline-in-progress"/>
     <w:p>
       <w:pPr>
         <w:pStyle w:val="Heading1"/>
       </w:pPr>
       <w:r>
-        <w:t xml:space="preserve">1.1 Optimized Baseline 🚧</w:t>
+        <w:t xml:space="preserve">1.1 Optimized Baseline (In Progress)</w:t>
       </w:r>
     </w:p>
     <w:bookmarkStart w:id="50" w:name="overview"/>
@@ -4510,13 +4574,13 @@
     </w:p>
     <w:bookmarkEnd w:id="57"/>
     <w:bookmarkEnd w:id="58"/>
-    <w:bookmarkStart w:id="68" w:name="pd-disaggregation"/>
+    <w:bookmarkStart w:id="68" w:name="pd-disaggregation-in-progress"/>
     <w:p>
       <w:pPr>
         <w:pStyle w:val="Heading1"/>
       </w:pPr>
       <w:r>
-        <w:t xml:space="preserve">1.2 P/D Disaggregation 🚧</w:t>
+        <w:t xml:space="preserve">1.2 P/D Disaggregation (In Progress)</w:t>
       </w:r>
     </w:p>
     <w:bookmarkStart w:id="59" w:name="overview-1"/>
@@ -7052,13 +7116,13 @@
     </w:p>
     <w:bookmarkEnd w:id="67"/>
     <w:bookmarkEnd w:id="68"/>
-    <w:bookmarkStart w:id="77" w:name="precise-prefix-cache-routing"/>
+    <w:bookmarkStart w:id="77" w:name="precise-prefix-cache-routing-in-progress"/>
     <w:p>
       <w:pPr>
         <w:pStyle w:val="Heading1"/>
       </w:pPr>
       <w:r>
-        <w:t xml:space="preserve">1.3 Precise Prefix Cache Routing 🚧</w:t>
+        <w:t xml:space="preserve">1.3 Precise Prefix Cache Routing (In Progress)</w:t>
       </w:r>
     </w:p>
     <w:bookmarkStart w:id="69" w:name="overview-2"/>
@@ -9160,13 +9224,13 @@
     </w:p>
     <w:bookmarkEnd w:id="76"/>
     <w:bookmarkEnd w:id="77"/>
-    <w:bookmarkStart w:id="86" w:name="tiered-prefix-cache"/>
+    <w:bookmarkStart w:id="86" w:name="tiered-prefix-cache-in-progress"/>
     <w:p>
       <w:pPr>
         <w:pStyle w:val="Heading1"/>
       </w:pPr>
       <w:r>
-        <w:t xml:space="preserve">1.4 Tiered Prefix Cache 🚧</w:t>
+        <w:t xml:space="preserve">1.4 Tiered Prefix Cache (In Progress)</w:t>
       </w:r>
     </w:p>
     <w:bookmarkStart w:id="78" w:name="overview-3"/>
@@ -10852,13 +10916,13 @@
     </w:p>
     <w:bookmarkEnd w:id="85"/>
     <w:bookmarkEnd w:id="86"/>
-    <w:bookmarkStart w:id="96" w:name="wide-expert-parallelism"/>
+    <w:bookmarkStart w:id="96" w:name="wide-expert-parallelism-in-progress"/>
     <w:p>
       <w:pPr>
         <w:pStyle w:val="Heading1"/>
       </w:pPr>
       <w:r>
-        <w:t xml:space="preserve">1.5 Wide Expert Parallelism 🚧</w:t>
+        <w:t xml:space="preserve">1.5 Wide Expert Parallelism (In Progress)</w:t>
       </w:r>
     </w:p>
     <w:bookmarkStart w:id="87" w:name="overview-4"/>
@@ -12934,13 +12998,13 @@
     </w:p>
     <w:bookmarkEnd w:id="95"/>
     <w:bookmarkEnd w:id="96"/>
-    <w:bookmarkStart w:id="105" w:name="multimodal-serving-aggregated"/>
+    <w:bookmarkStart w:id="105" w:name="X0d79e560fa0bbb8acf0b5808a7c491b67631852"/>
     <w:p>
       <w:pPr>
         <w:pStyle w:val="Heading1"/>
       </w:pPr>
       <w:r>
-        <w:t xml:space="preserve">1.6 Multimodal Serving (Aggregated) 🚧</w:t>
+        <w:t xml:space="preserve">1.6 Multimodal Serving (Aggregated) (In Progress)</w:t>
       </w:r>
     </w:p>
     <w:bookmarkStart w:id="97" w:name="overview-5"/>
@@ -14461,13 +14525,13 @@
     </w:p>
     <w:bookmarkEnd w:id="104"/>
     <w:bookmarkEnd w:id="105"/>
-    <w:bookmarkStart w:id="114" w:name="flow-control"/>
+    <w:bookmarkStart w:id="114" w:name="flow-control-in-progress"/>
     <w:p>
       <w:pPr>
         <w:pStyle w:val="Heading1"/>
       </w:pPr>
       <w:r>
-        <w:t xml:space="preserve">2.1 Flow Control 🚧</w:t>
+        <w:t xml:space="preserve">2.1 Flow Control (In Progress)</w:t>
       </w:r>
     </w:p>
     <w:p>
@@ -14482,7 +14546,7 @@
         <w:t xml:space="preserve">Status</w:t>
       </w:r>
       <w:r>
-        <w:t xml:space="preserve">: 🚧 documented from official repo sources, not yet run hands-on. Hardware-agnostic —</w:t>
+        <w:t xml:space="preserve">: documented from official repo sources, not yet run hands-on. Hardware-agnostic —</w:t>
       </w:r>
       <w:r>
         <w:t xml:space="preserve"> </w:t>
@@ -17444,13 +17508,13 @@
     </w:tbl>
     <w:bookmarkEnd w:id="113"/>
     <w:bookmarkEnd w:id="114"/>
-    <w:bookmarkStart w:id="123" w:name="predicted-latency-based-routing"/>
+    <w:bookmarkStart w:id="123" w:name="Xb6ee0d3f148df93be6818c51d392b724bf68305"/>
     <w:p>
       <w:pPr>
         <w:pStyle w:val="Heading1"/>
       </w:pPr>
       <w:r>
-        <w:t xml:space="preserve">2.2 Predicted Latency-Based Routing 🚧</w:t>
+        <w:t xml:space="preserve">2.2 Predicted Latency-Based Routing (In Progress)</w:t>
       </w:r>
     </w:p>
     <w:p>
@@ -17465,7 +17529,7 @@
         <w:t xml:space="preserve">Status</w:t>
       </w:r>
       <w:r>
-        <w:t xml:space="preserve">: 🚧 documented from official repo sources, not yet run hands-on. Hardware-agnostic at</w:t>
+        <w:t xml:space="preserve">: documented from official repo sources, not yet run hands-on. Hardware-agnostic at</w:t>
       </w:r>
       <w:r>
         <w:t xml:space="preserve"> </w:t>
@@ -19838,13 +19902,13 @@
     </w:tbl>
     <w:bookmarkEnd w:id="122"/>
     <w:bookmarkEnd w:id="123"/>
-    <w:bookmarkStart w:id="133" w:name="workload-autoscaling"/>
+    <w:bookmarkStart w:id="133" w:name="workload-autoscaling-in-progress"/>
     <w:p>
       <w:pPr>
         <w:pStyle w:val="Heading1"/>
       </w:pPr>
       <w:r>
-        <w:t xml:space="preserve">2.3 Workload Autoscaling 🚧</w:t>
+        <w:t xml:space="preserve">2.3 Workload Autoscaling (In Progress)</w:t>
       </w:r>
     </w:p>
     <w:p>
@@ -19859,7 +19923,7 @@
         <w:t xml:space="preserve">Status</w:t>
       </w:r>
       <w:r>
-        <w:t xml:space="preserve">: 🚧 documented from official repo sources, not yet run hands-on. Hardware-agnostic —</w:t>
+        <w:t xml:space="preserve">: documented from official repo sources, not yet run hands-on. Hardware-agnostic —</w:t>
       </w:r>
       <w:r>
         <w:t xml:space="preserve"> </w:t>
@@ -21940,13 +22004,13 @@
     </w:tbl>
     <w:bookmarkEnd w:id="132"/>
     <w:bookmarkEnd w:id="133"/>
-    <w:bookmarkStart w:id="145" w:name="rollouts"/>
+    <w:bookmarkStart w:id="145" w:name="rollouts-in-progress"/>
     <w:p>
       <w:pPr>
         <w:pStyle w:val="Heading1"/>
       </w:pPr>
       <w:r>
-        <w:t xml:space="preserve">2.4 Rollouts 🚧</w:t>
+        <w:t xml:space="preserve">2.4 Rollouts (In Progress)</w:t>
       </w:r>
     </w:p>
     <w:p>
@@ -21961,7 +22025,7 @@
         <w:t xml:space="preserve">Status</w:t>
       </w:r>
       <w:r>
-        <w:t xml:space="preserve">: 🚧 documented from official repo sources, not yet run hands-on. Hardware-agnostic —</w:t>
+        <w:t xml:space="preserve">: documented from official repo sources, not yet run hands-on. Hardware-agnostic —</w:t>
       </w:r>
       <w:r>
         <w:t xml:space="preserve"> </w:t>
@@ -24655,13 +24719,13 @@
     </w:tbl>
     <w:bookmarkEnd w:id="144"/>
     <w:bookmarkEnd w:id="145"/>
-    <w:bookmarkStart w:id="154" w:name="agentic-serving"/>
+    <w:bookmarkStart w:id="154" w:name="agentic-serving-in-progress"/>
     <w:p>
       <w:pPr>
         <w:pStyle w:val="Heading1"/>
       </w:pPr>
       <w:r>
-        <w:t xml:space="preserve">3.1 Agentic Serving 🚧</w:t>
+        <w:t xml:space="preserve">3.1 Agentic Serving (In Progress)</w:t>
       </w:r>
     </w:p>
     <w:p>
@@ -24676,7 +24740,7 @@
         <w:t xml:space="preserve">Status</w:t>
       </w:r>
       <w:r>
-        <w:t xml:space="preserve">: 🚧 documented from official repo sources, not yet run hands-on. This is a</w:t>
+        <w:t xml:space="preserve">: documented from official repo sources, not yet run hands-on. This is a</w:t>
       </w:r>
       <w:r>
         <w:t xml:space="preserve"> </w:t>
@@ -26131,13 +26195,13 @@
     </w:tbl>
     <w:bookmarkEnd w:id="153"/>
     <w:bookmarkEnd w:id="154"/>
-    <w:bookmarkStart w:id="164" w:name="multi-model-routing"/>
+    <w:bookmarkStart w:id="164" w:name="multi-model-routing-in-progress"/>
     <w:p>
       <w:pPr>
         <w:pStyle w:val="Heading1"/>
       </w:pPr>
       <w:r>
-        <w:t xml:space="preserve">3.2 Multi-Model Routing 🚧</w:t>
+        <w:t xml:space="preserve">3.2 Multi-Model Routing (In Progress)</w:t>
       </w:r>
     </w:p>
     <w:p>
@@ -26152,7 +26216,7 @@
         <w:t xml:space="preserve">Status</w:t>
       </w:r>
       <w:r>
-        <w:t xml:space="preserve">: 🚧 documented from official repo sources, not yet run hands-on. Hardware-agnostic —</w:t>
+        <w:t xml:space="preserve">: documented from official repo sources, not yet run hands-on. Hardware-agnostic —</w:t>
       </w:r>
       <w:r>
         <w:t xml:space="preserve"> </w:t>
@@ -28714,13 +28778,13 @@
     </w:tbl>
     <w:bookmarkEnd w:id="163"/>
     <w:bookmarkEnd w:id="164"/>
-    <w:bookmarkStart w:id="174" w:name="asynchronous-processing"/>
+    <w:bookmarkStart w:id="174" w:name="asynchronous-processing-in-progress"/>
     <w:p>
       <w:pPr>
         <w:pStyle w:val="Heading1"/>
       </w:pPr>
       <w:r>
-        <w:t xml:space="preserve">4.1 Asynchronous Processing 🚧</w:t>
+        <w:t xml:space="preserve">4.1 Asynchronous Processing (In Progress)</w:t>
       </w:r>
     </w:p>
     <w:p>
@@ -28735,7 +28799,7 @@
         <w:t xml:space="preserve">Status</w:t>
       </w:r>
       <w:r>
-        <w:t xml:space="preserve">: 🚧 documented from official repo sources, not yet run hands-on. Hardware-agnostic —</w:t>
+        <w:t xml:space="preserve">: documented from official repo sources, not yet run hands-on. Hardware-agnostic —</w:t>
       </w:r>
       <w:r>
         <w:t xml:space="preserve"> </w:t>
@@ -30124,13 +30188,13 @@
     </w:tbl>
     <w:bookmarkEnd w:id="173"/>
     <w:bookmarkEnd w:id="174"/>
-    <w:bookmarkStart w:id="186" w:name="batch-gateway"/>
+    <w:bookmarkStart w:id="186" w:name="batch-gateway-in-progress"/>
     <w:p>
       <w:pPr>
         <w:pStyle w:val="Heading1"/>
       </w:pPr>
       <w:r>
-        <w:t xml:space="preserve">4.2 Batch Gateway 🚧</w:t>
+        <w:t xml:space="preserve">4.2 Batch Gateway (In Progress)</w:t>
       </w:r>
     </w:p>
     <w:p>
@@ -30145,7 +30209,7 @@
         <w:t xml:space="preserve">Status</w:t>
       </w:r>
       <w:r>
-        <w:t xml:space="preserve">: 🚧 documented from official repo sources, not yet run hands-on. Hardware-agnostic —</w:t>
+        <w:t xml:space="preserve">: documented from official repo sources, not yet run hands-on. Hardware-agnostic —</w:t>
       </w:r>
       <w:r>
         <w:t xml:space="preserve"> </w:t>
@@ -32041,13 +32105,13 @@
     </w:tbl>
     <w:bookmarkEnd w:id="185"/>
     <w:bookmarkEnd w:id="186"/>
-    <w:bookmarkStart w:id="196" w:name="no-kubernetes-deployment"/>
+    <w:bookmarkStart w:id="196" w:name="no-kubernetes-deployment-in-progress"/>
     <w:p>
       <w:pPr>
         <w:pStyle w:val="Heading1"/>
       </w:pPr>
       <w:r>
-        <w:t xml:space="preserve">5.1 No-Kubernetes Deployment 🚧</w:t>
+        <w:t xml:space="preserve">5.1 No-Kubernetes Deployment (In Progress)</w:t>
       </w:r>
     </w:p>
     <w:p>
@@ -32062,7 +32126,7 @@
         <w:t xml:space="preserve">Status</w:t>
       </w:r>
       <w:r>
-        <w:t xml:space="preserve">: 🚧 documented from official repo sources, not yet run hands-on.</w:t>
+        <w:t xml:space="preserve">: documented from official repo sources, not yet run hands-on.</w:t>
       </w:r>
       <w:r>
         <w:t xml:space="preserve"> </w:t>
@@ -35302,13 +35366,13 @@
     </w:tbl>
     <w:bookmarkEnd w:id="195"/>
     <w:bookmarkEnd w:id="196"/>
-    <w:bookmarkStart w:id="201" w:name="encode-disaggregation-multimodal"/>
+    <w:bookmarkStart w:id="201" w:name="encode-disaggregation-multimodal-na"/>
     <w:p>
       <w:pPr>
         <w:pStyle w:val="Heading1"/>
       </w:pPr>
       <w:r>
-        <w:t xml:space="preserve">5.2 Encode Disaggregation (Multimodal) ➖</w:t>
+        <w:t xml:space="preserve">5.2 Encode Disaggregation (Multimodal) (N/A)</w:t>
       </w:r>
     </w:p>
     <w:p>
@@ -35323,7 +35387,7 @@
         <w:t xml:space="preserve">Status</w:t>
       </w:r>
       <w:r>
-        <w:t xml:space="preserve">: ➖ not applicable — confirmed</w:t>
+        <w:t xml:space="preserve">: not applicable — confirmed</w:t>
       </w:r>
       <w:r>
         <w:t xml:space="preserve"> </w:t>
@@ -35782,7 +35846,7 @@
         <w:t xml:space="preserve"> </w:t>
       </w:r>
       <w:r>
-        <w:t xml:space="preserve">for updates, and update this chapter’s status from ➖ to 🚧/✅ accordingly.</w:t>
+        <w:t xml:space="preserve">for updates, and update this chapter’s status from (N/A) to (In Progress)/(Verified) accordingly.</w:t>
       </w:r>
     </w:p>
     <w:bookmarkEnd w:id="199"/>
@@ -35953,7 +36017,7 @@
               <w:jc w:val="left"/>
             </w:pPr>
             <w:r>
-              <w:t xml:space="preserve">➖ not applicable today</w:t>
+              <w:t xml:space="preserve">Not applicable today</w:t>
             </w:r>
           </w:p>
         </w:tc>

</xml_diff>

<commit_message>
docs(whitepaper): remove wiki-diff meta commentary, switch PDF pipeline to xelatex
- Removed 'the old guides/prereq/gateway-provider directory has been
  removed' history commentary in 00-common-installation.md; now states
  current setup only.
- Regenerated PDF using xelatex (TeXLive) instead of weasyprint for
  better Unicode glyph coverage and proper code-block/table wrapping.

Co-authored-by: Copilot <223556219+Copilot@users.noreply.github.com>
</commit_message>
<xml_diff>
--- a/whitepaper/llm-d-whitepaper.docx
+++ b/whitepaper/llm-d-whitepaper.docx
@@ -2,32 +2,6 @@
 <file path=word/document.xml><?xml version="1.0" encoding="utf-8"?>
 <w:document xmlns:w="http://schemas.openxmlformats.org/wordprocessingml/2006/main" xmlns:m="http://schemas.openxmlformats.org/officeDocument/2006/math" xmlns:r="http://schemas.openxmlformats.org/officeDocument/2006/relationships" xmlns:o="urn:schemas-microsoft-com:office:office" xmlns:v="urn:schemas-microsoft-com:vml" xmlns:w10="urn:schemas-microsoft-com:office:word" xmlns:a="http://schemas.openxmlformats.org/drawingml/2006/main" xmlns:pic="http://schemas.openxmlformats.org/drawingml/2006/picture" xmlns:wp="http://schemas.openxmlformats.org/drawingml/2006/wordprocessingDrawing">
   <w:body>
-    <w:sdt>
-      <w:sdtPr>
-        <w:docPartObj>
-          <w:docPartGallery w:val="Table of Contents"/>
-          <w:docPartUnique/>
-        </w:docPartObj>
-      </w:sdtPr>
-      <w:sdtContent>
-        <w:p>
-          <w:pPr>
-            <w:pStyle w:val="TOCHeading"/>
-          </w:pPr>
-          <w:r>
-            <w:t xml:space="preserve">Table of Contents</w:t>
-          </w:r>
-        </w:p>
-        <w:p>
-          <w:r>
-            <w:fldChar w:fldCharType="begin" w:dirty="true"/>
-            <w:instrText xml:space="preserve">TOC \o "1-3" \h \z \u</w:instrText>
-            <w:fldChar w:fldCharType="separate"/>
-            <w:fldChar w:fldCharType="end"/>
-          </w:r>
-        </w:p>
-      </w:sdtContent>
-    </w:sdt>
     <w:bookmarkStart w:id="42" w:name="intel-xpu-deployment-whitepaper-llm-d"/>
     <w:p>
       <w:pPr>
@@ -1653,28 +1627,13 @@
         <w:t xml:space="preserve"> </w:t>
       </w:r>
       <w:r>
-        <w:t xml:space="preserve">The old</w:t>
-      </w:r>
-      <w:r>
-        <w:t xml:space="preserve"> </w:t>
-      </w:r>
-      <w:r>
-        <w:rPr>
-          <w:rStyle w:val="VerbatimChar"/>
-        </w:rPr>
-        <w:t xml:space="preserve">guides/prereq/gateway-provider</w:t>
-      </w:r>
-      <w:r>
-        <w:t xml:space="preserve"> </w:t>
-      </w:r>
-      <w:r>
-        <w:t xml:space="preserve">directory has been removed. CRD installation is now a</w:t>
-      </w:r>
-      <w:r>
-        <w:t xml:space="preserve"> </w:t>
-      </w:r>
-      <w:r>
-        <w:t xml:space="preserve">single command; Gateway Provider installation (Istio / GKE / Agentgateway) lives under</w:t>
+        <w:t xml:space="preserve">CRD installation is a single command below. Gateway Provider installation (Istio / GKE /</w:t>
+      </w:r>
+      <w:r>
+        <w:t xml:space="preserve"> </w:t>
+      </w:r>
+      <w:r>
+        <w:t xml:space="preserve">Agentgateway) lives under</w:t>
       </w:r>
       <w:r>
         <w:t xml:space="preserve"> </w:t>

</xml_diff>

<commit_message>
docs(whitepaper): remove authoring-process commentary from rollouts chapter
Removed 'Always verify a guide's current path against git log/find
before trusting a README link. This chapter is written against the
current path' — meta-commentary about the whitepaper's own
verification process, not reader-facing content. States the current
repo path as fact instead.

Co-authored-by: Copilot <223556219+Copilot@users.noreply.github.com>
</commit_message>
<xml_diff>
--- a/whitepaper/llm-d-whitepaper.docx
+++ b/whitepaper/llm-d-whitepaper.docx
@@ -22056,7 +22056,7 @@
         <w:t xml:space="preserve"> </w:t>
       </w:r>
       <w:r>
-        <w:t xml:space="preserve">but as of this writing that path has moved to</w:t>
+        <w:t xml:space="preserve">but that path has moved to</w:t>
       </w:r>
       <w:r>
         <w:t xml:space="preserve"> </w:t>
@@ -22071,31 +22071,31 @@
         <w:t xml:space="preserve"> </w:t>
       </w:r>
       <w:r>
-        <w:t xml:space="preserve">as part of a broader</w:t>
-      </w:r>
-      <w:r>
-        <w:t xml:space="preserve"> </w:t>
-      </w:r>
-      <w:r>
-        <w:t xml:space="preserve">documentation reorganization (</w:t>
+        <w:t xml:space="preserve">as part of a broader documentation</w:t>
+      </w:r>
+      <w:r>
+        <w:t xml:space="preserve"> </w:t>
+      </w:r>
+      <w:r>
+        <w:t xml:space="preserve">reorganization (</w:t>
       </w:r>
       <w:r>
         <w:t xml:space="preserve">“</w:t>
       </w:r>
       <w:r>
-        <w:t xml:space="preserve">Reorganize part 2: create two new pillars, operations and</w:t>
-      </w:r>
-      <w:r>
-        <w:t xml:space="preserve"> </w:t>
-      </w:r>
-      <w:r>
-        <w:t xml:space="preserve">infrastructure</w:t>
+        <w:t xml:space="preserve">Reorganize part 2: create two new pillars, operations and infrastructure</w:t>
       </w:r>
       <w:r>
         <w:t xml:space="preserve">”</w:t>
       </w:r>
       <w:r>
-        <w:t xml:space="preserve">). Always verify a guide’s current path against</w:t>
+        <w:t xml:space="preserve">).</w:t>
+      </w:r>
+      <w:r>
+        <w:t xml:space="preserve"> </w:t>
+      </w:r>
+      <w:r>
+        <w:t xml:space="preserve">The commands below reference the current</w:t>
       </w:r>
       <w:r>
         <w:t xml:space="preserve"> </w:t>
@@ -22104,28 +22104,13 @@
         <w:rPr>
           <w:rStyle w:val="VerbatimChar"/>
         </w:rPr>
-        <w:t xml:space="preserve">git log</w:t>
-      </w:r>
-      <w:r>
-        <w:t xml:space="preserve">/</w:t>
-      </w:r>
-      <w:r>
-        <w:rPr>
-          <w:rStyle w:val="VerbatimChar"/>
-        </w:rPr>
-        <w:t xml:space="preserve">find</w:t>
-      </w:r>
-      <w:r>
-        <w:t xml:space="preserve"> </w:t>
-      </w:r>
-      <w:r>
-        <w:t xml:space="preserve">before</w:t>
-      </w:r>
-      <w:r>
-        <w:t xml:space="preserve"> </w:t>
-      </w:r>
-      <w:r>
-        <w:t xml:space="preserve">trusting a README link. This chapter is written against the current path.</w:t>
+        <w:t xml:space="preserve">docs/operations/rollouts/</w:t>
+      </w:r>
+      <w:r>
+        <w:t xml:space="preserve"> </w:t>
+      </w:r>
+      <w:r>
+        <w:t xml:space="preserve">path.</w:t>
       </w:r>
     </w:p>
     <w:bookmarkStart w:id="134" w:name="overview-9"/>

</xml_diff>

<commit_message>
docs(whitepaper): add concrete Intel GPU DRA driver install steps
The prerequisites section only said the DRA driver should already be
installed ("so that kubectl get deviceclass lists gpu.intel.com"),
which assumes the reader already has a working setup and gives them
no way to get there. Added a 0.1.1 subsection with the actual Helm
install command for the Intel resource drivers for Kubernetes project
(oci://ghcr.io/intel/intel-resource-drivers-for-kubernetes/intel-gpu-resource-driver-chart),
verification commands (deviceclass + resourceslices), and a link to
the driver's own USAGE.md for CDI/container-runtime requirements.
Also clarified the Kubernetes version needed for DRA's structured
parameters (GA in v1.34) versus the general 1.29+ minimum.

Co-authored-by: Copilot <223556219+Copilot@users.noreply.github.com>
</commit_message>
<xml_diff>
--- a/whitepaper/llm-d-whitepaper.docx
+++ b/whitepaper/llm-d-whitepaper.docx
@@ -1182,7 +1182,7 @@
     <w:bookmarkEnd w:id="39"/>
     <w:bookmarkEnd w:id="40"/>
     <w:bookmarkEnd w:id="41"/>
-    <w:bookmarkStart w:id="48" w:name="chapter-0.-common-installation"/>
+    <w:bookmarkStart w:id="52" w:name="chapter-0.-common-installation"/>
     <w:p>
       <w:pPr>
         <w:pStyle w:val="Heading1"/>
@@ -1205,7 +1205,7 @@
         <w:t xml:space="preserve">these steps.</w:t>
       </w:r>
     </w:p>
-    <w:bookmarkStart w:id="43" w:name="cluster-and-hardware-requirements"/>
+    <w:bookmarkStart w:id="47" w:name="cluster-and-hardware-requirements"/>
     <w:p>
       <w:pPr>
         <w:pStyle w:val="Heading2"/>
@@ -1223,13 +1223,42 @@
         <w:pStyle w:val="Compact"/>
       </w:pPr>
       <w:r>
-        <w:t xml:space="preserve">A Kubernetes cluster (1.29+ recommended) with nodes exposing Intel Data Center GPU Max series or</w:t>
-      </w:r>
-      <w:r>
-        <w:t xml:space="preserve"> </w:t>
-      </w:r>
-      <w:r>
-        <w:t xml:space="preserve">Intel Arc Pro GPUs</w:t>
+        <w:t xml:space="preserve">A Kubernetes cluster (1.29+ recommended; 1.34+ if you plan to use the DRA-based deployment</w:t>
+      </w:r>
+      <w:r>
+        <w:t xml:space="preserve"> </w:t>
+      </w:r>
+      <w:r>
+        <w:t xml:space="preserve">templates, since DRA’s structured-parameters API only reached GA in that release) with nodes</w:t>
+      </w:r>
+      <w:r>
+        <w:t xml:space="preserve"> </w:t>
+      </w:r>
+      <w:r>
+        <w:t xml:space="preserve">exposing Intel Data Center GPU Max series or Intel Arc Pro GPUs, and the host Linux</w:t>
+      </w:r>
+      <w:r>
+        <w:t xml:space="preserve"> </w:t>
+      </w:r>
+      <w:hyperlink r:id="rId42">
+        <w:r>
+          <w:rPr>
+            <w:rStyle w:val="Hyperlink"/>
+          </w:rPr>
+          <w:t xml:space="preserve">Intel GPU kernel driver</w:t>
+        </w:r>
+      </w:hyperlink>
+      <w:r>
+        <w:t xml:space="preserve"> </w:t>
+      </w:r>
+      <w:r>
+        <w:t xml:space="preserve">already</w:t>
+      </w:r>
+      <w:r>
+        <w:t xml:space="preserve"> </w:t>
+      </w:r>
+      <w:r>
+        <w:t xml:space="preserve">installed on each node</w:t>
       </w:r>
     </w:p>
     <w:p>
@@ -1251,13 +1280,13 @@
           <w:bCs/>
           <w:b/>
         </w:rPr>
-        <w:t xml:space="preserve">Intel GPU device plugin / DRA driver</w:t>
-      </w:r>
-      <w:r>
-        <w:t xml:space="preserve"> </w:t>
-      </w:r>
-      <w:r>
-        <w:t xml:space="preserve">installed, so that</w:t>
+        <w:t xml:space="preserve">Intel GPU DRA driver</w:t>
+      </w:r>
+      <w:r>
+        <w:t xml:space="preserve"> </w:t>
+      </w:r>
+      <w:r>
+        <w:t xml:space="preserve">installed (see 0.1.1 below), so that</w:t>
       </w:r>
       <w:r>
         <w:t xml:space="preserve"> </w:t>
@@ -1325,7 +1354,7 @@
       <w:r>
         <w:t xml:space="preserve"> </w:t>
       </w:r>
-      <w:hyperlink r:id="rId42">
+      <w:hyperlink r:id="rId43">
         <w:r>
           <w:rPr>
             <w:rStyle w:val="VerbatimChar"/>
@@ -1334,8 +1363,272 @@
         </w:r>
       </w:hyperlink>
     </w:p>
-    <w:bookmarkEnd w:id="43"/>
-    <w:bookmarkStart w:id="44" w:name="clone-the-repository"/>
+    <w:bookmarkStart w:id="46" w:name="install-the-intel-gpu-dra-driver"/>
+    <w:p>
+      <w:pPr>
+        <w:pStyle w:val="Heading3"/>
+      </w:pPr>
+      <w:r>
+        <w:t xml:space="preserve">0.1.1 Install the Intel GPU DRA Driver</w:t>
+      </w:r>
+    </w:p>
+    <w:p>
+      <w:pPr>
+        <w:pStyle w:val="FirstParagraph"/>
+      </w:pPr>
+      <w:r>
+        <w:t xml:space="preserve">Not part of the llm-d repo itself — this is a cluster-level, vendor-provided component from</w:t>
+      </w:r>
+      <w:r>
+        <w:t xml:space="preserve"> </w:t>
+      </w:r>
+      <w:hyperlink r:id="rId44">
+        <w:r>
+          <w:rPr>
+            <w:rStyle w:val="VerbatimChar"/>
+          </w:rPr>
+          <w:t xml:space="preserve">intel/intel-resource-drivers-for-kubernetes</w:t>
+        </w:r>
+      </w:hyperlink>
+      <w:r>
+        <w:t xml:space="preserve"> </w:t>
+      </w:r>
+      <w:r>
+        <w:t xml:space="preserve">that must be installed once per cluster before any Intel XPU case in this whitepaper. Install via</w:t>
+      </w:r>
+      <w:r>
+        <w:t xml:space="preserve"> </w:t>
+      </w:r>
+      <w:r>
+        <w:t xml:space="preserve">its published Helm chart:</w:t>
+      </w:r>
+    </w:p>
+    <w:p>
+      <w:pPr>
+        <w:pStyle w:val="SourceCode"/>
+      </w:pPr>
+      <w:r>
+        <w:rPr>
+          <w:rStyle w:val="ExtensionTok"/>
+        </w:rPr>
+        <w:t xml:space="preserve">helm</w:t>
+      </w:r>
+      <w:r>
+        <w:rPr>
+          <w:rStyle w:val="NormalTok"/>
+        </w:rPr>
+        <w:t xml:space="preserve"> install </w:t>
+      </w:r>
+      <w:r>
+        <w:rPr>
+          <w:rStyle w:val="DataTypeTok"/>
+        </w:rPr>
+        <w:t xml:space="preserve">\</w:t>
+      </w:r>
+      <w:r>
+        <w:br/>
+      </w:r>
+      <w:r>
+        <w:rPr>
+          <w:rStyle w:val="NormalTok"/>
+        </w:rPr>
+        <w:t xml:space="preserve">  </w:t>
+      </w:r>
+      <w:r>
+        <w:rPr>
+          <w:rStyle w:val="AttributeTok"/>
+        </w:rPr>
+        <w:t xml:space="preserve">--namespace</w:t>
+      </w:r>
+      <w:r>
+        <w:rPr>
+          <w:rStyle w:val="NormalTok"/>
+        </w:rPr>
+        <w:t xml:space="preserve"> intel-gpu-resource-driver </w:t>
+      </w:r>
+      <w:r>
+        <w:rPr>
+          <w:rStyle w:val="DataTypeTok"/>
+        </w:rPr>
+        <w:t xml:space="preserve">\</w:t>
+      </w:r>
+      <w:r>
+        <w:br/>
+      </w:r>
+      <w:r>
+        <w:rPr>
+          <w:rStyle w:val="NormalTok"/>
+        </w:rPr>
+        <w:t xml:space="preserve">  </w:t>
+      </w:r>
+      <w:r>
+        <w:rPr>
+          <w:rStyle w:val="AttributeTok"/>
+        </w:rPr>
+        <w:t xml:space="preserve">--create-namespace</w:t>
+      </w:r>
+      <w:r>
+        <w:rPr>
+          <w:rStyle w:val="NormalTok"/>
+        </w:rPr>
+        <w:t xml:space="preserve"> </w:t>
+      </w:r>
+      <w:r>
+        <w:rPr>
+          <w:rStyle w:val="DataTypeTok"/>
+        </w:rPr>
+        <w:t xml:space="preserve">\</w:t>
+      </w:r>
+      <w:r>
+        <w:br/>
+      </w:r>
+      <w:r>
+        <w:rPr>
+          <w:rStyle w:val="NormalTok"/>
+        </w:rPr>
+        <w:t xml:space="preserve">  intel-gpu-resource-driver oci://ghcr.io/intel/intel-resource-drivers-for-kubernetes/intel-gpu-resource-driver-chart</w:t>
+      </w:r>
+    </w:p>
+    <w:p>
+      <w:pPr>
+        <w:pStyle w:val="FirstParagraph"/>
+      </w:pPr>
+      <w:r>
+        <w:t xml:space="preserve">Verify the driver is up and the</w:t>
+      </w:r>
+      <w:r>
+        <w:t xml:space="preserve"> </w:t>
+      </w:r>
+      <w:r>
+        <w:rPr>
+          <w:rStyle w:val="VerbatimChar"/>
+        </w:rPr>
+        <w:t xml:space="preserve">gpu.intel.com</w:t>
+      </w:r>
+      <w:r>
+        <w:t xml:space="preserve"> </w:t>
+      </w:r>
+      <w:r>
+        <w:rPr>
+          <w:rStyle w:val="VerbatimChar"/>
+        </w:rPr>
+        <w:t xml:space="preserve">DeviceClass</w:t>
+      </w:r>
+      <w:r>
+        <w:t xml:space="preserve"> </w:t>
+      </w:r>
+      <w:r>
+        <w:t xml:space="preserve">and per-node</w:t>
+      </w:r>
+      <w:r>
+        <w:t xml:space="preserve"> </w:t>
+      </w:r>
+      <w:r>
+        <w:rPr>
+          <w:rStyle w:val="VerbatimChar"/>
+        </w:rPr>
+        <w:t xml:space="preserve">ResourceSlice</w:t>
+      </w:r>
+      <w:r>
+        <w:t xml:space="preserve"> </w:t>
+      </w:r>
+      <w:r>
+        <w:t xml:space="preserve">objects were published:</w:t>
+      </w:r>
+    </w:p>
+    <w:p>
+      <w:pPr>
+        <w:pStyle w:val="SourceCode"/>
+      </w:pPr>
+      <w:r>
+        <w:rPr>
+          <w:rStyle w:val="ExtensionTok"/>
+        </w:rPr>
+        <w:t xml:space="preserve">kubectl</w:t>
+      </w:r>
+      <w:r>
+        <w:rPr>
+          <w:rStyle w:val="NormalTok"/>
+        </w:rPr>
+        <w:t xml:space="preserve"> get pods </w:t>
+      </w:r>
+      <w:r>
+        <w:rPr>
+          <w:rStyle w:val="AttributeTok"/>
+        </w:rPr>
+        <w:t xml:space="preserve">-n</w:t>
+      </w:r>
+      <w:r>
+        <w:rPr>
+          <w:rStyle w:val="NormalTok"/>
+        </w:rPr>
+        <w:t xml:space="preserve"> intel-gpu-resource-driver</w:t>
+      </w:r>
+      <w:r>
+        <w:br/>
+      </w:r>
+      <w:r>
+        <w:rPr>
+          <w:rStyle w:val="ExtensionTok"/>
+        </w:rPr>
+        <w:t xml:space="preserve">kubectl</w:t>
+      </w:r>
+      <w:r>
+        <w:rPr>
+          <w:rStyle w:val="NormalTok"/>
+        </w:rPr>
+        <w:t xml:space="preserve"> get deviceclass gpu.intel.com</w:t>
+      </w:r>
+      <w:r>
+        <w:br/>
+      </w:r>
+      <w:r>
+        <w:rPr>
+          <w:rStyle w:val="ExtensionTok"/>
+        </w:rPr>
+        <w:t xml:space="preserve">kubectl</w:t>
+      </w:r>
+      <w:r>
+        <w:rPr>
+          <w:rStyle w:val="NormalTok"/>
+        </w:rPr>
+        <w:t xml:space="preserve"> get resourceslices</w:t>
+      </w:r>
+    </w:p>
+    <w:p>
+      <w:pPr>
+        <w:pStyle w:val="FirstParagraph"/>
+      </w:pPr>
+      <w:r>
+        <w:t xml:space="preserve">See the driver’s own</w:t>
+      </w:r>
+      <w:r>
+        <w:t xml:space="preserve"> </w:t>
+      </w:r>
+      <w:hyperlink r:id="rId45">
+        <w:r>
+          <w:rPr>
+            <w:rStyle w:val="Hyperlink"/>
+          </w:rPr>
+          <w:t xml:space="preserve">GPU documentation</w:t>
+        </w:r>
+      </w:hyperlink>
+      <w:r>
+        <w:t xml:space="preserve"> </w:t>
+      </w:r>
+      <w:r>
+        <w:t xml:space="preserve">for container-runtime CDI requirements (CRI-O 1.23+ or Containerd 1.7+ with CDI enabled) and</w:t>
+      </w:r>
+      <w:r>
+        <w:t xml:space="preserve"> </w:t>
+      </w:r>
+      <w:r>
+        <w:t xml:space="preserve">alternative install methods (kustomize, Node Feature Discovery-scoped rollout).</w:t>
+      </w:r>
+    </w:p>
+    <w:bookmarkEnd w:id="46"/>
+    <w:bookmarkEnd w:id="47"/>
+    <w:bookmarkStart w:id="48" w:name="clone-the-repository"/>
     <w:p>
       <w:pPr>
         <w:pStyle w:val="Heading2"/>
@@ -1612,8 +1905,8 @@
         <w:t xml:space="preserve">hardcode a version.</w:t>
       </w:r>
     </w:p>
-    <w:bookmarkEnd w:id="44"/>
-    <w:bookmarkStart w:id="45" w:name="X2e27fe880e91230e9aa5655637b82f14328eac7"/>
+    <w:bookmarkEnd w:id="48"/>
+    <w:bookmarkStart w:id="49" w:name="X2e27fe880e91230e9aa5655637b82f14328eac7"/>
     <w:p>
       <w:pPr>
         <w:pStyle w:val="Heading2"/>
@@ -1730,8 +2023,8 @@
         <w:t xml:space="preserve">be shared across every case in this whitepaper via a dedicated HTTPRoute per case.</w:t>
       </w:r>
     </w:p>
-    <w:bookmarkEnd w:id="45"/>
-    <w:bookmarkStart w:id="46" w:name="namespace-and-huggingface-token"/>
+    <w:bookmarkEnd w:id="49"/>
+    <w:bookmarkStart w:id="50" w:name="namespace-and-huggingface-token"/>
     <w:p>
       <w:pPr>
         <w:pStyle w:val="Heading2"/>
@@ -2120,8 +2413,8 @@
         <w:t xml:space="preserve">-</w:t>
       </w:r>
     </w:p>
-    <w:bookmarkEnd w:id="46"/>
-    <w:bookmarkStart w:id="47" w:name="proxy-configuration-if-required"/>
+    <w:bookmarkEnd w:id="50"/>
+    <w:bookmarkStart w:id="51" w:name="proxy-configuration-if-required"/>
     <w:p>
       <w:pPr>
         <w:pStyle w:val="Heading2"/>
@@ -2229,9 +2522,9 @@
         </w:pict>
       </w:r>
     </w:p>
-    <w:bookmarkEnd w:id="47"/>
-    <w:bookmarkEnd w:id="48"/>
-    <w:bookmarkStart w:id="57" w:name="optimized-baseline-in-progress"/>
+    <w:bookmarkEnd w:id="51"/>
+    <w:bookmarkEnd w:id="52"/>
+    <w:bookmarkStart w:id="61" w:name="optimized-baseline-in-progress"/>
     <w:p>
       <w:pPr>
         <w:pStyle w:val="Heading1"/>
@@ -2240,7 +2533,7 @@
         <w:t xml:space="preserve">1.1 Optimized Baseline (In Progress)</w:t>
       </w:r>
     </w:p>
-    <w:bookmarkStart w:id="49" w:name="overview"/>
+    <w:bookmarkStart w:id="53" w:name="overview"/>
     <w:p>
       <w:pPr>
         <w:pStyle w:val="Heading2"/>
@@ -2404,8 +2697,8 @@
         <w:t xml:space="preserve">fast validation — swap in a production model before real deployment.</w:t>
       </w:r>
     </w:p>
-    <w:bookmarkEnd w:id="49"/>
-    <w:bookmarkStart w:id="50" w:name="prerequisites"/>
+    <w:bookmarkEnd w:id="53"/>
+    <w:bookmarkStart w:id="54" w:name="prerequisites"/>
     <w:p>
       <w:pPr>
         <w:pStyle w:val="Heading2"/>
@@ -2422,8 +2715,8 @@
         <w:t xml:space="preserve">Chapter 0 only. No case-specific prerequisites.</w:t>
       </w:r>
     </w:p>
-    <w:bookmarkEnd w:id="50"/>
-    <w:bookmarkStart w:id="51" w:name="deployment-steps"/>
+    <w:bookmarkEnd w:id="54"/>
+    <w:bookmarkStart w:id="55" w:name="deployment-steps"/>
     <w:p>
       <w:pPr>
         <w:pStyle w:val="Heading2"/>
@@ -3271,8 +3564,8 @@
         <w:t xml:space="preserve">/guides/recipes/modelserver/components/monitoring</w:t>
       </w:r>
     </w:p>
-    <w:bookmarkEnd w:id="51"/>
-    <w:bookmarkStart w:id="52" w:name="verification"/>
+    <w:bookmarkEnd w:id="55"/>
+    <w:bookmarkStart w:id="56" w:name="verification"/>
     <w:p>
       <w:pPr>
         <w:pStyle w:val="Heading2"/>
@@ -3421,8 +3714,8 @@
         <w:t xml:space="preserve">${NAMESPACE}</w:t>
       </w:r>
     </w:p>
-    <w:bookmarkEnd w:id="52"/>
-    <w:bookmarkStart w:id="53" w:name="inference-test"/>
+    <w:bookmarkEnd w:id="56"/>
+    <w:bookmarkStart w:id="57" w:name="inference-test"/>
     <w:p>
       <w:pPr>
         <w:pStyle w:val="Heading2"/>
@@ -3772,8 +4065,8 @@
         <w:t xml:space="preserve">jq</w:t>
       </w:r>
     </w:p>
-    <w:bookmarkEnd w:id="53"/>
-    <w:bookmarkStart w:id="54" w:name="troubleshooting"/>
+    <w:bookmarkEnd w:id="57"/>
+    <w:bookmarkStart w:id="58" w:name="troubleshooting"/>
     <w:p>
       <w:pPr>
         <w:pStyle w:val="Heading2"/>
@@ -3922,8 +4215,8 @@
         <w:t xml:space="preserve">overlay; port the same fix here if you hit it).</w:t>
       </w:r>
     </w:p>
-    <w:bookmarkEnd w:id="54"/>
-    <w:bookmarkStart w:id="55" w:name="cleanup"/>
+    <w:bookmarkEnd w:id="58"/>
+    <w:bookmarkStart w:id="59" w:name="cleanup"/>
     <w:p>
       <w:pPr>
         <w:pStyle w:val="Heading2"/>
@@ -4099,8 +4392,8 @@
         <w:t xml:space="preserve">${NAMESPACE}</w:t>
       </w:r>
     </w:p>
-    <w:bookmarkEnd w:id="55"/>
-    <w:bookmarkStart w:id="56" w:name="configuration-reference"/>
+    <w:bookmarkEnd w:id="59"/>
+    <w:bookmarkStart w:id="60" w:name="configuration-reference"/>
     <w:p>
       <w:pPr>
         <w:pStyle w:val="Heading2"/>
@@ -4537,9 +4830,9 @@
         </w:pict>
       </w:r>
     </w:p>
-    <w:bookmarkEnd w:id="56"/>
-    <w:bookmarkEnd w:id="57"/>
-    <w:bookmarkStart w:id="67" w:name="pd-disaggregation-in-progress"/>
+    <w:bookmarkEnd w:id="60"/>
+    <w:bookmarkEnd w:id="61"/>
+    <w:bookmarkStart w:id="71" w:name="pd-disaggregation-in-progress"/>
     <w:p>
       <w:pPr>
         <w:pStyle w:val="Heading1"/>
@@ -4548,7 +4841,7 @@
         <w:t xml:space="preserve">1.2 P/D Disaggregation (In Progress)</w:t>
       </w:r>
     </w:p>
-    <w:bookmarkStart w:id="58" w:name="overview-1"/>
+    <w:bookmarkStart w:id="62" w:name="overview-1"/>
     <w:p>
       <w:pPr>
         <w:pStyle w:val="Heading2"/>
@@ -4627,8 +4920,8 @@
         <w:t xml:space="preserve">architectures.</w:t>
       </w:r>
     </w:p>
-    <w:bookmarkEnd w:id="58"/>
-    <w:bookmarkStart w:id="59" w:name="prerequisites-1"/>
+    <w:bookmarkEnd w:id="62"/>
+    <w:bookmarkStart w:id="63" w:name="prerequisites-1"/>
     <w:p>
       <w:pPr>
         <w:pStyle w:val="Heading2"/>
@@ -4645,8 +4938,8 @@
         <w:t xml:space="preserve">Chapter 0 only.</w:t>
       </w:r>
     </w:p>
-    <w:bookmarkEnd w:id="59"/>
-    <w:bookmarkStart w:id="60" w:name="deployment-steps-1"/>
+    <w:bookmarkEnd w:id="63"/>
+    <w:bookmarkStart w:id="64" w:name="deployment-steps-1"/>
     <w:p>
       <w:pPr>
         <w:pStyle w:val="Heading2"/>
@@ -5471,8 +5764,8 @@
         <w:t xml:space="preserve">/guides/recipes/modelserver/components/monitoring-pd</w:t>
       </w:r>
     </w:p>
-    <w:bookmarkEnd w:id="60"/>
-    <w:bookmarkStart w:id="61" w:name="verification-1"/>
+    <w:bookmarkEnd w:id="64"/>
+    <w:bookmarkStart w:id="65" w:name="verification-1"/>
     <w:p>
       <w:pPr>
         <w:pStyle w:val="Heading2"/>
@@ -5738,8 +6031,8 @@
         <w:t xml:space="preserve">)</w:t>
       </w:r>
     </w:p>
-    <w:bookmarkEnd w:id="61"/>
-    <w:bookmarkStart w:id="62" w:name="inference-test-1"/>
+    <w:bookmarkEnd w:id="65"/>
+    <w:bookmarkStart w:id="66" w:name="inference-test-1"/>
     <w:p>
       <w:pPr>
         <w:pStyle w:val="Heading2"/>
@@ -6089,8 +6382,8 @@
         <w:t xml:space="preserve">jq</w:t>
       </w:r>
     </w:p>
-    <w:bookmarkEnd w:id="62"/>
-    <w:bookmarkStart w:id="64" w:name="troubleshooting-1"/>
+    <w:bookmarkEnd w:id="66"/>
+    <w:bookmarkStart w:id="68" w:name="troubleshooting-1"/>
     <w:p>
       <w:pPr>
         <w:pStyle w:val="Heading2"/>
@@ -6138,7 +6431,7 @@
       <w:r>
         <w:t xml:space="preserve">(</w:t>
       </w:r>
-      <w:hyperlink r:id="rId63">
+      <w:hyperlink r:id="rId67">
         <w:r>
           <w:rPr>
             <w:rStyle w:val="Hyperlink"/>
@@ -6321,8 +6614,8 @@
         <w:t xml:space="preserve">).</w:t>
       </w:r>
     </w:p>
-    <w:bookmarkEnd w:id="64"/>
-    <w:bookmarkStart w:id="65" w:name="cleanup-1"/>
+    <w:bookmarkEnd w:id="68"/>
+    <w:bookmarkStart w:id="69" w:name="cleanup-1"/>
     <w:p>
       <w:pPr>
         <w:pStyle w:val="Heading2"/>
@@ -6441,8 +6734,8 @@
         <w:t xml:space="preserve">/guides/pd-disaggregation/modelserver/xpu/vllm</w:t>
       </w:r>
     </w:p>
-    <w:bookmarkEnd w:id="65"/>
-    <w:bookmarkStart w:id="66" w:name="configuration-reference-1"/>
+    <w:bookmarkEnd w:id="69"/>
+    <w:bookmarkStart w:id="70" w:name="configuration-reference-1"/>
     <w:p>
       <w:pPr>
         <w:pStyle w:val="Heading2"/>
@@ -7079,9 +7372,9 @@
         </w:pict>
       </w:r>
     </w:p>
-    <w:bookmarkEnd w:id="66"/>
-    <w:bookmarkEnd w:id="67"/>
-    <w:bookmarkStart w:id="76" w:name="precise-prefix-cache-routing-in-progress"/>
+    <w:bookmarkEnd w:id="70"/>
+    <w:bookmarkEnd w:id="71"/>
+    <w:bookmarkStart w:id="80" w:name="precise-prefix-cache-routing-in-progress"/>
     <w:p>
       <w:pPr>
         <w:pStyle w:val="Heading1"/>
@@ -7090,7 +7383,7 @@
         <w:t xml:space="preserve">1.3 Precise Prefix Cache Routing (In Progress)</w:t>
       </w:r>
     </w:p>
-    <w:bookmarkStart w:id="68" w:name="overview-2"/>
+    <w:bookmarkStart w:id="72" w:name="overview-2"/>
     <w:p>
       <w:pPr>
         <w:pStyle w:val="Heading2"/>
@@ -7179,8 +7472,8 @@
         <w:t xml:space="preserve">scoring only works if the two match.</w:t>
       </w:r>
     </w:p>
-    <w:bookmarkEnd w:id="68"/>
-    <w:bookmarkStart w:id="69" w:name="prerequisites-2"/>
+    <w:bookmarkEnd w:id="72"/>
+    <w:bookmarkStart w:id="73" w:name="prerequisites-2"/>
     <w:p>
       <w:pPr>
         <w:pStyle w:val="Heading2"/>
@@ -7239,8 +7532,8 @@
         <w:t xml:space="preserve">).</w:t>
       </w:r>
     </w:p>
-    <w:bookmarkEnd w:id="69"/>
-    <w:bookmarkStart w:id="70" w:name="deployment-steps-2"/>
+    <w:bookmarkEnd w:id="73"/>
+    <w:bookmarkStart w:id="74" w:name="deployment-steps-2"/>
     <w:p>
       <w:pPr>
         <w:pStyle w:val="Heading2"/>
@@ -8096,8 +8389,8 @@
         <w:t xml:space="preserve">socket.</w:t>
       </w:r>
     </w:p>
-    <w:bookmarkEnd w:id="70"/>
-    <w:bookmarkStart w:id="71" w:name="verification-2"/>
+    <w:bookmarkEnd w:id="74"/>
+    <w:bookmarkStart w:id="75" w:name="verification-2"/>
     <w:p>
       <w:pPr>
         <w:pStyle w:val="Heading2"/>
@@ -8246,8 +8539,8 @@
         <w:t xml:space="preserve">)</w:t>
       </w:r>
     </w:p>
-    <w:bookmarkEnd w:id="71"/>
-    <w:bookmarkStart w:id="72" w:name="inference-test-2"/>
+    <w:bookmarkEnd w:id="75"/>
+    <w:bookmarkStart w:id="76" w:name="inference-test-2"/>
     <w:p>
       <w:pPr>
         <w:pStyle w:val="Heading2"/>
@@ -8597,8 +8890,8 @@
         <w:t xml:space="preserve">jq</w:t>
       </w:r>
     </w:p>
-    <w:bookmarkEnd w:id="72"/>
-    <w:bookmarkStart w:id="73" w:name="troubleshooting-2"/>
+    <w:bookmarkEnd w:id="76"/>
+    <w:bookmarkStart w:id="77" w:name="troubleshooting-2"/>
     <w:p>
       <w:pPr>
         <w:pStyle w:val="Heading2"/>
@@ -8754,8 +9047,8 @@
         <w:t xml:space="preserve">into the router pod and test connectivity).</w:t>
       </w:r>
     </w:p>
-    <w:bookmarkEnd w:id="73"/>
-    <w:bookmarkStart w:id="74" w:name="cleanup-2"/>
+    <w:bookmarkEnd w:id="77"/>
+    <w:bookmarkStart w:id="78" w:name="cleanup-2"/>
     <w:p>
       <w:pPr>
         <w:pStyle w:val="Heading2"/>
@@ -8886,8 +9179,8 @@
         <w:t xml:space="preserve">/modelserver/xpu/vllm</w:t>
       </w:r>
     </w:p>
-    <w:bookmarkEnd w:id="74"/>
-    <w:bookmarkStart w:id="75" w:name="configuration-reference-2"/>
+    <w:bookmarkEnd w:id="78"/>
+    <w:bookmarkStart w:id="79" w:name="configuration-reference-2"/>
     <w:p>
       <w:pPr>
         <w:pStyle w:val="Heading2"/>
@@ -9187,9 +9480,9 @@
         </w:pict>
       </w:r>
     </w:p>
-    <w:bookmarkEnd w:id="75"/>
-    <w:bookmarkEnd w:id="76"/>
-    <w:bookmarkStart w:id="85" w:name="tiered-prefix-cache-in-progress"/>
+    <w:bookmarkEnd w:id="79"/>
+    <w:bookmarkEnd w:id="80"/>
+    <w:bookmarkStart w:id="89" w:name="tiered-prefix-cache-in-progress"/>
     <w:p>
       <w:pPr>
         <w:pStyle w:val="Heading1"/>
@@ -9198,7 +9491,7 @@
         <w:t xml:space="preserve">1.4 Tiered Prefix Cache (In Progress)</w:t>
       </w:r>
     </w:p>
-    <w:bookmarkStart w:id="77" w:name="overview-3"/>
+    <w:bookmarkStart w:id="81" w:name="overview-3"/>
     <w:p>
       <w:pPr>
         <w:pStyle w:val="Heading2"/>
@@ -9277,8 +9570,8 @@
         <w:t xml:space="preserve">paths.</w:t>
       </w:r>
     </w:p>
-    <w:bookmarkEnd w:id="77"/>
-    <w:bookmarkStart w:id="78" w:name="prerequisites-3"/>
+    <w:bookmarkEnd w:id="81"/>
+    <w:bookmarkStart w:id="82" w:name="prerequisites-3"/>
     <w:p>
       <w:pPr>
         <w:pStyle w:val="Heading2"/>
@@ -9301,8 +9594,8 @@
         <w:t xml:space="preserve">used here).</w:t>
       </w:r>
     </w:p>
-    <w:bookmarkEnd w:id="78"/>
-    <w:bookmarkStart w:id="79" w:name="deployment-steps-3"/>
+    <w:bookmarkEnd w:id="82"/>
+    <w:bookmarkStart w:id="83" w:name="deployment-steps-3"/>
     <w:p>
       <w:pPr>
         <w:pStyle w:val="Heading2"/>
@@ -9848,8 +10141,8 @@
         <w:t xml:space="preserve">policy before applying.</w:t>
       </w:r>
     </w:p>
-    <w:bookmarkEnd w:id="79"/>
-    <w:bookmarkStart w:id="80" w:name="verification-3"/>
+    <w:bookmarkEnd w:id="83"/>
+    <w:bookmarkStart w:id="84" w:name="verification-3"/>
     <w:p>
       <w:pPr>
         <w:pStyle w:val="Heading2"/>
@@ -9998,8 +10291,8 @@
         <w:t xml:space="preserve">)</w:t>
       </w:r>
     </w:p>
-    <w:bookmarkEnd w:id="80"/>
-    <w:bookmarkStart w:id="81" w:name="inference-test-3"/>
+    <w:bookmarkEnd w:id="84"/>
+    <w:bookmarkStart w:id="85" w:name="inference-test-3"/>
     <w:p>
       <w:pPr>
         <w:pStyle w:val="Heading2"/>
@@ -10363,8 +10656,8 @@
         <w:t xml:space="preserve">logs / metrics for prefix-cache reuse).</w:t>
       </w:r>
     </w:p>
-    <w:bookmarkEnd w:id="81"/>
-    <w:bookmarkStart w:id="82" w:name="troubleshooting-3"/>
+    <w:bookmarkEnd w:id="85"/>
+    <w:bookmarkStart w:id="86" w:name="troubleshooting-3"/>
     <w:p>
       <w:pPr>
         <w:pStyle w:val="Heading2"/>
@@ -10477,8 +10770,8 @@
         <w:t xml:space="preserve">workload and that requests are actually re-sending the same prefix.</w:t>
       </w:r>
     </w:p>
-    <w:bookmarkEnd w:id="82"/>
-    <w:bookmarkStart w:id="83" w:name="cleanup-3"/>
+    <w:bookmarkEnd w:id="86"/>
+    <w:bookmarkStart w:id="87" w:name="cleanup-3"/>
     <w:p>
       <w:pPr>
         <w:pStyle w:val="Heading2"/>
@@ -10669,8 +10962,8 @@
         <w:t xml:space="preserve">/guides/tiered-prefix-cache/modelserver/xpu/vllm/lmcache-connector/cpu/base</w:t>
       </w:r>
     </w:p>
-    <w:bookmarkEnd w:id="83"/>
-    <w:bookmarkStart w:id="84" w:name="configuration-reference-3"/>
+    <w:bookmarkEnd w:id="87"/>
+    <w:bookmarkStart w:id="88" w:name="configuration-reference-3"/>
     <w:p>
       <w:pPr>
         <w:pStyle w:val="Heading2"/>
@@ -10879,9 +11172,9 @@
         </w:pict>
       </w:r>
     </w:p>
-    <w:bookmarkEnd w:id="84"/>
-    <w:bookmarkEnd w:id="85"/>
-    <w:bookmarkStart w:id="95" w:name="wide-expert-parallelism-in-progress"/>
+    <w:bookmarkEnd w:id="88"/>
+    <w:bookmarkEnd w:id="89"/>
+    <w:bookmarkStart w:id="98" w:name="wide-expert-parallelism-in-progress"/>
     <w:p>
       <w:pPr>
         <w:pStyle w:val="Heading1"/>
@@ -10890,7 +11183,7 @@
         <w:t xml:space="preserve">1.5 Wide Expert Parallelism (In Progress)</w:t>
       </w:r>
     </w:p>
-    <w:bookmarkStart w:id="86" w:name="overview-4"/>
+    <w:bookmarkStart w:id="90" w:name="overview-4"/>
     <w:p>
       <w:pPr>
         <w:pStyle w:val="Heading2"/>
@@ -11268,8 +11561,8 @@
         <w:t xml:space="preserve">connectivity configurations (used on some NVIDIA RoCE setups) are not compatible and will fail.</w:t>
       </w:r>
     </w:p>
-    <w:bookmarkEnd w:id="86"/>
-    <w:bookmarkStart w:id="88" w:name="prerequisites-4"/>
+    <w:bookmarkEnd w:id="90"/>
+    <w:bookmarkStart w:id="91" w:name="prerequisites-4"/>
     <w:p>
       <w:pPr>
         <w:pStyle w:val="Heading2"/>
@@ -11294,7 +11587,7 @@
       <w:r>
         <w:t xml:space="preserve"> </w:t>
       </w:r>
-      <w:hyperlink r:id="rId87">
+      <w:hyperlink r:id="rId44">
         <w:r>
           <w:rPr>
             <w:rStyle w:val="Hyperlink"/>
@@ -11339,8 +11632,8 @@
         <w:t xml:space="preserve">verified available</w:t>
       </w:r>
     </w:p>
-    <w:bookmarkEnd w:id="88"/>
-    <w:bookmarkStart w:id="89" w:name="deployment-steps-4"/>
+    <w:bookmarkEnd w:id="91"/>
+    <w:bookmarkStart w:id="92" w:name="deployment-steps-4"/>
     <w:p>
       <w:pPr>
         <w:pStyle w:val="Heading2"/>
@@ -11882,8 +12175,8 @@
         <w:t xml:space="preserve">overlays in this guide are GKE H200/B200-specific and do not apply to the Intel XPU path.</w:t>
       </w:r>
     </w:p>
-    <w:bookmarkEnd w:id="89"/>
-    <w:bookmarkStart w:id="90" w:name="verification-4"/>
+    <w:bookmarkEnd w:id="92"/>
+    <w:bookmarkStart w:id="93" w:name="verification-4"/>
     <w:p>
       <w:pPr>
         <w:pStyle w:val="Heading2"/>
@@ -12041,8 +12334,8 @@
         <w:t xml:space="preserve">-w</w:t>
       </w:r>
     </w:p>
-    <w:bookmarkEnd w:id="90"/>
-    <w:bookmarkStart w:id="91" w:name="inference-test-4"/>
+    <w:bookmarkEnd w:id="93"/>
+    <w:bookmarkStart w:id="94" w:name="inference-test-4"/>
     <w:p>
       <w:pPr>
         <w:pStyle w:val="Heading2"/>
@@ -12500,8 +12793,8 @@
         <w:t xml:space="preserve">jq</w:t>
       </w:r>
     </w:p>
-    <w:bookmarkEnd w:id="91"/>
-    <w:bookmarkStart w:id="92" w:name="troubleshooting-4"/>
+    <w:bookmarkEnd w:id="94"/>
+    <w:bookmarkStart w:id="95" w:name="troubleshooting-4"/>
     <w:p>
       <w:pPr>
         <w:pStyle w:val="Heading2"/>
@@ -12590,8 +12883,8 @@
         <w:t xml:space="preserve">— without it EPP targets the wrong (non-XPU) sidecar port.</w:t>
       </w:r>
     </w:p>
-    <w:bookmarkEnd w:id="92"/>
-    <w:bookmarkStart w:id="93" w:name="cleanup-4"/>
+    <w:bookmarkEnd w:id="95"/>
+    <w:bookmarkStart w:id="96" w:name="cleanup-4"/>
     <w:p>
       <w:pPr>
         <w:pStyle w:val="Heading2"/>
@@ -12710,8 +13003,8 @@
         <w:t xml:space="preserve">/guides/wide-ep-lws/modelserver/xpu/vllm</w:t>
       </w:r>
     </w:p>
-    <w:bookmarkEnd w:id="93"/>
-    <w:bookmarkStart w:id="94" w:name="configuration-reference-4"/>
+    <w:bookmarkEnd w:id="96"/>
+    <w:bookmarkStart w:id="97" w:name="configuration-reference-4"/>
     <w:p>
       <w:pPr>
         <w:pStyle w:val="Heading2"/>
@@ -12961,9 +13254,9 @@
         </w:pict>
       </w:r>
     </w:p>
-    <w:bookmarkEnd w:id="94"/>
-    <w:bookmarkEnd w:id="95"/>
-    <w:bookmarkStart w:id="104" w:name="X0d79e560fa0bbb8acf0b5808a7c491b67631852"/>
+    <w:bookmarkEnd w:id="97"/>
+    <w:bookmarkEnd w:id="98"/>
+    <w:bookmarkStart w:id="107" w:name="X0d79e560fa0bbb8acf0b5808a7c491b67631852"/>
     <w:p>
       <w:pPr>
         <w:pStyle w:val="Heading1"/>
@@ -12972,7 +13265,7 @@
         <w:t xml:space="preserve">1.6 Multimodal Serving (Aggregated) (In Progress)</w:t>
       </w:r>
     </w:p>
-    <w:bookmarkStart w:id="96" w:name="overview-5"/>
+    <w:bookmarkStart w:id="99" w:name="overview-5"/>
     <w:p>
       <w:pPr>
         <w:pStyle w:val="Heading2"/>
@@ -13026,8 +13319,8 @@
         <w:t xml:space="preserve">.</w:t>
       </w:r>
     </w:p>
-    <w:bookmarkEnd w:id="96"/>
-    <w:bookmarkStart w:id="97" w:name="prerequisites-5"/>
+    <w:bookmarkEnd w:id="99"/>
+    <w:bookmarkStart w:id="100" w:name="prerequisites-5"/>
     <w:p>
       <w:pPr>
         <w:pStyle w:val="Heading2"/>
@@ -13044,8 +13337,8 @@
         <w:t xml:space="preserve">Chapter 0 only.</w:t>
       </w:r>
     </w:p>
-    <w:bookmarkEnd w:id="97"/>
-    <w:bookmarkStart w:id="98" w:name="deployment-steps-5"/>
+    <w:bookmarkEnd w:id="100"/>
+    <w:bookmarkStart w:id="101" w:name="deployment-steps-5"/>
     <w:p>
       <w:pPr>
         <w:pStyle w:val="Heading2"/>
@@ -13560,8 +13853,8 @@
         <w:t xml:space="preserve">/guides/recipes/modelserver/components/monitoring</w:t>
       </w:r>
     </w:p>
-    <w:bookmarkEnd w:id="98"/>
-    <w:bookmarkStart w:id="99" w:name="verification-5"/>
+    <w:bookmarkEnd w:id="101"/>
+    <w:bookmarkStart w:id="102" w:name="verification-5"/>
     <w:p>
       <w:pPr>
         <w:pStyle w:val="Heading2"/>
@@ -13710,8 +14003,8 @@
         <w:t xml:space="preserve">)</w:t>
       </w:r>
     </w:p>
-    <w:bookmarkEnd w:id="99"/>
-    <w:bookmarkStart w:id="100" w:name="inference-test-5"/>
+    <w:bookmarkEnd w:id="102"/>
+    <w:bookmarkStart w:id="103" w:name="inference-test-5"/>
     <w:p>
       <w:pPr>
         <w:pStyle w:val="Heading2"/>
@@ -14115,8 +14408,8 @@
         <w:t xml:space="preserve">jq</w:t>
       </w:r>
     </w:p>
-    <w:bookmarkEnd w:id="100"/>
-    <w:bookmarkStart w:id="101" w:name="troubleshooting-5"/>
+    <w:bookmarkEnd w:id="103"/>
+    <w:bookmarkStart w:id="104" w:name="troubleshooting-5"/>
     <w:p>
       <w:pPr>
         <w:pStyle w:val="Heading2"/>
@@ -14190,8 +14483,8 @@
         <w:t xml:space="preserve">URL is reachable from within the cluster.</w:t>
       </w:r>
     </w:p>
-    <w:bookmarkEnd w:id="101"/>
-    <w:bookmarkStart w:id="102" w:name="cleanup-5"/>
+    <w:bookmarkEnd w:id="104"/>
+    <w:bookmarkStart w:id="105" w:name="cleanup-5"/>
     <w:p>
       <w:pPr>
         <w:pStyle w:val="Heading2"/>
@@ -14322,8 +14615,8 @@
         <w:t xml:space="preserve">/modelserver/xpu/vllm/</w:t>
       </w:r>
     </w:p>
-    <w:bookmarkEnd w:id="102"/>
-    <w:bookmarkStart w:id="103" w:name="configuration-reference-5"/>
+    <w:bookmarkEnd w:id="105"/>
+    <w:bookmarkStart w:id="106" w:name="configuration-reference-5"/>
     <w:p>
       <w:pPr>
         <w:pStyle w:val="Heading2"/>
@@ -14488,9 +14781,9 @@
         </w:pict>
       </w:r>
     </w:p>
-    <w:bookmarkEnd w:id="103"/>
-    <w:bookmarkEnd w:id="104"/>
-    <w:bookmarkStart w:id="113" w:name="flow-control-in-progress"/>
+    <w:bookmarkEnd w:id="106"/>
+    <w:bookmarkEnd w:id="107"/>
+    <w:bookmarkStart w:id="116" w:name="flow-control-in-progress"/>
     <w:p>
       <w:pPr>
         <w:pStyle w:val="Heading1"/>
@@ -14520,7 +14813,7 @@
         <w:t xml:space="preserve">same steps apply on Intel XPU as any other accelerator.</w:t>
       </w:r>
     </w:p>
-    <w:bookmarkStart w:id="105" w:name="overview-6"/>
+    <w:bookmarkStart w:id="108" w:name="overview-6"/>
     <w:p>
       <w:pPr>
         <w:pStyle w:val="Heading2"/>
@@ -14780,8 +15073,8 @@
         <w:t xml:space="preserve">Flow Control because none is needed.</w:t>
       </w:r>
     </w:p>
-    <w:bookmarkEnd w:id="105"/>
-    <w:bookmarkStart w:id="106" w:name="prerequisites-6"/>
+    <w:bookmarkEnd w:id="108"/>
+    <w:bookmarkStart w:id="109" w:name="prerequisites-6"/>
     <w:p>
       <w:pPr>
         <w:pStyle w:val="Heading2"/>
@@ -14814,8 +15107,8 @@
         <w:t xml:space="preserve">No additional cluster prerequisites beyond Chapter 0.</w:t>
       </w:r>
     </w:p>
-    <w:bookmarkEnd w:id="106"/>
-    <w:bookmarkStart w:id="107" w:name="deployment-steps-6"/>
+    <w:bookmarkEnd w:id="109"/>
+    <w:bookmarkStart w:id="110" w:name="deployment-steps-6"/>
     <w:p>
       <w:pPr>
         <w:pStyle w:val="Heading2"/>
@@ -15817,8 +16110,8 @@
         <w:t xml:space="preserve">.</w:t>
       </w:r>
     </w:p>
-    <w:bookmarkEnd w:id="107"/>
-    <w:bookmarkStart w:id="108" w:name="verification-6"/>
+    <w:bookmarkEnd w:id="110"/>
+    <w:bookmarkStart w:id="111" w:name="verification-6"/>
     <w:p>
       <w:pPr>
         <w:pStyle w:val="Heading2"/>
@@ -16015,8 +16308,8 @@
         <w:t xml:space="preserve">"Flow Control enabled"</w:t>
       </w:r>
     </w:p>
-    <w:bookmarkEnd w:id="108"/>
-    <w:bookmarkStart w:id="109" w:name="inference-test-6"/>
+    <w:bookmarkEnd w:id="111"/>
+    <w:bookmarkStart w:id="112" w:name="inference-test-6"/>
     <w:p>
       <w:pPr>
         <w:pStyle w:val="Heading2"/>
@@ -16811,8 +17104,8 @@
         <w:t xml:space="preserve">immediately because the system is work-conserving.</w:t>
       </w:r>
     </w:p>
-    <w:bookmarkEnd w:id="109"/>
-    <w:bookmarkStart w:id="110" w:name="troubleshooting-6"/>
+    <w:bookmarkEnd w:id="112"/>
+    <w:bookmarkStart w:id="113" w:name="troubleshooting-6"/>
     <w:p>
       <w:pPr>
         <w:pStyle w:val="Heading2"/>
@@ -16984,8 +17277,8 @@
         <w:t xml:space="preserve">see saturation detected later than expected.</w:t>
       </w:r>
     </w:p>
-    <w:bookmarkEnd w:id="110"/>
-    <w:bookmarkStart w:id="111" w:name="cleanup-6"/>
+    <w:bookmarkEnd w:id="113"/>
+    <w:bookmarkStart w:id="114" w:name="cleanup-6"/>
     <w:p>
       <w:pPr>
         <w:pStyle w:val="Heading2"/>
@@ -17260,8 +17553,8 @@
         <w:t xml:space="preserve">${NAMESPACE}</w:t>
       </w:r>
     </w:p>
-    <w:bookmarkEnd w:id="111"/>
-    <w:bookmarkStart w:id="112" w:name="config-reference"/>
+    <w:bookmarkEnd w:id="114"/>
+    <w:bookmarkStart w:id="115" w:name="config-reference"/>
     <w:p>
       <w:pPr>
         <w:pStyle w:val="Heading2"/>
@@ -17606,9 +17899,9 @@
         </w:tc>
       </w:tr>
     </w:tbl>
-    <w:bookmarkEnd w:id="112"/>
-    <w:bookmarkEnd w:id="113"/>
-    <w:bookmarkStart w:id="122" w:name="Xb6ee0d3f148df93be6818c51d392b724bf68305"/>
+    <w:bookmarkEnd w:id="115"/>
+    <w:bookmarkEnd w:id="116"/>
+    <w:bookmarkStart w:id="125" w:name="Xb6ee0d3f148df93be6818c51d392b724bf68305"/>
     <w:p>
       <w:pPr>
         <w:pStyle w:val="Heading1"/>
@@ -17668,7 +17961,7 @@
         <w:t xml:space="preserve">note instructs.</w:t>
       </w:r>
     </w:p>
-    <w:bookmarkStart w:id="114" w:name="overview-7"/>
+    <w:bookmarkStart w:id="117" w:name="overview-7"/>
     <w:p>
       <w:pPr>
         <w:pStyle w:val="Heading2"/>
@@ -17796,8 +18089,8 @@
         <w:t xml:space="preserve">vanilla Kubernetes distribution for your first Intel XPU validation pass.</w:t>
       </w:r>
     </w:p>
-    <w:bookmarkEnd w:id="114"/>
-    <w:bookmarkStart w:id="115" w:name="prerequisites-7"/>
+    <w:bookmarkEnd w:id="117"/>
+    <w:bookmarkStart w:id="118" w:name="prerequisites-7"/>
     <w:p>
       <w:pPr>
         <w:pStyle w:val="Heading2"/>
@@ -17830,8 +18123,8 @@
         <w:t xml:space="preserve">No additional cluster prerequisites beyond Chapter 0.</w:t>
       </w:r>
     </w:p>
-    <w:bookmarkEnd w:id="115"/>
-    <w:bookmarkStart w:id="116" w:name="deployment-steps-7"/>
+    <w:bookmarkEnd w:id="118"/>
+    <w:bookmarkStart w:id="119" w:name="deployment-steps-7"/>
     <w:p>
       <w:pPr>
         <w:pStyle w:val="Heading2"/>
@@ -18607,8 +18900,8 @@
         <w:t xml:space="preserve">/guides/optimized-baseline/modelserver/xpu/vllm/</w:t>
       </w:r>
     </w:p>
-    <w:bookmarkEnd w:id="116"/>
-    <w:bookmarkStart w:id="117" w:name="verification-7"/>
+    <w:bookmarkEnd w:id="119"/>
+    <w:bookmarkStart w:id="120" w:name="verification-7"/>
     <w:p>
       <w:pPr>
         <w:pStyle w:val="Heading2"/>
@@ -18674,8 +18967,8 @@
         <w:t xml:space="preserve">errors.</w:t>
       </w:r>
     </w:p>
-    <w:bookmarkEnd w:id="117"/>
-    <w:bookmarkStart w:id="118" w:name="inference-test-7"/>
+    <w:bookmarkEnd w:id="120"/>
+    <w:bookmarkStart w:id="121" w:name="inference-test-7"/>
     <w:p>
       <w:pPr>
         <w:pStyle w:val="Heading2"/>
@@ -19390,8 +19683,8 @@
         <w:t xml:space="preserve">rather than routed to a guaranteed miss.</w:t>
       </w:r>
     </w:p>
-    <w:bookmarkEnd w:id="118"/>
-    <w:bookmarkStart w:id="119" w:name="troubleshooting-7"/>
+    <w:bookmarkEnd w:id="121"/>
+    <w:bookmarkStart w:id="122" w:name="troubleshooting-7"/>
     <w:p>
       <w:pPr>
         <w:pStyle w:val="Heading2"/>
@@ -19526,8 +19819,8 @@
         <w:t xml:space="preserve">you hit sidecar runtime issues.</w:t>
       </w:r>
     </w:p>
-    <w:bookmarkEnd w:id="119"/>
-    <w:bookmarkStart w:id="120" w:name="cleanup-7"/>
+    <w:bookmarkEnd w:id="122"/>
+    <w:bookmarkStart w:id="123" w:name="cleanup-7"/>
     <w:p>
       <w:pPr>
         <w:pStyle w:val="Heading2"/>
@@ -19667,8 +19960,8 @@
         <w:t xml:space="preserve">${NAMESPACE}</w:t>
       </w:r>
     </w:p>
-    <w:bookmarkEnd w:id="120"/>
-    <w:bookmarkStart w:id="121" w:name="config-reference-1"/>
+    <w:bookmarkEnd w:id="123"/>
+    <w:bookmarkStart w:id="124" w:name="config-reference-1"/>
     <w:p>
       <w:pPr>
         <w:pStyle w:val="Heading2"/>
@@ -20000,9 +20293,9 @@
         </w:tc>
       </w:tr>
     </w:tbl>
-    <w:bookmarkEnd w:id="121"/>
-    <w:bookmarkEnd w:id="122"/>
-    <w:bookmarkStart w:id="132" w:name="workload-autoscaling-in-progress"/>
+    <w:bookmarkEnd w:id="124"/>
+    <w:bookmarkEnd w:id="125"/>
+    <w:bookmarkStart w:id="135" w:name="workload-autoscaling-in-progress"/>
     <w:p>
       <w:pPr>
         <w:pStyle w:val="Heading1"/>
@@ -20038,7 +20331,7 @@
         <w:t xml:space="preserve">Baseline overlay); no accelerator-specific autoscaling logic exists.</w:t>
       </w:r>
     </w:p>
-    <w:bookmarkStart w:id="123" w:name="overview-8"/>
+    <w:bookmarkStart w:id="126" w:name="overview-8"/>
     <w:p>
       <w:pPr>
         <w:pStyle w:val="Heading2"/>
@@ -20405,8 +20698,8 @@
         <w:t xml:space="preserve">external metric directly, without KEDA.</w:t>
       </w:r>
     </w:p>
-    <w:bookmarkEnd w:id="123"/>
-    <w:bookmarkStart w:id="125" w:name="prerequisites-8"/>
+    <w:bookmarkEnd w:id="126"/>
+    <w:bookmarkStart w:id="128" w:name="prerequisites-8"/>
     <w:p>
       <w:pPr>
         <w:pStyle w:val="Heading2"/>
@@ -20479,7 +20772,7 @@
       <w:r>
         <w:t xml:space="preserve"> </w:t>
       </w:r>
-      <w:hyperlink r:id="rId124">
+      <w:hyperlink r:id="rId127">
         <w:r>
           <w:rPr>
             <w:rStyle w:val="Hyperlink"/>
@@ -20562,8 +20855,8 @@
         <w:t xml:space="preserve">already being scraped.</w:t>
       </w:r>
     </w:p>
-    <w:bookmarkEnd w:id="125"/>
-    <w:bookmarkStart w:id="126" w:name="deployment-steps-keda-epp-metrics-path"/>
+    <w:bookmarkEnd w:id="128"/>
+    <w:bookmarkStart w:id="129" w:name="deployment-steps-keda-epp-metrics-path"/>
     <w:p>
       <w:pPr>
         <w:pStyle w:val="Heading2"/>
@@ -21169,8 +21462,8 @@
         <w:t xml:space="preserve">accelerator types and want WVA to prefer the cheaper variant automatically.</w:t>
       </w:r>
     </w:p>
-    <w:bookmarkEnd w:id="126"/>
-    <w:bookmarkStart w:id="127" w:name="verification-8"/>
+    <w:bookmarkEnd w:id="129"/>
+    <w:bookmarkStart w:id="130" w:name="verification-8"/>
     <w:p>
       <w:pPr>
         <w:pStyle w:val="Heading2"/>
@@ -21428,8 +21721,8 @@
         <w:t xml:space="preserve">sum(llm_d_epp_flow_control_queue_size{namespace="llm-d-optimized-baseline",service="optimized-baseline-epp",model_name="Qwen/Qwen3-32B"})</w:t>
       </w:r>
     </w:p>
-    <w:bookmarkEnd w:id="127"/>
-    <w:bookmarkStart w:id="128" w:name="inference-test-8"/>
+    <w:bookmarkEnd w:id="130"/>
+    <w:bookmarkStart w:id="131" w:name="inference-test-8"/>
     <w:p>
       <w:pPr>
         <w:pStyle w:val="Heading2"/>
@@ -21484,8 +21777,8 @@
         <w:t xml:space="preserve">subsides.</w:t>
       </w:r>
     </w:p>
-    <w:bookmarkEnd w:id="128"/>
-    <w:bookmarkStart w:id="129" w:name="troubleshooting-8"/>
+    <w:bookmarkEnd w:id="131"/>
+    <w:bookmarkStart w:id="132" w:name="troubleshooting-8"/>
     <w:p>
       <w:pPr>
         <w:pStyle w:val="Heading2"/>
@@ -21609,8 +21902,8 @@
         <w:t xml:space="preserve">check certificate/auth configuration first.</w:t>
       </w:r>
     </w:p>
-    <w:bookmarkEnd w:id="129"/>
-    <w:bookmarkStart w:id="130" w:name="cleanup-8"/>
+    <w:bookmarkEnd w:id="132"/>
+    <w:bookmarkStart w:id="133" w:name="cleanup-8"/>
     <w:p>
       <w:pPr>
         <w:pStyle w:val="Heading2"/>
@@ -21864,8 +22157,8 @@
         <w:t xml:space="preserve">${ROUTER_CHART_VERSION}</w:t>
       </w:r>
     </w:p>
-    <w:bookmarkEnd w:id="130"/>
-    <w:bookmarkStart w:id="131" w:name="config-reference-2"/>
+    <w:bookmarkEnd w:id="133"/>
+    <w:bookmarkStart w:id="134" w:name="config-reference-2"/>
     <w:p>
       <w:pPr>
         <w:pStyle w:val="Heading2"/>
@@ -22167,9 +22460,9 @@
         </w:tc>
       </w:tr>
     </w:tbl>
-    <w:bookmarkEnd w:id="131"/>
-    <w:bookmarkEnd w:id="132"/>
-    <w:bookmarkStart w:id="144" w:name="rollouts-in-progress"/>
+    <w:bookmarkEnd w:id="134"/>
+    <w:bookmarkEnd w:id="135"/>
+    <w:bookmarkStart w:id="147" w:name="rollouts-in-progress"/>
     <w:p>
       <w:pPr>
         <w:pStyle w:val="Heading1"/>
@@ -22319,7 +22612,7 @@
         <w:t xml:space="preserve">path.</w:t>
       </w:r>
     </w:p>
-    <w:bookmarkStart w:id="133" w:name="overview-9"/>
+    <w:bookmarkStart w:id="136" w:name="overview-9"/>
     <w:p>
       <w:pPr>
         <w:pStyle w:val="Heading2"/>
@@ -22699,8 +22992,8 @@
         <w:t xml:space="preserve">incrementally (e.g. 1% → 10% → 50% → 100% traffic shift) rather than a hard cutover.</w:t>
       </w:r>
     </w:p>
-    <w:bookmarkEnd w:id="133"/>
-    <w:bookmarkStart w:id="134" w:name="prerequisites-9"/>
+    <w:bookmarkEnd w:id="136"/>
+    <w:bookmarkStart w:id="137" w:name="prerequisites-9"/>
     <w:p>
       <w:pPr>
         <w:pStyle w:val="Heading2"/>
@@ -22778,8 +23071,8 @@
         <w:t xml:space="preserve">; Blue-Green does not work in standalone mode.</w:t>
       </w:r>
     </w:p>
-    <w:bookmarkEnd w:id="134"/>
-    <w:bookmarkStart w:id="138" w:name="deployment-steps-8"/>
+    <w:bookmarkEnd w:id="137"/>
+    <w:bookmarkStart w:id="141" w:name="deployment-steps-8"/>
     <w:p>
       <w:pPr>
         <w:pStyle w:val="Heading2"/>
@@ -22788,7 +23081,7 @@
         <w:t xml:space="preserve">Deployment Steps</w:t>
       </w:r>
     </w:p>
-    <w:bookmarkStart w:id="135" w:name="rolling-update"/>
+    <w:bookmarkStart w:id="138" w:name="rolling-update"/>
     <w:p>
       <w:pPr>
         <w:pStyle w:val="Heading3"/>
@@ -22844,8 +23137,8 @@
         <w:t xml:space="preserve">.</w:t>
       </w:r>
     </w:p>
-    <w:bookmarkEnd w:id="135"/>
-    <w:bookmarkStart w:id="136" w:name="X9905812a1bdc1d45a9d3c68d3d519fcd084d625"/>
+    <w:bookmarkEnd w:id="138"/>
+    <w:bookmarkStart w:id="139" w:name="X9905812a1bdc1d45a9d3c68d3d519fcd084d625"/>
     <w:p>
       <w:pPr>
         <w:pStyle w:val="Heading3"/>
@@ -23780,8 +24073,8 @@
         <w:t xml:space="preserve">weights back.</w:t>
       </w:r>
     </w:p>
-    <w:bookmarkEnd w:id="136"/>
-    <w:bookmarkStart w:id="137" w:name="lora-adapter-rollout"/>
+    <w:bookmarkEnd w:id="139"/>
+    <w:bookmarkStart w:id="140" w:name="lora-adapter-rollout"/>
     <w:p>
       <w:pPr>
         <w:pStyle w:val="Heading3"/>
@@ -23840,9 +24133,9 @@
         <w:t xml:space="preserve">agnostic; identical on Intel XPU.</w:t>
       </w:r>
     </w:p>
-    <w:bookmarkEnd w:id="137"/>
-    <w:bookmarkEnd w:id="138"/>
-    <w:bookmarkStart w:id="139" w:name="verification-9"/>
+    <w:bookmarkEnd w:id="140"/>
+    <w:bookmarkEnd w:id="141"/>
+    <w:bookmarkStart w:id="142" w:name="verification-9"/>
     <w:p>
       <w:pPr>
         <w:pStyle w:val="Heading2"/>
@@ -24203,8 +24496,8 @@
         <w:t xml:space="preserve">Cross-check which pool actually served each request via response headers or per-pool EPP logs.</w:t>
       </w:r>
     </w:p>
-    <w:bookmarkEnd w:id="139"/>
-    <w:bookmarkStart w:id="140" w:name="inference-test-9"/>
+    <w:bookmarkEnd w:id="142"/>
+    <w:bookmarkStart w:id="143" w:name="inference-test-9"/>
     <w:p>
       <w:pPr>
         <w:pStyle w:val="Heading2"/>
@@ -24353,8 +24646,8 @@
         <w:t xml:space="preserve">}'</w:t>
       </w:r>
     </w:p>
-    <w:bookmarkEnd w:id="140"/>
-    <w:bookmarkStart w:id="141" w:name="troubleshooting-9"/>
+    <w:bookmarkEnd w:id="143"/>
+    <w:bookmarkStart w:id="144" w:name="troubleshooting-9"/>
     <w:p>
       <w:pPr>
         <w:pStyle w:val="Heading2"/>
@@ -24537,8 +24830,8 @@
         <w:t xml:space="preserve">).</w:t>
       </w:r>
     </w:p>
-    <w:bookmarkEnd w:id="141"/>
-    <w:bookmarkStart w:id="142" w:name="cleanup-9"/>
+    <w:bookmarkEnd w:id="144"/>
+    <w:bookmarkStart w:id="145" w:name="cleanup-9"/>
     <w:p>
       <w:pPr>
         <w:pStyle w:val="Heading2"/>
@@ -24591,8 +24884,8 @@
         <w:t xml:space="preserve">${NAMESPACE}</w:t>
       </w:r>
     </w:p>
-    <w:bookmarkEnd w:id="142"/>
-    <w:bookmarkStart w:id="143" w:name="config-reference-3"/>
+    <w:bookmarkEnd w:id="145"/>
+    <w:bookmarkStart w:id="146" w:name="config-reference-3"/>
     <w:p>
       <w:pPr>
         <w:pStyle w:val="Heading2"/>
@@ -24867,9 +25160,9 @@
         </w:tc>
       </w:tr>
     </w:tbl>
-    <w:bookmarkEnd w:id="143"/>
-    <w:bookmarkEnd w:id="144"/>
-    <w:bookmarkStart w:id="153" w:name="agentic-serving-in-progress"/>
+    <w:bookmarkEnd w:id="146"/>
+    <w:bookmarkEnd w:id="147"/>
+    <w:bookmarkStart w:id="156" w:name="agentic-serving-in-progress"/>
     <w:p>
       <w:pPr>
         <w:pStyle w:val="Heading1"/>
@@ -24932,7 +25225,7 @@
         <w:t xml:space="preserve">compose the same building blocks manually as described below.</w:t>
       </w:r>
     </w:p>
-    <w:bookmarkStart w:id="145" w:name="overview-10"/>
+    <w:bookmarkStart w:id="148" w:name="overview-10"/>
     <w:p>
       <w:pPr>
         <w:pStyle w:val="Heading2"/>
@@ -25354,8 +25647,8 @@
         <w:t xml:space="preserve">— routing + CPU KV-offloading on 8× Google TPU v7x (2x2x1).</w:t>
       </w:r>
     </w:p>
-    <w:bookmarkEnd w:id="145"/>
-    <w:bookmarkStart w:id="146" w:name="prerequisites-10"/>
+    <w:bookmarkEnd w:id="148"/>
+    <w:bookmarkStart w:id="149" w:name="prerequisites-10"/>
     <w:p>
       <w:pPr>
         <w:pStyle w:val="Heading2"/>
@@ -25394,8 +25687,8 @@
         <w:t xml:space="preserve">since Agentic Serving is additive on top of them rather than a replacement.</w:t>
       </w:r>
     </w:p>
-    <w:bookmarkEnd w:id="146"/>
-    <w:bookmarkStart w:id="147" w:name="Xc0c6465306d5f3c84e88e06731bada5b89e700e"/>
+    <w:bookmarkEnd w:id="149"/>
+    <w:bookmarkStart w:id="150" w:name="Xc0c6465306d5f3c84e88e06731bada5b89e700e"/>
     <w:p>
       <w:pPr>
         <w:pStyle w:val="Heading2"/>
@@ -25738,8 +26031,8 @@
         <w:t xml:space="preserve">this as a starting point requiring your own end-to-end validation, not a tested recipe.</w:t>
       </w:r>
     </w:p>
-    <w:bookmarkEnd w:id="147"/>
-    <w:bookmarkStart w:id="148" w:name="verification-10"/>
+    <w:bookmarkEnd w:id="150"/>
+    <w:bookmarkStart w:id="151" w:name="verification-10"/>
     <w:p>
       <w:pPr>
         <w:pStyle w:val="Heading2"/>
@@ -25762,8 +26055,8 @@
         <w:t xml:space="preserve">prefix-cache offload connector health) — see Chapters 1.2 and 1.4.</w:t>
       </w:r>
     </w:p>
-    <w:bookmarkEnd w:id="148"/>
-    <w:bookmarkStart w:id="149" w:name="inference-test-10"/>
+    <w:bookmarkEnd w:id="151"/>
+    <w:bookmarkStart w:id="152" w:name="inference-test-10"/>
     <w:p>
       <w:pPr>
         <w:pStyle w:val="Heading2"/>
@@ -25944,8 +26237,8 @@
         <w:t xml:space="preserve">      ], "max_tokens": 500}'</w:t>
       </w:r>
     </w:p>
-    <w:bookmarkEnd w:id="149"/>
-    <w:bookmarkStart w:id="150" w:name="troubleshooting-10"/>
+    <w:bookmarkEnd w:id="152"/>
+    <w:bookmarkStart w:id="153" w:name="troubleshooting-10"/>
     <w:p>
       <w:pPr>
         <w:pStyle w:val="Heading2"/>
@@ -26055,8 +26348,8 @@
         <w:t xml:space="preserve">cluster’s Pod Security Admission policy.</w:t>
       </w:r>
     </w:p>
-    <w:bookmarkEnd w:id="150"/>
-    <w:bookmarkStart w:id="151" w:name="cleanup-10"/>
+    <w:bookmarkEnd w:id="153"/>
+    <w:bookmarkStart w:id="154" w:name="cleanup-10"/>
     <w:p>
       <w:pPr>
         <w:pStyle w:val="Heading2"/>
@@ -26109,8 +26402,8 @@
         <w:t xml:space="preserve"># then clean up each composed guide's model-server overlay per its own Chapter 1 cleanup steps</w:t>
       </w:r>
     </w:p>
-    <w:bookmarkEnd w:id="151"/>
-    <w:bookmarkStart w:id="152" w:name="config-reference-4"/>
+    <w:bookmarkEnd w:id="154"/>
+    <w:bookmarkStart w:id="155" w:name="config-reference-4"/>
     <w:p>
       <w:pPr>
         <w:pStyle w:val="Heading2"/>
@@ -26343,9 +26636,9 @@
         </w:tc>
       </w:tr>
     </w:tbl>
-    <w:bookmarkEnd w:id="152"/>
-    <w:bookmarkEnd w:id="153"/>
-    <w:bookmarkStart w:id="163" w:name="multi-model-routing-in-progress"/>
+    <w:bookmarkEnd w:id="155"/>
+    <w:bookmarkEnd w:id="156"/>
+    <w:bookmarkStart w:id="166" w:name="multi-model-routing-in-progress"/>
     <w:p>
       <w:pPr>
         <w:pStyle w:val="Heading1"/>
@@ -26396,7 +26689,7 @@
         <w:t xml:space="preserve">can independently be an Intel XPU deployment.</w:t>
       </w:r>
     </w:p>
-    <w:bookmarkStart w:id="154" w:name="overview-11"/>
+    <w:bookmarkStart w:id="157" w:name="overview-11"/>
     <w:p>
       <w:pPr>
         <w:pStyle w:val="Heading2"/>
@@ -26496,8 +26789,8 @@
         <w:t xml:space="preserve">instead.</w:t>
       </w:r>
     </w:p>
-    <w:bookmarkEnd w:id="154"/>
-    <w:bookmarkStart w:id="155" w:name="prerequisites-11"/>
+    <w:bookmarkEnd w:id="157"/>
+    <w:bookmarkStart w:id="158" w:name="prerequisites-11"/>
     <w:p>
       <w:pPr>
         <w:pStyle w:val="Heading2"/>
@@ -26649,8 +26942,8 @@
         <w:t xml:space="preserve">.</w:t>
       </w:r>
     </w:p>
-    <w:bookmarkEnd w:id="155"/>
-    <w:bookmarkStart w:id="156" w:name="deployment-steps-9"/>
+    <w:bookmarkEnd w:id="158"/>
+    <w:bookmarkStart w:id="159" w:name="deployment-steps-9"/>
     <w:p>
       <w:pPr>
         <w:pStyle w:val="Heading2"/>
@@ -27354,8 +27647,8 @@
         <w:t xml:space="preserve">/guides/multi-model-routing/manifests/httproutes.yaml</w:t>
       </w:r>
     </w:p>
-    <w:bookmarkEnd w:id="156"/>
-    <w:bookmarkStart w:id="157" w:name="verification-11"/>
+    <w:bookmarkEnd w:id="159"/>
+    <w:bookmarkStart w:id="160" w:name="verification-11"/>
     <w:p>
       <w:pPr>
         <w:pStyle w:val="Heading2"/>
@@ -27582,8 +27875,8 @@
         <w:t xml:space="preserve">20</w:t>
       </w:r>
     </w:p>
-    <w:bookmarkEnd w:id="157"/>
-    <w:bookmarkStart w:id="159" w:name="inference-test-11"/>
+    <w:bookmarkEnd w:id="160"/>
+    <w:bookmarkStart w:id="162" w:name="inference-test-11"/>
     <w:p>
       <w:pPr>
         <w:pStyle w:val="Heading2"/>
@@ -27957,7 +28250,7 @@
         <w:t xml:space="preserve">'{"model": "deepseek/DeepSeek-r1", "messages": [{"role": "user", "content": "Solve this problem"}]}'</w:t>
       </w:r>
     </w:p>
-    <w:bookmarkStart w:id="158" w:name="advanced-lora-adapter-routing"/>
+    <w:bookmarkStart w:id="161" w:name="advanced-lora-adapter-routing"/>
     <w:p>
       <w:pPr>
         <w:pStyle w:val="Heading3"/>
@@ -28320,9 +28613,9 @@
         <w:t xml:space="preserve">s/ConfigMaps.</w:t>
       </w:r>
     </w:p>
-    <w:bookmarkEnd w:id="158"/>
-    <w:bookmarkEnd w:id="159"/>
-    <w:bookmarkStart w:id="160" w:name="troubleshooting-11"/>
+    <w:bookmarkEnd w:id="161"/>
+    <w:bookmarkEnd w:id="162"/>
+    <w:bookmarkStart w:id="163" w:name="troubleshooting-11"/>
     <w:p>
       <w:pPr>
         <w:pStyle w:val="Heading2"/>
@@ -28434,8 +28727,8 @@
         <w:t xml:space="preserve">would out-compete this guide’s header-matched HTTPRoutes.</w:t>
       </w:r>
     </w:p>
-    <w:bookmarkEnd w:id="160"/>
-    <w:bookmarkStart w:id="161" w:name="cleanup-11"/>
+    <w:bookmarkEnd w:id="163"/>
+    <w:bookmarkStart w:id="164" w:name="cleanup-11"/>
     <w:p>
       <w:pPr>
         <w:pStyle w:val="Heading2"/>
@@ -28653,8 +28946,8 @@
         <w:t xml:space="preserve">${NAMESPACE}</w:t>
       </w:r>
     </w:p>
-    <w:bookmarkEnd w:id="161"/>
-    <w:bookmarkStart w:id="162" w:name="config-reference-5"/>
+    <w:bookmarkEnd w:id="164"/>
+    <w:bookmarkStart w:id="165" w:name="config-reference-5"/>
     <w:p>
       <w:pPr>
         <w:pStyle w:val="Heading2"/>
@@ -28944,9 +29237,9 @@
         </w:tc>
       </w:tr>
     </w:tbl>
-    <w:bookmarkEnd w:id="162"/>
-    <w:bookmarkEnd w:id="163"/>
-    <w:bookmarkStart w:id="173" w:name="asynchronous-processing-in-progress"/>
+    <w:bookmarkEnd w:id="165"/>
+    <w:bookmarkEnd w:id="166"/>
+    <w:bookmarkStart w:id="176" w:name="asynchronous-processing-in-progress"/>
     <w:p>
       <w:pPr>
         <w:pStyle w:val="Heading1"/>
@@ -28982,7 +29275,7 @@
         <w:t xml:space="preserve">server can be any Optimized Baseline overlay, including Intel XPU.</w:t>
       </w:r>
     </w:p>
-    <w:bookmarkStart w:id="165" w:name="overview-12"/>
+    <w:bookmarkStart w:id="168" w:name="overview-12"/>
     <w:p>
       <w:pPr>
         <w:pStyle w:val="Heading2"/>
@@ -29001,7 +29294,7 @@
       <w:r>
         <w:t xml:space="preserve"> </w:t>
       </w:r>
-      <w:hyperlink r:id="rId164">
+      <w:hyperlink r:id="rId167">
         <w:r>
           <w:rPr>
             <w:rStyle w:val="Hyperlink"/>
@@ -29122,8 +29415,8 @@
         <w:t xml:space="preserve">) — high-performance, persisted, prioritized queue.</w:t>
       </w:r>
     </w:p>
-    <w:bookmarkEnd w:id="165"/>
-    <w:bookmarkStart w:id="166" w:name="prerequisites-12"/>
+    <w:bookmarkEnd w:id="168"/>
+    <w:bookmarkStart w:id="169" w:name="prerequisites-12"/>
     <w:p>
       <w:pPr>
         <w:pStyle w:val="Heading2"/>
@@ -29228,8 +29521,8 @@
         <w:t xml:space="preserve">requests to — Async Processor is additive, not a replacement for the model-serving stack.</w:t>
       </w:r>
     </w:p>
-    <w:bookmarkEnd w:id="166"/>
-    <w:bookmarkStart w:id="167" w:name="deployment-steps-10"/>
+    <w:bookmarkEnd w:id="169"/>
+    <w:bookmarkStart w:id="170" w:name="deployment-steps-10"/>
     <w:p>
       <w:pPr>
         <w:pStyle w:val="Heading2"/>
@@ -29846,8 +30139,8 @@
         <w:t xml:space="preserve">${ASYNC_VERSION}</w:t>
       </w:r>
     </w:p>
-    <w:bookmarkEnd w:id="167"/>
-    <w:bookmarkStart w:id="168" w:name="verification-12"/>
+    <w:bookmarkEnd w:id="170"/>
+    <w:bookmarkStart w:id="171" w:name="verification-12"/>
     <w:p>
       <w:pPr>
         <w:pStyle w:val="Heading2"/>
@@ -29960,8 +30253,8 @@
         <w:t xml:space="preserve">50</w:t>
       </w:r>
     </w:p>
-    <w:bookmarkEnd w:id="168"/>
-    <w:bookmarkStart w:id="169" w:name="inference-test-12"/>
+    <w:bookmarkEnd w:id="171"/>
+    <w:bookmarkStart w:id="172" w:name="inference-test-12"/>
     <w:p>
       <w:pPr>
         <w:pStyle w:val="Heading2"/>
@@ -30064,8 +30357,8 @@
         <w:t xml:space="preserve">XPU-backed Optimized Baseline endpoint and received a response.</w:t>
       </w:r>
     </w:p>
-    <w:bookmarkEnd w:id="169"/>
-    <w:bookmarkStart w:id="170" w:name="troubleshooting-12"/>
+    <w:bookmarkEnd w:id="172"/>
+    <w:bookmarkStart w:id="173" w:name="troubleshooting-12"/>
     <w:p>
       <w:pPr>
         <w:pStyle w:val="Heading2"/>
@@ -30143,8 +30436,8 @@
         <w:t xml:space="preserve">GCP Pub/Sub requires GCP-side IAM/topic setup not covered by the llm-d chart itself.</w:t>
       </w:r>
     </w:p>
-    <w:bookmarkEnd w:id="170"/>
-    <w:bookmarkStart w:id="171" w:name="cleanup-12"/>
+    <w:bookmarkEnd w:id="173"/>
+    <w:bookmarkStart w:id="174" w:name="cleanup-12"/>
     <w:p>
       <w:pPr>
         <w:pStyle w:val="Heading2"/>
@@ -30188,8 +30481,8 @@
         <w:t xml:space="preserve">${NAMESPACE}</w:t>
       </w:r>
     </w:p>
-    <w:bookmarkEnd w:id="171"/>
-    <w:bookmarkStart w:id="172" w:name="config-reference-6"/>
+    <w:bookmarkEnd w:id="174"/>
+    <w:bookmarkStart w:id="175" w:name="config-reference-6"/>
     <w:p>
       <w:pPr>
         <w:pStyle w:val="Heading2"/>
@@ -30382,9 +30675,9 @@
         </w:tc>
       </w:tr>
     </w:tbl>
-    <w:bookmarkEnd w:id="172"/>
-    <w:bookmarkEnd w:id="173"/>
-    <w:bookmarkStart w:id="185" w:name="batch-gateway-in-progress"/>
+    <w:bookmarkEnd w:id="175"/>
+    <w:bookmarkEnd w:id="176"/>
+    <w:bookmarkStart w:id="188" w:name="batch-gateway-in-progress"/>
     <w:p>
       <w:pPr>
         <w:pStyle w:val="Heading1"/>
@@ -30420,7 +30713,7 @@
         <w:t xml:space="preserve">any Optimized Baseline overlay, including Intel XPU.</w:t>
       </w:r>
     </w:p>
-    <w:bookmarkStart w:id="175" w:name="overview-13"/>
+    <w:bookmarkStart w:id="178" w:name="overview-13"/>
     <w:p>
       <w:pPr>
         <w:pStyle w:val="Heading2"/>
@@ -30433,7 +30726,7 @@
       <w:pPr>
         <w:pStyle w:val="FirstParagraph"/>
       </w:pPr>
-      <w:hyperlink r:id="rId174">
+      <w:hyperlink r:id="rId177">
         <w:r>
           <w:rPr>
             <w:rStyle w:val="Hyperlink"/>
@@ -30567,8 +30860,8 @@
         <w:t xml:space="preserve">(cleans up expired jobs/files).</w:t>
       </w:r>
     </w:p>
-    <w:bookmarkEnd w:id="175"/>
-    <w:bookmarkStart w:id="176" w:name="prerequisites-13"/>
+    <w:bookmarkEnd w:id="178"/>
+    <w:bookmarkStart w:id="179" w:name="prerequisites-13"/>
     <w:p>
       <w:pPr>
         <w:pStyle w:val="Heading2"/>
@@ -30690,8 +30983,8 @@
         <w:t xml:space="preserve">for batch input/output file storage.</w:t>
       </w:r>
     </w:p>
-    <w:bookmarkEnd w:id="176"/>
-    <w:bookmarkStart w:id="178" w:name="deployment-steps-11"/>
+    <w:bookmarkEnd w:id="179"/>
+    <w:bookmarkStart w:id="181" w:name="deployment-steps-11"/>
     <w:p>
       <w:pPr>
         <w:pStyle w:val="Heading2"/>
@@ -31201,7 +31494,7 @@
       <w:r>
         <w:t xml:space="preserve"> </w:t>
       </w:r>
-      <w:hyperlink r:id="rId177">
+      <w:hyperlink r:id="rId180">
         <w:r>
           <w:rPr>
             <w:rStyle w:val="Hyperlink"/>
@@ -31213,8 +31506,8 @@
         <w:t xml:space="preserve">.</w:t>
       </w:r>
     </w:p>
-    <w:bookmarkEnd w:id="178"/>
-    <w:bookmarkStart w:id="179" w:name="verification-13"/>
+    <w:bookmarkEnd w:id="181"/>
+    <w:bookmarkStart w:id="182" w:name="verification-13"/>
     <w:p>
       <w:pPr>
         <w:pStyle w:val="Heading2"/>
@@ -31422,8 +31715,8 @@
         <w:t xml:space="preserve">.</w:t>
       </w:r>
     </w:p>
-    <w:bookmarkEnd w:id="179"/>
-    <w:bookmarkStart w:id="180" w:name="inference-test-13"/>
+    <w:bookmarkEnd w:id="182"/>
+    <w:bookmarkStart w:id="183" w:name="inference-test-13"/>
     <w:p>
       <w:pPr>
         <w:pStyle w:val="Heading2"/>
@@ -31992,8 +32285,8 @@
         <w:t xml:space="preserve"> results.jsonl</w:t>
       </w:r>
     </w:p>
-    <w:bookmarkEnd w:id="180"/>
-    <w:bookmarkStart w:id="182" w:name="troubleshooting-13"/>
+    <w:bookmarkEnd w:id="183"/>
+    <w:bookmarkStart w:id="185" w:name="troubleshooting-13"/>
     <w:p>
       <w:pPr>
         <w:pStyle w:val="Heading2"/>
@@ -32058,7 +32351,7 @@
       <w:r>
         <w:t xml:space="preserve"> </w:t>
       </w:r>
-      <w:hyperlink r:id="rId181">
+      <w:hyperlink r:id="rId184">
         <w:r>
           <w:rPr>
             <w:rStyle w:val="Hyperlink"/>
@@ -32073,8 +32366,8 @@
         <w:t xml:space="preserve">(Istio + Kuadrant + cert-manager) rather than the quick-start Helm install above.</w:t>
       </w:r>
     </w:p>
-    <w:bookmarkEnd w:id="182"/>
-    <w:bookmarkStart w:id="183" w:name="cleanup-13"/>
+    <w:bookmarkEnd w:id="185"/>
+    <w:bookmarkStart w:id="186" w:name="cleanup-13"/>
     <w:p>
       <w:pPr>
         <w:pStyle w:val="Heading2"/>
@@ -32139,8 +32432,8 @@
         <w:t xml:space="preserve">${NAMESPACE}</w:t>
       </w:r>
     </w:p>
-    <w:bookmarkEnd w:id="183"/>
-    <w:bookmarkStart w:id="184" w:name="config-reference-7"/>
+    <w:bookmarkEnd w:id="186"/>
+    <w:bookmarkStart w:id="187" w:name="config-reference-7"/>
     <w:p>
       <w:pPr>
         <w:pStyle w:val="Heading2"/>
@@ -32439,9 +32732,9 @@
         </w:tc>
       </w:tr>
     </w:tbl>
-    <w:bookmarkEnd w:id="184"/>
-    <w:bookmarkEnd w:id="185"/>
-    <w:bookmarkStart w:id="195" w:name="no-kubernetes-deployment-in-progress"/>
+    <w:bookmarkEnd w:id="187"/>
+    <w:bookmarkEnd w:id="188"/>
+    <w:bookmarkStart w:id="198" w:name="no-kubernetes-deployment-in-progress"/>
     <w:p>
       <w:pPr>
         <w:pStyle w:val="Heading1"/>
@@ -32550,7 +32843,7 @@
         <w:t xml:space="preserve">presenting an untested Intel XPU procedure as if it were upstream-supported.</w:t>
       </w:r>
     </w:p>
-    <w:bookmarkStart w:id="186" w:name="overview-14"/>
+    <w:bookmarkStart w:id="189" w:name="overview-14"/>
     <w:p>
       <w:pPr>
         <w:pStyle w:val="Heading2"/>
@@ -32678,8 +32971,8 @@
         <w:t xml:space="preserve">flag) is NVIDIA-specific.</w:t>
       </w:r>
     </w:p>
-    <w:bookmarkEnd w:id="186"/>
-    <w:bookmarkStart w:id="187" w:name="what-needs-to-change-for-intel-xpu"/>
+    <w:bookmarkEnd w:id="189"/>
+    <w:bookmarkStart w:id="190" w:name="what-needs-to-change-for-intel-xpu"/>
     <w:p>
       <w:pPr>
         <w:pStyle w:val="Heading2"/>
@@ -33061,8 +33354,8 @@
         </w:tc>
       </w:tr>
     </w:tbl>
-    <w:bookmarkEnd w:id="187"/>
-    <w:bookmarkStart w:id="188" w:name="prerequisites-14"/>
+    <w:bookmarkEnd w:id="190"/>
+    <w:bookmarkStart w:id="191" w:name="prerequisites-14"/>
     <w:p>
       <w:pPr>
         <w:pStyle w:val="Heading2"/>
@@ -33359,8 +33652,8 @@
         <w:t xml:space="preserve">Qwen/Qwen3-32B</w:t>
       </w:r>
     </w:p>
-    <w:bookmarkEnd w:id="188"/>
-    <w:bookmarkStart w:id="189" w:name="deployment-steps-12"/>
+    <w:bookmarkEnd w:id="191"/>
+    <w:bookmarkStart w:id="192" w:name="deployment-steps-12"/>
     <w:p>
       <w:pPr>
         <w:pStyle w:val="Heading2"/>
@@ -34739,8 +35032,8 @@
         <w:t xml:space="preserve"> /etc/envoy/envoy.yaml</w:t>
       </w:r>
     </w:p>
-    <w:bookmarkEnd w:id="189"/>
-    <w:bookmarkStart w:id="190" w:name="verification-14"/>
+    <w:bookmarkEnd w:id="192"/>
+    <w:bookmarkStart w:id="193" w:name="verification-14"/>
     <w:p>
       <w:pPr>
         <w:pStyle w:val="Heading2"/>
@@ -34892,8 +35185,8 @@
         <w:t xml:space="preserve">head</w:t>
       </w:r>
     </w:p>
-    <w:bookmarkEnd w:id="190"/>
-    <w:bookmarkStart w:id="191" w:name="inference-test-14"/>
+    <w:bookmarkEnd w:id="193"/>
+    <w:bookmarkStart w:id="194" w:name="inference-test-14"/>
     <w:p>
       <w:pPr>
         <w:pStyle w:val="Heading2"/>
@@ -35003,8 +35296,8 @@
         <w:t xml:space="preserve">'{"model": "Qwen/Qwen3-32B", "prompt": "How are you today?"}'</w:t>
       </w:r>
     </w:p>
-    <w:bookmarkEnd w:id="191"/>
-    <w:bookmarkStart w:id="192" w:name="troubleshooting-14"/>
+    <w:bookmarkEnd w:id="194"/>
+    <w:bookmarkStart w:id="195" w:name="troubleshooting-14"/>
     <w:p>
       <w:pPr>
         <w:pStyle w:val="Heading2"/>
@@ -35308,8 +35601,8 @@
         <w:t xml:space="preserve">a mismatched GID here is the most common first-run failure for this substitution.</w:t>
       </w:r>
     </w:p>
-    <w:bookmarkEnd w:id="192"/>
-    <w:bookmarkStart w:id="193" w:name="cleanup-14"/>
+    <w:bookmarkEnd w:id="195"/>
+    <w:bookmarkStart w:id="196" w:name="cleanup-14"/>
     <w:p>
       <w:pPr>
         <w:pStyle w:val="Heading2"/>
@@ -35374,8 +35667,8 @@
         <w:t xml:space="preserve"> /etc/epp /etc/envoy</w:t>
       </w:r>
     </w:p>
-    <w:bookmarkEnd w:id="193"/>
-    <w:bookmarkStart w:id="194" w:name="config-reference-8"/>
+    <w:bookmarkEnd w:id="196"/>
+    <w:bookmarkStart w:id="197" w:name="config-reference-8"/>
     <w:p>
       <w:pPr>
         <w:pStyle w:val="Heading2"/>
@@ -35700,9 +35993,9 @@
         </w:tc>
       </w:tr>
     </w:tbl>
-    <w:bookmarkEnd w:id="194"/>
-    <w:bookmarkEnd w:id="195"/>
-    <w:bookmarkStart w:id="199" w:name="encode-disaggregation-multimodal-na"/>
+    <w:bookmarkEnd w:id="197"/>
+    <w:bookmarkEnd w:id="198"/>
+    <w:bookmarkStart w:id="202" w:name="encode-disaggregation-multimodal-na"/>
     <w:p>
       <w:pPr>
         <w:pStyle w:val="Heading1"/>
@@ -35742,7 +36035,7 @@
         <w:t xml:space="preserve">for this guide.</w:t>
       </w:r>
     </w:p>
-    <w:bookmarkStart w:id="196" w:name="overview-15"/>
+    <w:bookmarkStart w:id="199" w:name="overview-15"/>
     <w:p>
       <w:pPr>
         <w:pStyle w:val="Heading2"/>
@@ -35918,8 +36211,8 @@
         <w:t xml:space="preserve">Disaggregation is the more advanced, encode-stage-separated sibling of that guide.</w:t>
       </w:r>
     </w:p>
-    <w:bookmarkEnd w:id="196"/>
-    <w:bookmarkStart w:id="197" w:name="Xe156d35d799b9d0916e749d040f5ed18fac8026"/>
+    <w:bookmarkEnd w:id="199"/>
+    <w:bookmarkStart w:id="200" w:name="Xe156d35d799b9d0916e749d040f5ed18fac8026"/>
     <w:p>
       <w:pPr>
         <w:pStyle w:val="Heading2"/>
@@ -36149,8 +36442,8 @@
         <w:t xml:space="preserve">overlay.</w:t>
       </w:r>
     </w:p>
-    <w:bookmarkEnd w:id="197"/>
-    <w:bookmarkStart w:id="198" w:name="config-reference-9"/>
+    <w:bookmarkEnd w:id="200"/>
+    <w:bookmarkStart w:id="201" w:name="config-reference-9"/>
     <w:p>
       <w:pPr>
         <w:pStyle w:val="Heading2"/>
@@ -36381,9 +36674,9 @@
         </w:tc>
       </w:tr>
     </w:tbl>
-    <w:bookmarkEnd w:id="198"/>
-    <w:bookmarkEnd w:id="199"/>
-    <w:bookmarkStart w:id="200" w:name="X2d750efb30eedac901941f068727611425eb0a8"/>
+    <w:bookmarkEnd w:id="201"/>
+    <w:bookmarkEnd w:id="202"/>
+    <w:bookmarkStart w:id="203" w:name="X2d750efb30eedac901941f068727611425eb0a8"/>
     <w:p>
       <w:pPr>
         <w:pStyle w:val="Heading1"/>
@@ -36761,8 +37054,8 @@
         </w:tc>
       </w:tr>
     </w:tbl>
-    <w:bookmarkEnd w:id="200"/>
-    <w:bookmarkStart w:id="201" w:name="appendix-b.-known-issues"/>
+    <w:bookmarkEnd w:id="203"/>
+    <w:bookmarkStart w:id="204" w:name="appendix-b.-known-issues"/>
     <w:p>
       <w:pPr>
         <w:pStyle w:val="Heading1"/>
@@ -36785,7 +37078,7 @@
       <w:r>
         <w:t xml:space="preserve"> </w:t>
       </w:r>
-      <w:hyperlink r:id="rId63">
+      <w:hyperlink r:id="rId67">
         <w:r>
           <w:rPr>
             <w:rStyle w:val="Hyperlink"/>
@@ -36857,7 +37150,7 @@
         <w:t xml:space="preserve">.</w:t>
       </w:r>
     </w:p>
-    <w:bookmarkEnd w:id="201"/>
+    <w:bookmarkEnd w:id="204"/>
     <w:sectPr/>
   </w:body>
 </w:document>

</xml_diff>

<commit_message>
docs(whitepaper): drop misleading Config Reference table from N/A chapter
16-encode-disaggregation.md is confirmed N/A for Intel XPU (no
modelserver/xpu/ overlay exists upstream), but still had a "Config
Reference" table listing the NVIDIA-only reference model/topology in
the same tabular format used by every other (actually deployable)
chapter's real, validated configuration. That format implies a usable
config; here it's just the upstream NVIDIA GPU defaults with nothing
Intel-XPU-specific to reference. Removed the table and replaced it
with a plain pointer to the working Intel-XPU-supported alternative
(Multimodal Serving, Chapter 1.6), matching how the dynamo
whitepaper's equivalent gap-analysis chapter (11-not-available-on-xpu.md)
avoids presenting infeasible NVIDIA-only configs as usable data.

Co-authored-by: Copilot <223556219+Copilot@users.noreply.github.com>
</commit_message>
<xml_diff>
--- a/whitepaper/llm-d-whitepaper.docx
+++ b/whitepaper/llm-d-whitepaper.docx
@@ -35959,7 +35959,7 @@
     </w:tbl>
     <w:bookmarkEnd w:id="198"/>
     <w:bookmarkEnd w:id="199"/>
-    <w:bookmarkStart w:id="203" w:name="encode-disaggregation-multimodal-na"/>
+    <w:bookmarkStart w:id="202" w:name="encode-disaggregation-multimodal-na"/>
     <w:p>
       <w:pPr>
         <w:pStyle w:val="Heading1"/>
@@ -36406,14 +36406,55 @@
         <w:t xml:space="preserve">overlay.</w:t>
       </w:r>
     </w:p>
+    <w:p>
+      <w:pPr>
+        <w:pStyle w:val="BodyText"/>
+      </w:pPr>
+      <w:r>
+        <w:t xml:space="preserve">For a working, Intel-XPU-supported alternative today, see</w:t>
+      </w:r>
+      <w:r>
+        <w:t xml:space="preserve"> </w:t>
+      </w:r>
+      <w:hyperlink r:id="rId26">
+        <w:r>
+          <w:rPr>
+            <w:rStyle w:val="Hyperlink"/>
+          </w:rPr>
+          <w:t xml:space="preserve">Multimodal Serving (Aggregated)</w:t>
+        </w:r>
+      </w:hyperlink>
+      <w:r>
+        <w:t xml:space="preserve"> </w:t>
+      </w:r>
+      <w:r>
+        <w:t xml:space="preserve">— a simpler topology with a real</w:t>
+      </w:r>
+      <w:r>
+        <w:t xml:space="preserve"> </w:t>
+      </w:r>
+      <w:r>
+        <w:rPr>
+          <w:rStyle w:val="VerbatimChar"/>
+        </w:rPr>
+        <w:t xml:space="preserve">modelserver/xpu/vllm</w:t>
+      </w:r>
+      <w:r>
+        <w:t xml:space="preserve"> </w:t>
+      </w:r>
+      <w:r>
+        <w:t xml:space="preserve">overlay.</w:t>
+      </w:r>
+    </w:p>
     <w:bookmarkEnd w:id="201"/>
-    <w:bookmarkStart w:id="202" w:name="config-reference-9"/>
-    <w:p>
-      <w:pPr>
-        <w:pStyle w:val="Heading2"/>
-      </w:pPr>
-      <w:r>
-        <w:t xml:space="preserve">Config Reference</w:t>
+    <w:bookmarkEnd w:id="202"/>
+    <w:bookmarkStart w:id="203" w:name="X2d750efb30eedac901941f068727611425eb0a8"/>
+    <w:p>
+      <w:pPr>
+        <w:pStyle w:val="Heading1"/>
+      </w:pPr>
+      <w:r>
+        <w:t xml:space="preserve">Appendix A. Environment Variable Reference</w:t>
       </w:r>
     </w:p>
     <w:tbl>
@@ -36441,7 +36482,7 @@
               <w:jc w:val="left"/>
             </w:pPr>
             <w:r>
-              <w:t xml:space="preserve">Field</w:t>
+              <w:t xml:space="preserve">Variable</w:t>
             </w:r>
           </w:p>
         </w:tc>
@@ -36453,7 +36494,7 @@
               <w:jc w:val="left"/>
             </w:pPr>
             <w:r>
-              <w:t xml:space="preserve">Value</w:t>
+              <w:t xml:space="preserve">Defined in</w:t>
             </w:r>
           </w:p>
         </w:tc>
@@ -36465,7 +36506,7 @@
               <w:jc w:val="left"/>
             </w:pPr>
             <w:r>
-              <w:t xml:space="preserve">Notes</w:t>
+              <w:t xml:space="preserve">Purpose</w:t>
             </w:r>
           </w:p>
         </w:tc>
@@ -36479,7 +36520,10 @@
               <w:jc w:val="left"/>
             </w:pPr>
             <w:r>
-              <w:t xml:space="preserve">Reference model</w:t>
+              <w:rPr>
+                <w:rStyle w:val="VerbatimChar"/>
+              </w:rPr>
+              <w:t xml:space="preserve">REPO_ROOT</w:t>
             </w:r>
           </w:p>
         </w:tc>
@@ -36494,7 +36538,7 @@
               <w:rPr>
                 <w:rStyle w:val="VerbatimChar"/>
               </w:rPr>
-              <w:t xml:space="preserve">Qwen/Qwen3-VL-32B-Instruct</w:t>
+              <w:t xml:space="preserve">guides/env.sh</w:t>
             </w:r>
           </w:p>
         </w:tc>
@@ -36503,7 +36547,11 @@
           <w:p>
             <w:pPr>
               <w:pStyle w:val="Compact"/>
+              <w:jc w:val="left"/>
             </w:pPr>
+            <w:r>
+              <w:t xml:space="preserve">Absolute path to the repo root</w:t>
+            </w:r>
           </w:p>
         </w:tc>
       </w:tr>
@@ -36516,7 +36564,10 @@
               <w:jc w:val="left"/>
             </w:pPr>
             <w:r>
-              <w:t xml:space="preserve">Topologies</w:t>
+              <w:rPr>
+                <w:rStyle w:val="VerbatimChar"/>
+              </w:rPr>
+              <w:t xml:space="preserve">GAIE_VERSION</w:t>
             </w:r>
           </w:p>
         </w:tc>
@@ -36528,7 +36579,10 @@
               <w:jc w:val="left"/>
             </w:pPr>
             <w:r>
-              <w:t xml:space="preserve">E/PD (2 encode + 8× TP2 combined prefill/decode), E/P/D (2 encode + 2× TP4 prefill + 2× TP4 decode)</w:t>
+              <w:rPr>
+                <w:rStyle w:val="VerbatimChar"/>
+              </w:rPr>
+              <w:t xml:space="preserve">guides/env.sh</w:t>
             </w:r>
           </w:p>
         </w:tc>
@@ -36537,7 +36591,11 @@
           <w:p>
             <w:pPr>
               <w:pStyle w:val="Compact"/>
+              <w:jc w:val="left"/>
             </w:pPr>
+            <w:r>
+              <w:t xml:space="preserve">Gateway API Inference Extension CRD version</w:t>
+            </w:r>
           </w:p>
         </w:tc>
       </w:tr>
@@ -36550,7 +36608,10 @@
               <w:jc w:val="left"/>
             </w:pPr>
             <w:r>
-              <w:t xml:space="preserve">Intel XPU support</w:t>
+              <w:rPr>
+                <w:rStyle w:val="VerbatimChar"/>
+              </w:rPr>
+              <w:t xml:space="preserve">ROUTER_CHART_VERSION</w:t>
             </w:r>
           </w:p>
         </w:tc>
@@ -36562,7 +36623,10 @@
               <w:jc w:val="left"/>
             </w:pPr>
             <w:r>
-              <w:t xml:space="preserve">None upstream</w:t>
+              <w:rPr>
+                <w:rStyle w:val="VerbatimChar"/>
+              </w:rPr>
+              <w:t xml:space="preserve">guides/env.sh</w:t>
             </w:r>
           </w:p>
         </w:tc>
@@ -36574,7 +36638,7 @@
               <w:jc w:val="left"/>
             </w:pPr>
             <w:r>
-              <w:t xml:space="preserve">Not applicable today</w:t>
+              <w:t xml:space="preserve">llm-d Router chart version</w:t>
             </w:r>
           </w:p>
         </w:tc>
@@ -36588,7 +36652,25 @@
               <w:jc w:val="left"/>
             </w:pPr>
             <w:r>
-              <w:t xml:space="preserve">Related, Intel-XPU-supported case</w:t>
+              <w:rPr>
+                <w:rStyle w:val="VerbatimChar"/>
+              </w:rPr>
+              <w:t xml:space="preserve">ROUTER_STANDALONE_CHART</w:t>
+            </w:r>
+            <w:r>
+              <w:t xml:space="preserve"> </w:t>
+            </w:r>
+            <w:r>
+              <w:t xml:space="preserve">/</w:t>
+            </w:r>
+            <w:r>
+              <w:t xml:space="preserve"> </w:t>
+            </w:r>
+            <w:r>
+              <w:rPr>
+                <w:rStyle w:val="VerbatimChar"/>
+              </w:rPr>
+              <w:t xml:space="preserve">ROUTER_GATEWAY_CHART</w:t>
             </w:r>
           </w:p>
         </w:tc>
@@ -36599,14 +36681,12 @@
               <w:pStyle w:val="Compact"/>
               <w:jc w:val="left"/>
             </w:pPr>
-            <w:hyperlink r:id="rId26">
-              <w:r>
-                <w:rPr>
-                  <w:rStyle w:val="Hyperlink"/>
-                </w:rPr>
-                <w:t xml:space="preserve">Multimodal Serving (Aggregated)</w:t>
-              </w:r>
-            </w:hyperlink>
+            <w:r>
+              <w:rPr>
+                <w:rStyle w:val="VerbatimChar"/>
+              </w:rPr>
+              <w:t xml:space="preserve">guides/env.sh</w:t>
+            </w:r>
           </w:p>
         </w:tc>
         <w:tc>
@@ -36617,88 +36697,7 @@
               <w:jc w:val="left"/>
             </w:pPr>
             <w:r>
-              <w:t xml:space="preserve">simpler topology, has a real</w:t>
-            </w:r>
-            <w:r>
-              <w:t xml:space="preserve"> </w:t>
-            </w:r>
-            <w:r>
-              <w:rPr>
-                <w:rStyle w:val="VerbatimChar"/>
-              </w:rPr>
-              <w:t xml:space="preserve">modelserver/xpu/vllm</w:t>
-            </w:r>
-            <w:r>
-              <w:t xml:space="preserve"> </w:t>
-            </w:r>
-            <w:r>
-              <w:t xml:space="preserve">overlay</w:t>
-            </w:r>
-          </w:p>
-        </w:tc>
-      </w:tr>
-    </w:tbl>
-    <w:bookmarkEnd w:id="202"/>
-    <w:bookmarkEnd w:id="203"/>
-    <w:bookmarkStart w:id="204" w:name="X2d750efb30eedac901941f068727611425eb0a8"/>
-    <w:p>
-      <w:pPr>
-        <w:pStyle w:val="Heading1"/>
-      </w:pPr>
-      <w:r>
-        <w:t xml:space="preserve">Appendix A. Environment Variable Reference</w:t>
-      </w:r>
-    </w:p>
-    <w:tbl>
-      <w:tblPr>
-        <w:tblStyle w:val="Table"/>
-        <w:tblW w:type="pct" w:w="5000"/>
-        <w:tblLook w:firstRow="1" w:lastRow="0" w:firstColumn="0" w:lastColumn="0" w:noHBand="0" w:noVBand="0" w:val="0020"/>
-        <w:jc w:val="start"/>
-        <w:tblLayout w:type="fixed"/>
-      </w:tblPr>
-      <w:tblGrid>
-        <w:gridCol w:w="2640"/>
-        <w:gridCol w:w="2640"/>
-        <w:gridCol w:w="2640"/>
-      </w:tblGrid>
-      <w:tr>
-        <w:trPr>
-          <w:tblHeader w:val="true"/>
-        </w:trPr>
-        <w:tc>
-          <w:tcPr/>
-          <w:p>
-            <w:pPr>
-              <w:pStyle w:val="Compact"/>
-              <w:jc w:val="left"/>
-            </w:pPr>
-            <w:r>
-              <w:t xml:space="preserve">Variable</w:t>
-            </w:r>
-          </w:p>
-        </w:tc>
-        <w:tc>
-          <w:tcPr/>
-          <w:p>
-            <w:pPr>
-              <w:pStyle w:val="Compact"/>
-              <w:jc w:val="left"/>
-            </w:pPr>
-            <w:r>
-              <w:t xml:space="preserve">Defined in</w:t>
-            </w:r>
-          </w:p>
-        </w:tc>
-        <w:tc>
-          <w:tcPr/>
-          <w:p>
-            <w:pPr>
-              <w:pStyle w:val="Compact"/>
-              <w:jc w:val="left"/>
-            </w:pPr>
-            <w:r>
-              <w:t xml:space="preserve">Purpose</w:t>
+              <w:t xml:space="preserve">Router chart OCI addresses</w:t>
             </w:r>
           </w:p>
         </w:tc>
@@ -36715,7 +36714,7 @@
               <w:rPr>
                 <w:rStyle w:val="VerbatimChar"/>
               </w:rPr>
-              <w:t xml:space="preserve">REPO_ROOT</w:t>
+              <w:t xml:space="preserve">NAMESPACE</w:t>
             </w:r>
           </w:p>
         </w:tc>
@@ -36727,10 +36726,7 @@
               <w:jc w:val="left"/>
             </w:pPr>
             <w:r>
-              <w:rPr>
-                <w:rStyle w:val="VerbatimChar"/>
-              </w:rPr>
-              <w:t xml:space="preserve">guides/env.sh</w:t>
+              <w:t xml:space="preserve">user-set</w:t>
             </w:r>
           </w:p>
         </w:tc>
@@ -36742,7 +36738,7 @@
               <w:jc w:val="left"/>
             </w:pPr>
             <w:r>
-              <w:t xml:space="preserve">Absolute path to the repo root</w:t>
+              <w:t xml:space="preserve">Target namespace</w:t>
             </w:r>
           </w:p>
         </w:tc>
@@ -36759,7 +36755,7 @@
               <w:rPr>
                 <w:rStyle w:val="VerbatimChar"/>
               </w:rPr>
-              <w:t xml:space="preserve">GAIE_VERSION</w:t>
+              <w:t xml:space="preserve">HF_TOKEN</w:t>
             </w:r>
           </w:p>
         </w:tc>
@@ -36771,10 +36767,7 @@
               <w:jc w:val="left"/>
             </w:pPr>
             <w:r>
-              <w:rPr>
-                <w:rStyle w:val="VerbatimChar"/>
-              </w:rPr>
-              <w:t xml:space="preserve">guides/env.sh</w:t>
+              <w:t xml:space="preserve">user-set</w:t>
             </w:r>
           </w:p>
         </w:tc>
@@ -36786,7 +36779,7 @@
               <w:jc w:val="left"/>
             </w:pPr>
             <w:r>
-              <w:t xml:space="preserve">Gateway API Inference Extension CRD version</w:t>
+              <w:t xml:space="preserve">HuggingFace access token</w:t>
             </w:r>
           </w:p>
         </w:tc>
@@ -36803,7 +36796,7 @@
               <w:rPr>
                 <w:rStyle w:val="VerbatimChar"/>
               </w:rPr>
-              <w:t xml:space="preserve">ROUTER_CHART_VERSION</w:t>
+              <w:t xml:space="preserve">GUIDE_NAME</w:t>
             </w:r>
           </w:p>
         </w:tc>
@@ -36815,10 +36808,7 @@
               <w:jc w:val="left"/>
             </w:pPr>
             <w:r>
-              <w:rPr>
-                <w:rStyle w:val="VerbatimChar"/>
-              </w:rPr>
-              <w:t xml:space="preserve">guides/env.sh</w:t>
+              <w:t xml:space="preserve">user-set, per case</w:t>
             </w:r>
           </w:p>
         </w:tc>
@@ -36830,196 +36820,14 @@
               <w:jc w:val="left"/>
             </w:pPr>
             <w:r>
-              <w:t xml:space="preserve">llm-d Router chart version</w:t>
-            </w:r>
-          </w:p>
-        </w:tc>
-      </w:tr>
-      <w:tr>
-        <w:tc>
-          <w:tcPr/>
-          <w:p>
-            <w:pPr>
-              <w:pStyle w:val="Compact"/>
-              <w:jc w:val="left"/>
-            </w:pPr>
-            <w:r>
-              <w:rPr>
-                <w:rStyle w:val="VerbatimChar"/>
-              </w:rPr>
-              <w:t xml:space="preserve">ROUTER_STANDALONE_CHART</w:t>
-            </w:r>
-            <w:r>
-              <w:t xml:space="preserve"> </w:t>
-            </w:r>
-            <w:r>
-              <w:t xml:space="preserve">/</w:t>
-            </w:r>
-            <w:r>
-              <w:t xml:space="preserve"> </w:t>
-            </w:r>
-            <w:r>
-              <w:rPr>
-                <w:rStyle w:val="VerbatimChar"/>
-              </w:rPr>
-              <w:t xml:space="preserve">ROUTER_GATEWAY_CHART</w:t>
-            </w:r>
-          </w:p>
-        </w:tc>
-        <w:tc>
-          <w:tcPr/>
-          <w:p>
-            <w:pPr>
-              <w:pStyle w:val="Compact"/>
-              <w:jc w:val="left"/>
-            </w:pPr>
-            <w:r>
-              <w:rPr>
-                <w:rStyle w:val="VerbatimChar"/>
-              </w:rPr>
-              <w:t xml:space="preserve">guides/env.sh</w:t>
-            </w:r>
-          </w:p>
-        </w:tc>
-        <w:tc>
-          <w:tcPr/>
-          <w:p>
-            <w:pPr>
-              <w:pStyle w:val="Compact"/>
-              <w:jc w:val="left"/>
-            </w:pPr>
-            <w:r>
-              <w:t xml:space="preserve">Router chart OCI addresses</w:t>
-            </w:r>
-          </w:p>
-        </w:tc>
-      </w:tr>
-      <w:tr>
-        <w:tc>
-          <w:tcPr/>
-          <w:p>
-            <w:pPr>
-              <w:pStyle w:val="Compact"/>
-              <w:jc w:val="left"/>
-            </w:pPr>
-            <w:r>
-              <w:rPr>
-                <w:rStyle w:val="VerbatimChar"/>
-              </w:rPr>
-              <w:t xml:space="preserve">NAMESPACE</w:t>
-            </w:r>
-          </w:p>
-        </w:tc>
-        <w:tc>
-          <w:tcPr/>
-          <w:p>
-            <w:pPr>
-              <w:pStyle w:val="Compact"/>
-              <w:jc w:val="left"/>
-            </w:pPr>
-            <w:r>
-              <w:t xml:space="preserve">user-set</w:t>
-            </w:r>
-          </w:p>
-        </w:tc>
-        <w:tc>
-          <w:tcPr/>
-          <w:p>
-            <w:pPr>
-              <w:pStyle w:val="Compact"/>
-              <w:jc w:val="left"/>
-            </w:pPr>
-            <w:r>
-              <w:t xml:space="preserve">Target namespace</w:t>
-            </w:r>
-          </w:p>
-        </w:tc>
-      </w:tr>
-      <w:tr>
-        <w:tc>
-          <w:tcPr/>
-          <w:p>
-            <w:pPr>
-              <w:pStyle w:val="Compact"/>
-              <w:jc w:val="left"/>
-            </w:pPr>
-            <w:r>
-              <w:rPr>
-                <w:rStyle w:val="VerbatimChar"/>
-              </w:rPr>
-              <w:t xml:space="preserve">HF_TOKEN</w:t>
-            </w:r>
-          </w:p>
-        </w:tc>
-        <w:tc>
-          <w:tcPr/>
-          <w:p>
-            <w:pPr>
-              <w:pStyle w:val="Compact"/>
-              <w:jc w:val="left"/>
-            </w:pPr>
-            <w:r>
-              <w:t xml:space="preserve">user-set</w:t>
-            </w:r>
-          </w:p>
-        </w:tc>
-        <w:tc>
-          <w:tcPr/>
-          <w:p>
-            <w:pPr>
-              <w:pStyle w:val="Compact"/>
-              <w:jc w:val="left"/>
-            </w:pPr>
-            <w:r>
-              <w:t xml:space="preserve">HuggingFace access token</w:t>
-            </w:r>
-          </w:p>
-        </w:tc>
-      </w:tr>
-      <w:tr>
-        <w:tc>
-          <w:tcPr/>
-          <w:p>
-            <w:pPr>
-              <w:pStyle w:val="Compact"/>
-              <w:jc w:val="left"/>
-            </w:pPr>
-            <w:r>
-              <w:rPr>
-                <w:rStyle w:val="VerbatimChar"/>
-              </w:rPr>
-              <w:t xml:space="preserve">GUIDE_NAME</w:t>
-            </w:r>
-          </w:p>
-        </w:tc>
-        <w:tc>
-          <w:tcPr/>
-          <w:p>
-            <w:pPr>
-              <w:pStyle w:val="Compact"/>
-              <w:jc w:val="left"/>
-            </w:pPr>
-            <w:r>
-              <w:t xml:space="preserve">user-set, per case</w:t>
-            </w:r>
-          </w:p>
-        </w:tc>
-        <w:tc>
-          <w:tcPr/>
-          <w:p>
-            <w:pPr>
-              <w:pStyle w:val="Compact"/>
-              <w:jc w:val="left"/>
-            </w:pPr>
-            <w:r>
               <w:t xml:space="preserve">Selects the values/overlay files for a given guide</w:t>
             </w:r>
           </w:p>
         </w:tc>
       </w:tr>
     </w:tbl>
-    <w:bookmarkEnd w:id="204"/>
-    <w:bookmarkStart w:id="205" w:name="appendix-b.-known-issues"/>
+    <w:bookmarkEnd w:id="203"/>
+    <w:bookmarkStart w:id="204" w:name="appendix-b.-known-issues"/>
     <w:p>
       <w:pPr>
         <w:pStyle w:val="Heading1"/>
@@ -37114,7 +36922,7 @@
         <w:t xml:space="preserve">.</w:t>
       </w:r>
     </w:p>
-    <w:bookmarkEnd w:id="205"/>
+    <w:bookmarkEnd w:id="204"/>
     <w:sectPr/>
   </w:body>
 </w:document>

</xml_diff>

<commit_message>
docs(whitepaper): remove self-referential authoring rationale from 15's status line
The Status paragraph in 15-no-kubernetes-deployment.md ended with "This
chapter documents the guide as-is and explains exactly what to
substitute for Intel XPU, rather than presenting an untested Intel XPU
procedure as if it were upstream-supported" — this describes why/how
the whitepaper's authors chose to write the chapter, not a fact about
the deployment itself, matching the same internal-notes-tone pattern
removed elsewhere this session (e.g. "flagged for follow-up rather
than asserted", "written against the current path"). Rewrote to state
only the fact: Intel XPU support here is a manual substitution, not
provided or tested upstream.

Co-authored-by: Copilot <223556219+Copilot@users.noreply.github.com>
</commit_message>
<xml_diff>
--- a/whitepaper/llm-d-whitepaper.docx
+++ b/whitepaper/llm-d-whitepaper.docx
@@ -32792,19 +32792,13 @@
         <w:t xml:space="preserve"> </w:t>
       </w:r>
       <w:r>
-        <w:t xml:space="preserve">path today; Intel XPU is explicitly left to the reader as a manual substitution. This chapter</w:t>
-      </w:r>
-      <w:r>
-        <w:t xml:space="preserve"> </w:t>
-      </w:r>
-      <w:r>
-        <w:t xml:space="preserve">documents the guide as-is and explains exactly what to substitute for Intel XPU, rather than</w:t>
-      </w:r>
-      <w:r>
-        <w:t xml:space="preserve"> </w:t>
-      </w:r>
-      <w:r>
-        <w:t xml:space="preserve">presenting an untested Intel XPU procedure as if it were upstream-supported.</w:t>
+        <w:t xml:space="preserve">path today; Intel XPU support is a manual substitution (detailed below), not something upstream</w:t>
+      </w:r>
+      <w:r>
+        <w:t xml:space="preserve"> </w:t>
+      </w:r>
+      <w:r>
+        <w:t xml:space="preserve">provides or tests.</w:t>
       </w:r>
     </w:p>
     <w:bookmarkStart w:id="190" w:name="overview-14"/>

</xml_diff>